<commit_message>
docs(sad): polish wording, fix FA-06, weave in AI-experience reflections
- §10.1 FA table: drop HTTP URLs, fix FA-06 (only `winner` is mandatory;
  point attributes are optional → "Quick-Points"); fixes broken FA-16 row
- §14: weave the standalone "Erfahrungen mit AI Coding" doc into the chapter
  (observations, accepted/corrected examples, project suitability, dangers &
  open questions, conclusion); delete the now-redundant source file
- §12: add R-08 (load test pending) referencing TEN-69
- Clearer wording for §8.3 (error handling), §8.5 (AI tests), ADR-11, ADR-14,
  ADR-16
- Rebuild TSaS_SAD_arc42_2.docx
- Ignore Office lock files (~$*)

Co-Authored-By: Claude Opus 4.8 (1M context) <noreply@anthropic.com>
</commit_message>
<xml_diff>
--- a/doc/sad/TSaS_SAD_arc42_2.docx
+++ b/doc/sad/TSaS_SAD_arc42_2.docx
@@ -2,7 +2,7 @@
 <file path=word/document.xml><?xml version="1.0" encoding="utf-8"?>
 <w:document xmlns:w="http://schemas.openxmlformats.org/wordprocessingml/2006/main" xmlns:m="http://schemas.openxmlformats.org/officeDocument/2006/math" xmlns:r="http://schemas.openxmlformats.org/officeDocument/2006/relationships" xmlns:o="urn:schemas-microsoft-com:office:office" xmlns:v="urn:schemas-microsoft-com:vml" xmlns:w10="urn:schemas-microsoft-com:office:word" xmlns:a="http://schemas.openxmlformats.org/drawingml/2006/main" xmlns:pic="http://schemas.openxmlformats.org/drawingml/2006/picture" xmlns:wp="http://schemas.openxmlformats.org/drawingml/2006/wordprocessingDrawing">
   <w:body>
-    <w:bookmarkStart w:id="101" w:name="X8e4ebc2e1f4eb088d047a6684ad88a5c65a2b31"/>
+    <w:bookmarkStart w:id="108" w:name="X8e4ebc2e1f4eb088d047a6684ad88a5c65a2b31"/>
     <w:p>
       <w:pPr>
         <w:pStyle w:val="Heading1"/>
@@ -6554,7 +6554,7 @@
     </w:p>
     <w:bookmarkEnd w:id="68"/>
     <w:bookmarkEnd w:id="69"/>
-    <w:bookmarkStart w:id="77" w:name="querschnittliche-konzepte"/>
+    <w:bookmarkStart w:id="79" w:name="querschnittliche-konzepte"/>
     <w:p>
       <w:pPr>
         <w:pStyle w:val="Heading2"/>
@@ -7301,7 +7301,7 @@
         <w:pStyle w:val="FirstParagraph"/>
       </w:pPr>
       <w:r>
-        <w:t xml:space="preserve">Deklarativ über</w:t>
+        <w:t xml:space="preserve">Die Fehlerbehandlung ist deklarativ über</w:t>
       </w:r>
       <w:r>
         <w:t xml:space="preserve"> </w:t>
@@ -7313,133 +7313,168 @@
         <w:t xml:space="preserve">@RestControllerAdvice</w:t>
       </w:r>
       <w:r>
-        <w:t xml:space="preserve">. Querschnittliches liegt zentral im</w:t>
-      </w:r>
-      <w:r>
-        <w:t xml:space="preserve"> </w:t>
-      </w:r>
-      <w:r>
-        <w:rPr>
-          <w:rStyle w:val="VerbatimChar"/>
-        </w:rPr>
-        <w:t xml:space="preserve">common-module</w:t>
-      </w:r>
-      <w:r>
-        <w:t xml:space="preserve"> </w:t>
-      </w:r>
-      <w:r>
-        <w:t xml:space="preserve">(</w:t>
-      </w:r>
-      <w:r>
-        <w:rPr>
-          <w:rStyle w:val="VerbatimChar"/>
-        </w:rPr>
-        <w:t xml:space="preserve">CommonExceptionHandler</w:t>
-      </w:r>
-      <w:r>
-        <w:t xml:space="preserve">,</w:t>
-      </w:r>
-      <w:r>
-        <w:t xml:space="preserve"> </w:t>
-      </w:r>
-      <w:r>
-        <w:rPr>
-          <w:rStyle w:val="VerbatimChar"/>
-        </w:rPr>
-        <w:t xml:space="preserve">LOWEST_PRECEDENCE</w:t>
-      </w:r>
-      <w:r>
-        <w:t xml:space="preserve">):</w:t>
-      </w:r>
-      <w:r>
-        <w:t xml:space="preserve"> </w:t>
-      </w:r>
-      <w:r>
-        <w:rPr>
-          <w:rStyle w:val="VerbatimChar"/>
-        </w:rPr>
-        <w:t xml:space="preserve">ConflictException</w:t>
-      </w:r>
-      <w:r>
-        <w:t xml:space="preserve"> </w:t>
-      </w:r>
-      <w:r>
-        <w:t xml:space="preserve">→ 409, Bean-Validation → 400 (mit Feld-Details), ungültige Argumente → 400. Modulspezifisch:</w:t>
-      </w:r>
-      <w:r>
-        <w:t xml:space="preserve"> </w:t>
-      </w:r>
-      <w:r>
-        <w:rPr>
-          <w:rStyle w:val="VerbatimChar"/>
-        </w:rPr>
-        <w:t xml:space="preserve">GlobalExceptionHandler</w:t>
-      </w:r>
-      <w:r>
-        <w:t xml:space="preserve"> </w:t>
-      </w:r>
-      <w:r>
-        <w:t xml:space="preserve">(Player/Match „nicht gefunden” → 404),</w:t>
-      </w:r>
-      <w:r>
-        <w:t xml:space="preserve"> </w:t>
-      </w:r>
-      <w:r>
-        <w:rPr>
-          <w:rStyle w:val="VerbatimChar"/>
-        </w:rPr>
-        <w:t xml:space="preserve">AiExceptionHandler</w:t>
-      </w:r>
-      <w:r>
-        <w:t xml:space="preserve"> </w:t>
-      </w:r>
-      <w:r>
-        <w:t xml:space="preserve">(</w:t>
-      </w:r>
-      <w:r>
-        <w:rPr>
-          <w:rStyle w:val="VerbatimChar"/>
-        </w:rPr>
-        <w:t xml:space="preserve">InsufficientMatchData</w:t>
-      </w:r>
-      <w:r>
-        <w:t xml:space="preserve"> </w:t>
-      </w:r>
-      <w:r>
-        <w:t xml:space="preserve">→ 422,</w:t>
-      </w:r>
-      <w:r>
-        <w:t xml:space="preserve"> </w:t>
-      </w:r>
-      <w:r>
-        <w:rPr>
-          <w:rStyle w:val="VerbatimChar"/>
-        </w:rPr>
-        <w:t xml:space="preserve">AnalysisGeneration</w:t>
-      </w:r>
-      <w:r>
-        <w:t xml:space="preserve"> </w:t>
-      </w:r>
-      <w:r>
-        <w:t xml:space="preserve">→ 502).</w:t>
-      </w:r>
-    </w:p>
-    <w:p>
-      <w:pPr>
-        <w:pStyle w:val="BodyText"/>
-      </w:pPr>
+        <w:t xml:space="preserve"> </w:t>
+      </w:r>
+      <w:r>
+        <w:t xml:space="preserve">gelöst. Das</w:t>
+      </w:r>
+      <w:r>
+        <w:t xml:space="preserve"> </w:t>
+      </w:r>
       <w:r>
         <w:rPr>
           <w:b/>
           <w:bCs/>
         </w:rPr>
+        <w:t xml:space="preserve">Antwortformat</w:t>
+      </w:r>
+      <w:r>
+        <w:t xml:space="preserve"> </w:t>
+      </w:r>
+      <w:r>
+        <w:t xml:space="preserve">ist durchgängig</w:t>
+      </w:r>
+      <w:r>
+        <w:t xml:space="preserve"> </w:t>
+      </w:r>
+      <w:r>
+        <w:rPr>
+          <w:b/>
+          <w:bCs/>
+        </w:rPr>
+        <w:t xml:space="preserve">RFC 7807</w:t>
+      </w:r>
+      <w:r>
+        <w:t xml:space="preserve"> </w:t>
+      </w:r>
+      <w:r>
+        <w:t xml:space="preserve">über Springs</w:t>
+      </w:r>
+      <w:r>
+        <w:t xml:space="preserve"> </w:t>
+      </w:r>
+      <w:r>
+        <w:rPr>
+          <w:rStyle w:val="VerbatimChar"/>
+        </w:rPr>
+        <w:t xml:space="preserve">ProblemDetail</w:t>
+      </w:r>
+      <w:r>
+        <w:t xml:space="preserve"> </w:t>
+      </w:r>
+      <w:r>
+        <w:t xml:space="preserve">(ersetzt das frühere Ad-hoc-Format); die Schemas der Fehlerantworten (400/404/409/422/502) sind via springdoc unter</w:t>
+      </w:r>
+      <w:r>
+        <w:t xml:space="preserve"> </w:t>
+      </w:r>
+      <w:r>
+        <w:rPr>
+          <w:rStyle w:val="VerbatimChar"/>
+        </w:rPr>
+        <w:t xml:space="preserve">/v3/api-docs</w:t>
+      </w:r>
+      <w:r>
+        <w:t xml:space="preserve"> </w:t>
+      </w:r>
+      <w:r>
+        <w:t xml:space="preserve">dokumentiert.</w:t>
+      </w:r>
+      <w:r>
+        <w:br/>
+      </w:r>
+      <w:r>
+        <w:t xml:space="preserve">Der</w:t>
+      </w:r>
+      <w:r>
+        <w:t xml:space="preserve"> </w:t>
+      </w:r>
+      <w:r>
+        <w:rPr>
+          <w:rStyle w:val="VerbatimChar"/>
+        </w:rPr>
+        <w:t xml:space="preserve">GlobalExceptionHandler</w:t>
+      </w:r>
+      <w:r>
+        <w:t xml:space="preserve"> </w:t>
+      </w:r>
+      <w:r>
+        <w:t xml:space="preserve">behandelt die modulübergreifende</w:t>
+      </w:r>
+      <w:r>
+        <w:t xml:space="preserve"> </w:t>
+      </w:r>
+      <w:r>
+        <w:t xml:space="preserve">“nicht gefunden”</w:t>
+      </w:r>
+      <w:r>
+        <w:t xml:space="preserve">-Domain-Exceptions der fachlichen Module (Player/Match) und führen zu einem 404.</w:t>
+      </w:r>
+      <w:r>
+        <w:br/>
+      </w:r>
+      <w:r>
+        <w:t xml:space="preserve">Querschnittliche Fälle (Konflikte, Validierung, ungültige Argumente) übernimmt der</w:t>
+      </w:r>
+      <w:r>
+        <w:t xml:space="preserve"> </w:t>
+      </w:r>
+      <w:r>
+        <w:rPr>
+          <w:rStyle w:val="VerbatimChar"/>
+        </w:rPr>
+        <w:t xml:space="preserve">CommonExceptionHandler</w:t>
+      </w:r>
+      <w:r>
+        <w:t xml:space="preserve"> </w:t>
+      </w:r>
+      <w:r>
+        <w:t xml:space="preserve">im</w:t>
+      </w:r>
+      <w:r>
+        <w:t xml:space="preserve"> </w:t>
+      </w:r>
+      <w:r>
+        <w:rPr>
+          <w:rStyle w:val="VerbatimChar"/>
+        </w:rPr>
+        <w:t xml:space="preserve">common-module</w:t>
+      </w:r>
+      <w:r>
+        <w:t xml:space="preserve"> </w:t>
+      </w:r>
+      <w:r>
+        <w:t xml:space="preserve">und AI-spezifische Fälle der</w:t>
+      </w:r>
+      <w:r>
+        <w:t xml:space="preserve"> </w:t>
+      </w:r>
+      <w:r>
+        <w:rPr>
+          <w:rStyle w:val="VerbatimChar"/>
+        </w:rPr>
+        <w:t xml:space="preserve">AiExceptionHandler</w:t>
+      </w:r>
+      <w:r>
+        <w:t xml:space="preserve">.</w:t>
+      </w:r>
+    </w:p>
+    <w:p>
+      <w:pPr>
+        <w:pStyle w:val="BodyText"/>
+      </w:pPr>
+      <w:r>
+        <w:rPr>
+          <w:b/>
+          <w:bCs/>
+        </w:rPr>
         <w:t xml:space="preserve">Catch-all + Sanitization (STRIDE I5+I6).</w:t>
       </w:r>
       <w:r>
         <w:t xml:space="preserve"> </w:t>
       </w:r>
       <w:r>
-        <w:t xml:space="preserve">Vier breite Klassen werden abgefangen, ohne interne Details (Klassenpfade, SQL, Stack-Traces) zu lecken:</w:t>
+        <w:t xml:space="preserve">Vier allgemeine Exception-Typen werden als Auffangnetz verwendet. So werden keine interne Details (Klassenpfade, SQL, Stack-Traces) nach aussen gegeben.</w:t>
       </w:r>
     </w:p>
     <w:tbl>
@@ -7656,49 +7691,7 @@
         <w:pStyle w:val="BodyText"/>
       </w:pPr>
       <w:r>
-        <w:t xml:space="preserve">Ergänzend setzen</w:t>
-      </w:r>
-      <w:r>
-        <w:t xml:space="preserve"> </w:t>
-      </w:r>
-      <w:r>
-        <w:rPr>
-          <w:rStyle w:val="VerbatimChar"/>
-        </w:rPr>
-        <w:t xml:space="preserve">server.error.include-*</w:t>
-      </w:r>
-      <w:r>
-        <w:t xml:space="preserve">-Properties Springs Whitelabel-Fallback still.</w:t>
-      </w:r>
-      <w:r>
-        <w:t xml:space="preserve"> </w:t>
-      </w:r>
-      <w:r>
-        <w:rPr>
-          <w:rStyle w:val="VerbatimChar"/>
-        </w:rPr>
-        <w:t xml:space="preserve">CommonExceptionHandlerTest</w:t>
-      </w:r>
-      <w:r>
-        <w:t xml:space="preserve"> </w:t>
-      </w:r>
-      <w:r>
-        <w:t xml:space="preserve">(7 Pfade) assertet, dass weder SQL noch UUIDs noch Klassennamen in</w:t>
-      </w:r>
-      <w:r>
-        <w:t xml:space="preserve"> </w:t>
-      </w:r>
-      <w:r>
-        <w:rPr>
-          <w:rStyle w:val="VerbatimChar"/>
-        </w:rPr>
-        <w:t xml:space="preserve">detail</w:t>
-      </w:r>
-      <w:r>
-        <w:t xml:space="preserve"> </w:t>
-      </w:r>
-      <w:r>
-        <w:t xml:space="preserve">auftauchen. Antwortformat:</w:t>
+        <w:t xml:space="preserve">Damit auch Springs eingebauter</w:t>
       </w:r>
       <w:r>
         <w:t xml:space="preserve"> </w:t>
@@ -7708,40 +7701,94 @@
           <w:b/>
           <w:bCs/>
         </w:rPr>
-        <w:t xml:space="preserve">RFC 7807</w:t>
-      </w:r>
-      <w:r>
-        <w:t xml:space="preserve"> </w:t>
-      </w:r>
-      <w:r>
-        <w:t xml:space="preserve">über Springs</w:t>
-      </w:r>
-      <w:r>
-        <w:t xml:space="preserve"> </w:t>
-      </w:r>
-      <w:r>
-        <w:rPr>
-          <w:rStyle w:val="VerbatimChar"/>
-        </w:rPr>
-        <w:t xml:space="preserve">ProblemDetail</w:t>
-      </w:r>
-      <w:r>
-        <w:t xml:space="preserve"> </w:t>
-      </w:r>
-      <w:r>
-        <w:t xml:space="preserve">(löst das frühere Ad-hoc-Format ab); Schemas (400/404/409/422/502) via springdoc unter</w:t>
-      </w:r>
-      <w:r>
-        <w:t xml:space="preserve"> </w:t>
-      </w:r>
-      <w:r>
-        <w:rPr>
-          <w:rStyle w:val="VerbatimChar"/>
-        </w:rPr>
-        <w:t xml:space="preserve">/v3/api-docs</w:t>
-      </w:r>
-      <w:r>
-        <w:t xml:space="preserve">.</w:t>
+        <w:t xml:space="preserve">Whitelabel-Fallback</w:t>
+      </w:r>
+      <w:r>
+        <w:t xml:space="preserve"> </w:t>
+      </w:r>
+      <w:r>
+        <w:t xml:space="preserve">nichts preisgibt, sind</w:t>
+      </w:r>
+      <w:r>
+        <w:t xml:space="preserve"> </w:t>
+      </w:r>
+      <w:r>
+        <w:rPr>
+          <w:rStyle w:val="VerbatimChar"/>
+        </w:rPr>
+        <w:t xml:space="preserve">server.error.include-message</w:t>
+      </w:r>
+      <w:r>
+        <w:t xml:space="preserve"> </w:t>
+      </w:r>
+      <w:r>
+        <w:t xml:space="preserve">und</w:t>
+      </w:r>
+      <w:r>
+        <w:t xml:space="preserve"> </w:t>
+      </w:r>
+      <w:r>
+        <w:rPr>
+          <w:rStyle w:val="VerbatimChar"/>
+        </w:rPr>
+        <w:t xml:space="preserve">include-stacktrace</w:t>
+      </w:r>
+      <w:r>
+        <w:t xml:space="preserve"> </w:t>
+      </w:r>
+      <w:r>
+        <w:t xml:space="preserve">auf</w:t>
+      </w:r>
+      <w:r>
+        <w:t xml:space="preserve"> </w:t>
+      </w:r>
+      <w:r>
+        <w:rPr>
+          <w:rStyle w:val="VerbatimChar"/>
+        </w:rPr>
+        <w:t xml:space="preserve">never</w:t>
+      </w:r>
+      <w:r>
+        <w:t xml:space="preserve"> </w:t>
+      </w:r>
+      <w:r>
+        <w:t xml:space="preserve">gesetzt — er zeigt dann weder Fehlermeldung noch Stack-Trace.</w:t>
+      </w:r>
+      <w:r>
+        <w:br/>
+      </w:r>
+      <w:r>
+        <w:t xml:space="preserve">Abgesichert wird das durch</w:t>
+      </w:r>
+      <w:r>
+        <w:t xml:space="preserve"> </w:t>
+      </w:r>
+      <w:r>
+        <w:rPr>
+          <w:rStyle w:val="VerbatimChar"/>
+        </w:rPr>
+        <w:t xml:space="preserve">CommonExceptionHandlerTest</w:t>
+      </w:r>
+      <w:r>
+        <w:t xml:space="preserve"> </w:t>
+      </w:r>
+      <w:r>
+        <w:t xml:space="preserve">(7 Testfälle), der prüft, dass in</w:t>
+      </w:r>
+      <w:r>
+        <w:t xml:space="preserve"> </w:t>
+      </w:r>
+      <w:r>
+        <w:rPr>
+          <w:rStyle w:val="VerbatimChar"/>
+        </w:rPr>
+        <w:t xml:space="preserve">detail</w:t>
+      </w:r>
+      <w:r>
+        <w:t xml:space="preserve"> </w:t>
+      </w:r>
+      <w:r>
+        <w:t xml:space="preserve">weder SQL noch UUIDs noch Klassennamen auftauchen.</w:t>
       </w:r>
     </w:p>
     <w:bookmarkEnd w:id="72"/>
@@ -7759,11 +7806,11 @@
         <w:pStyle w:val="FirstParagraph"/>
       </w:pPr>
       <w:r>
-        <w:t xml:space="preserve">Strukturiertes JSON-Logging via SLF4J/Logback. Spring Boot Actuator liefert Health-/Metrics-/Info-Endpunkte (Prometheus/Grafana-fähig).</w:t>
+        <w:t xml:space="preserve">Ein strukturiertes JSON-Logging erfolgt über SLF4J/Logback. Der Spring Boot Actuator liefert Health-/Metrics-/Info-Endpunkte (Prometheus/Grafana-fähig).</w:t>
       </w:r>
     </w:p>
     <w:bookmarkEnd w:id="73"/>
-    <w:bookmarkStart w:id="74" w:name="testkonzept"/>
+    <w:bookmarkStart w:id="76" w:name="testkonzept"/>
     <w:p>
       <w:pPr>
         <w:pStyle w:val="Heading3"/>
@@ -7986,84 +8033,167 @@
         <w:t xml:space="preserve">).</w:t>
       </w:r>
     </w:p>
+    <w:bookmarkStart w:id="74" w:name="begründung-der-werkzeuge"/>
+    <w:p>
+      <w:pPr>
+        <w:pStyle w:val="Heading4"/>
+      </w:pPr>
+      <w:r>
+        <w:t xml:space="preserve">8.5.1 Begründung der Werkzeuge</w:t>
+      </w:r>
+    </w:p>
+    <w:p>
+      <w:pPr>
+        <w:pStyle w:val="Compact"/>
+        <w:numPr>
+          <w:ilvl w:val="0"/>
+          <w:numId w:val="1009"/>
+        </w:numPr>
+      </w:pPr>
+      <w:r>
+        <w:rPr>
+          <w:i/>
+          <w:iCs/>
+        </w:rPr>
+        <w:t xml:space="preserve">Echtes PostgreSQL via Testcontainers statt H2:</w:t>
+      </w:r>
+      <w:r>
+        <w:t xml:space="preserve"> </w:t>
+      </w:r>
+      <w:r>
+        <w:t xml:space="preserve">Persistenz-/Schema-Verhalten ist PostgreSQL-spezifisch und wird gegen dieselbe Engine wie in Prod verifiziert (Flyway V1–V10 real, nativer</w:t>
+      </w:r>
+      <w:r>
+        <w:t xml:space="preserve"> </w:t>
+      </w:r>
+      <w:r>
+        <w:rPr>
+          <w:rStyle w:val="VerbatimChar"/>
+        </w:rPr>
+        <w:t xml:space="preserve">UUID</w:t>
+      </w:r>
+      <w:r>
+        <w:t xml:space="preserve">-Typ,</w:t>
+      </w:r>
+      <w:r>
+        <w:t xml:space="preserve"> </w:t>
+      </w:r>
+      <w:r>
+        <w:rPr>
+          <w:rStyle w:val="VerbatimChar"/>
+        </w:rPr>
+        <w:t xml:space="preserve">CHECK</w:t>
+      </w:r>
+      <w:r>
+        <w:t xml:space="preserve">/</w:t>
+      </w:r>
+      <w:r>
+        <w:rPr>
+          <w:rStyle w:val="VerbatimChar"/>
+        </w:rPr>
+        <w:t xml:space="preserve">ON DELETE CASCADE</w:t>
+      </w:r>
+      <w:r>
+        <w:t xml:space="preserve">); H2 im PG-Modus weicht ab.</w:t>
+      </w:r>
+      <w:r>
+        <w:br/>
+      </w:r>
+    </w:p>
+    <w:p>
+      <w:pPr>
+        <w:pStyle w:val="Compact"/>
+        <w:numPr>
+          <w:ilvl w:val="0"/>
+          <w:numId w:val="1009"/>
+        </w:numPr>
+      </w:pPr>
+      <w:r>
+        <w:rPr>
+          <w:i/>
+          <w:iCs/>
+        </w:rPr>
+        <w:t xml:space="preserve">WireMock für den LLM-Adapter:</w:t>
+      </w:r>
+      <w:r>
+        <w:t xml:space="preserve"> </w:t>
+      </w:r>
+      <w:r>
+        <w:rPr>
+          <w:rStyle w:val="VerbatimChar"/>
+        </w:rPr>
+        <w:t xml:space="preserve">OpenAiLlmAdapterTest</w:t>
+      </w:r>
+      <w:r>
+        <w:t xml:space="preserve"> </w:t>
+      </w:r>
+      <w:r>
+        <w:t xml:space="preserve">stubbt den OpenAI-HTTP-Endpoint und prüft den realen Serialisierungspfad deterministisch, offline, ohne Kosten.</w:t>
+      </w:r>
+      <w:r>
+        <w:br/>
+      </w:r>
+    </w:p>
+    <w:p>
+      <w:pPr>
+        <w:pStyle w:val="Compact"/>
+        <w:numPr>
+          <w:ilvl w:val="0"/>
+          <w:numId w:val="1009"/>
+        </w:numPr>
+      </w:pPr>
+      <w:r>
+        <w:rPr>
+          <w:i/>
+          <w:iCs/>
+        </w:rPr>
+        <w:t xml:space="preserve">Coverage-Gate 85/70:</w:t>
+      </w:r>
+      <w:r>
+        <w:t xml:space="preserve"> </w:t>
+      </w:r>
+      <w:r>
+        <w:t xml:space="preserve">knapp unter Ist-Stand → fängt Regressionen ohne Brechen bei Schwankungen (ADR-11).</w:t>
+      </w:r>
+    </w:p>
+    <w:bookmarkEnd w:id="74"/>
+    <w:bookmarkStart w:id="75" w:name="Xf7234b34e8fd42e05ce6d1c29239cb32179f024"/>
+    <w:p>
+      <w:pPr>
+        <w:pStyle w:val="Heading4"/>
+      </w:pPr>
+      <w:r>
+        <w:t xml:space="preserve">8.5.2 Tests der KI-Anteile (Nichtdeterminismus, Guardrails, Fehlerpfade)</w:t>
+      </w:r>
+    </w:p>
     <w:p>
       <w:pPr>
         <w:pStyle w:val="FirstParagraph"/>
+      </w:pPr>
+      <w:r>
+        <w:t xml:space="preserve">Die KI-Anteile sind wegen Nichtdeterminismus, externer Abhängigkeit und Kosten gesondert abgesichert:</w:t>
+      </w:r>
+    </w:p>
+    <w:p>
+      <w:pPr>
+        <w:pStyle w:val="Compact"/>
+        <w:numPr>
+          <w:ilvl w:val="0"/>
+          <w:numId w:val="1010"/>
+        </w:numPr>
       </w:pPr>
       <w:r>
         <w:rPr>
           <w:b/>
           <w:bCs/>
         </w:rPr>
-        <w:t xml:space="preserve">Begründung der Werkzeuge.</w:t>
-      </w:r>
-      <w:r>
-        <w:t xml:space="preserve"> </w:t>
-      </w:r>
-      <w:r>
-        <w:t xml:space="preserve">(a)</w:t>
-      </w:r>
-      <w:r>
-        <w:t xml:space="preserve"> </w:t>
-      </w:r>
-      <w:r>
-        <w:rPr>
-          <w:i/>
-          <w:iCs/>
-        </w:rPr>
-        <w:t xml:space="preserve">Echtes PostgreSQL via Testcontainers statt H2:</w:t>
-      </w:r>
-      <w:r>
-        <w:t xml:space="preserve"> </w:t>
-      </w:r>
-      <w:r>
-        <w:t xml:space="preserve">Persistenz-/Schema-Verhalten ist PostgreSQL-spezifisch und wird gegen dieselbe Engine wie in Prod verifiziert (Flyway V1–V10 real, nativer</w:t>
-      </w:r>
-      <w:r>
-        <w:t xml:space="preserve"> </w:t>
-      </w:r>
-      <w:r>
-        <w:rPr>
-          <w:rStyle w:val="VerbatimChar"/>
-        </w:rPr>
-        <w:t xml:space="preserve">UUID</w:t>
-      </w:r>
-      <w:r>
-        <w:t xml:space="preserve">-Typ,</w:t>
-      </w:r>
-      <w:r>
-        <w:t xml:space="preserve"> </w:t>
-      </w:r>
-      <w:r>
-        <w:rPr>
-          <w:rStyle w:val="VerbatimChar"/>
-        </w:rPr>
-        <w:t xml:space="preserve">CHECK</w:t>
-      </w:r>
-      <w:r>
-        <w:t xml:space="preserve">/</w:t>
-      </w:r>
-      <w:r>
-        <w:rPr>
-          <w:rStyle w:val="VerbatimChar"/>
-        </w:rPr>
-        <w:t xml:space="preserve">ON DELETE CASCADE</w:t>
-      </w:r>
-      <w:r>
-        <w:t xml:space="preserve">); H2 im PG-Modus weicht ab. (b)</w:t>
-      </w:r>
-      <w:r>
-        <w:t xml:space="preserve"> </w:t>
-      </w:r>
-      <w:r>
-        <w:rPr>
-          <w:i/>
-          <w:iCs/>
-        </w:rPr>
-        <w:t xml:space="preserve">WireMock für den LLM-Adapter:</w:t>
-      </w:r>
-      <w:r>
-        <w:t xml:space="preserve"> </w:t>
+        <w:t xml:space="preserve">Nichtdeterminismus eliminieren.</w:t>
+      </w:r>
+      <w:r>
+        <w:t xml:space="preserve"> </w:t>
+      </w:r>
+      <w:r>
+        <w:t xml:space="preserve">Auf Adapter-Ebene fixiert der WireMock-Stub die LLM-Antwort (</w:t>
       </w:r>
       <w:r>
         <w:rPr>
@@ -8072,71 +8202,62 @@
         <w:t xml:space="preserve">OpenAiLlmAdapterTest</w:t>
       </w:r>
       <w:r>
-        <w:t xml:space="preserve"> </w:t>
-      </w:r>
-      <w:r>
-        <w:t xml:space="preserve">stubbt den OpenAI-HTTP-Endpoint und prüft den realen Serialisierungspfad deterministisch, offline, ohne Kosten. (c)</w:t>
-      </w:r>
-      <w:r>
-        <w:t xml:space="preserve"> </w:t>
-      </w:r>
-      <w:r>
-        <w:rPr>
-          <w:i/>
-          <w:iCs/>
-        </w:rPr>
-        <w:t xml:space="preserve">Coverage-Gate 85/70:</w:t>
-      </w:r>
-      <w:r>
-        <w:t xml:space="preserve"> </w:t>
-      </w:r>
-      <w:r>
-        <w:t xml:space="preserve">knapp unter Ist-Stand → fängt Regressionen ohne Brechen bei Schwankungen (ADR-11).</w:t>
-      </w:r>
-    </w:p>
-    <w:p>
-      <w:pPr>
-        <w:pStyle w:val="BodyText"/>
+        <w:t xml:space="preserve">). Auf Service-/IT-Ebene ersetzt der deterministische</w:t>
+      </w:r>
+      <w:r>
+        <w:t xml:space="preserve"> </w:t>
+      </w:r>
+      <w:r>
+        <w:rPr>
+          <w:rStyle w:val="VerbatimChar"/>
+        </w:rPr>
+        <w:t xml:space="preserve">FakeLlmClientAdapter</w:t>
+      </w:r>
+      <w:r>
+        <w:t xml:space="preserve"> </w:t>
+      </w:r>
+      <w:r>
+        <w:t xml:space="preserve">(aktiv via</w:t>
+      </w:r>
+      <w:r>
+        <w:t xml:space="preserve"> </w:t>
+      </w:r>
+      <w:r>
+        <w:rPr>
+          <w:rStyle w:val="VerbatimChar"/>
+        </w:rPr>
+        <w:t xml:space="preserve">@ConditionalOnMissingBean</w:t>
+      </w:r>
+      <w:r>
+        <w:t xml:space="preserve">, ohne API-Key) den Provider vollständig — die IT belegen das über</w:t>
+      </w:r>
+      <w:r>
+        <w:t xml:space="preserve"> </w:t>
+      </w:r>
+      <w:r>
+        <w:rPr>
+          <w:rStyle w:val="VerbatimChar"/>
+        </w:rPr>
+        <w:t xml:space="preserve">modelUsed = fake-llm</w:t>
+      </w:r>
+      <w:r>
+        <w:t xml:space="preserve">. So sind KI-Pfade reproduzierbar testbar, ohne dass eine generative Antwort das Ergebnis verwackelt.</w:t>
+      </w:r>
+    </w:p>
+    <w:p>
+      <w:pPr>
+        <w:pStyle w:val="Compact"/>
+        <w:numPr>
+          <w:ilvl w:val="0"/>
+          <w:numId w:val="1010"/>
+        </w:numPr>
       </w:pPr>
       <w:r>
         <w:rPr>
           <w:b/>
           <w:bCs/>
         </w:rPr>
-        <w:t xml:space="preserve">Tests der KI-Anteile.</w:t>
-      </w:r>
-      <w:r>
-        <w:t xml:space="preserve"> </w:t>
-      </w:r>
-      <w:r>
-        <w:t xml:space="preserve">Nichtdeterminismus eliminiert (WireMock-Stub auf Adapter-Ebene,</w:t>
-      </w:r>
-      <w:r>
-        <w:t xml:space="preserve"> </w:t>
-      </w:r>
-      <w:r>
-        <w:rPr>
-          <w:rStyle w:val="VerbatimChar"/>
-        </w:rPr>
-        <w:t xml:space="preserve">FakeLlmClientAdapter</w:t>
-      </w:r>
-      <w:r>
-        <w:t xml:space="preserve"> </w:t>
-      </w:r>
-      <w:r>
-        <w:t xml:space="preserve">auf Service/IT-Ebene →</w:t>
-      </w:r>
-      <w:r>
-        <w:t xml:space="preserve"> </w:t>
-      </w:r>
-      <w:r>
-        <w:rPr>
-          <w:rStyle w:val="VerbatimChar"/>
-        </w:rPr>
-        <w:t xml:space="preserve">modelUsed = fake-llm</w:t>
-      </w:r>
-      <w:r>
-        <w:t xml:space="preserve">). Guardrails:</w:t>
+        <w:t xml:space="preserve">Guardrails verifizieren.</w:t>
       </w:r>
       <w:r>
         <w:t xml:space="preserve"> </w:t>
@@ -8151,7 +8272,22 @@
         <w:t xml:space="preserve"> </w:t>
       </w:r>
       <w:r>
-        <w:t xml:space="preserve">prüft</w:t>
+        <w:t xml:space="preserve">prüft die fachlichen Vorbedingungen explizit:</w:t>
+      </w:r>
+      <w:r>
+        <w:t xml:space="preserve"> </w:t>
+      </w:r>
+      <w:r>
+        <w:rPr>
+          <w:rStyle w:val="VerbatimChar"/>
+        </w:rPr>
+        <w:t xml:space="preserve">generate_throwsWhenMatchNotCompleted</w:t>
+      </w:r>
+      <w:r>
+        <w:t xml:space="preserve"> </w:t>
+      </w:r>
+      <w:r>
+        <w:t xml:space="preserve">(Match muss</w:t>
       </w:r>
       <w:r>
         <w:t xml:space="preserve"> </w:t>
@@ -8163,7 +8299,28 @@
         <w:t xml:space="preserve">COMPLETED</w:t>
       </w:r>
       <w:r>
-        <w:t xml:space="preserve">-Vorbedingung und Mindestpunktzahl; Rate-Limit separat (</w:t>
+        <w:t xml:space="preserve"> </w:t>
+      </w:r>
+      <w:r>
+        <w:t xml:space="preserve">sein) und</w:t>
+      </w:r>
+      <w:r>
+        <w:t xml:space="preserve"> </w:t>
+      </w:r>
+      <w:r>
+        <w:rPr>
+          <w:rStyle w:val="VerbatimChar"/>
+        </w:rPr>
+        <w:t xml:space="preserve">generate_throwsWhenTooFewPoints</w:t>
+      </w:r>
+      <w:r>
+        <w:t xml:space="preserve"> </w:t>
+      </w:r>
+      <w:r>
+        <w:t xml:space="preserve">(Mindestpunktzahl). Die Kosten-Guardrail (Rate-Limit) ist separat in</w:t>
+      </w:r>
+      <w:r>
+        <w:t xml:space="preserve"> </w:t>
       </w:r>
       <w:r>
         <w:rPr>
@@ -8172,7 +8329,41 @@
         <w:t xml:space="preserve">MatchAnalysisRateLimitIT</w:t>
       </w:r>
       <w:r>
-        <w:t xml:space="preserve">). Fehlerpfade: LLM-Ausfall persistiert</w:t>
+        <w:t xml:space="preserve"> </w:t>
+      </w:r>
+      <w:r>
+        <w:t xml:space="preserve">abgedeckt (vgl. §7.1.3 / TEN-64).</w:t>
+      </w:r>
+    </w:p>
+    <w:p>
+      <w:pPr>
+        <w:pStyle w:val="Compact"/>
+        <w:numPr>
+          <w:ilvl w:val="0"/>
+          <w:numId w:val="1010"/>
+        </w:numPr>
+      </w:pPr>
+      <w:r>
+        <w:rPr>
+          <w:b/>
+          <w:bCs/>
+        </w:rPr>
+        <w:t xml:space="preserve">Fehlerpfade abdecken.</w:t>
+      </w:r>
+      <w:r>
+        <w:t xml:space="preserve"> </w:t>
+      </w:r>
+      <w:r>
+        <w:rPr>
+          <w:rStyle w:val="VerbatimChar"/>
+        </w:rPr>
+        <w:t xml:space="preserve">generate_persistsFailedAnalysisAndRethrowsOnLlmError</w:t>
+      </w:r>
+      <w:r>
+        <w:t xml:space="preserve"> </w:t>
+      </w:r>
+      <w:r>
+        <w:t xml:space="preserve">belegt: ein LLM-Ausfall persistiert einen</w:t>
       </w:r>
       <w:r>
         <w:t xml:space="preserve"> </w:t>
@@ -8184,10 +8375,23 @@
         <w:t xml:space="preserve">FAILED</w:t>
       </w:r>
       <w:r>
-        <w:t xml:space="preserve"> </w:t>
-      </w:r>
-      <w:r>
-        <w:t xml:space="preserve">und propagiert (→ 502);</w:t>
+        <w:t xml:space="preserve">-Datensatz</w:t>
+      </w:r>
+      <w:r>
+        <w:t xml:space="preserve"> </w:t>
+      </w:r>
+      <w:r>
+        <w:rPr>
+          <w:b/>
+          <w:bCs/>
+        </w:rPr>
+        <w:t xml:space="preserve">und</w:t>
+      </w:r>
+      <w:r>
+        <w:t xml:space="preserve"> </w:t>
+      </w:r>
+      <w:r>
+        <w:t xml:space="preserve">propagiert den Fehler (→ HTTP 502).</w:t>
       </w:r>
       <w:r>
         <w:t xml:space="preserve"> </w:t>
@@ -8202,11 +8406,12 @@
         <w:t xml:space="preserve"> </w:t>
       </w:r>
       <w:r>
-        <w:t xml:space="preserve">prüft 409/422/404 end-to-end.</w:t>
-      </w:r>
-    </w:p>
-    <w:bookmarkEnd w:id="74"/>
-    <w:bookmarkStart w:id="75" w:name="continuous-integration-build-gate"/>
+        <w:t xml:space="preserve">prüft die HTTP-Abbildung end-to-end gegen echtes PostgreSQL (409 nicht beendet, 422 zu wenige Punkte, 404 unbekannt/cross-tenant).</w:t>
+      </w:r>
+    </w:p>
+    <w:bookmarkEnd w:id="75"/>
+    <w:bookmarkEnd w:id="76"/>
+    <w:bookmarkStart w:id="77" w:name="continuous-integration-build-gate"/>
     <w:p>
       <w:pPr>
         <w:pStyle w:val="Heading3"/>
@@ -8388,10 +8593,10 @@
         <w:t xml:space="preserve"> </w:t>
       </w:r>
       <w:r>
-        <w:t xml:space="preserve">(Branch Protection); ohne Pfadfilter (ein nicht ausgelöster required Check würde den Merge blockieren).</w:t>
-      </w:r>
-      <w:r>
-        <w:t xml:space="preserve"> </w:t>
+        <w:t xml:space="preserve">(Branch Protection) ohne Pfadfilter (ein nicht ausgelöster required Check würde den Merge blockieren).</w:t>
+      </w:r>
+      <w:r>
+        <w:br/>
       </w:r>
       <w:r>
         <w:rPr>
@@ -8406,8 +8611,8 @@
         <w:t xml:space="preserve">(Admin-Override im Notfall).</w:t>
       </w:r>
     </w:p>
-    <w:bookmarkEnd w:id="75"/>
-    <w:bookmarkStart w:id="76" w:name="testergebnisse"/>
+    <w:bookmarkEnd w:id="77"/>
+    <w:bookmarkStart w:id="78" w:name="testergebnisse"/>
     <w:p>
       <w:pPr>
         <w:pStyle w:val="Heading3"/>
@@ -8952,16 +9157,16 @@
         <w:t xml:space="preserve">Interpretation.</w:t>
       </w:r>
       <w:r>
-        <w:t xml:space="preserve"> </w:t>
-      </w:r>
-      <w:r>
-        <w:t xml:space="preserve">Abgedeckt ist die fachliche Kernlogik (Tennis-Zählregeln, Punkt-Attribution/Statistik, Spieler-Regeln, KI-Analyse inkl. Fehlerpfade 502/422/409);</w:t>
-      </w:r>
-      <w:r>
-        <w:t xml:space="preserve"> </w:t>
-      </w:r>
-      <w:r>
-        <w:t xml:space="preserve">die IT fahren gegen echtes PostgreSQL inkl. Flyway + JWT, der</w:t>
+        <w:br/>
+      </w:r>
+      <w:r>
+        <w:t xml:space="preserve">Abgedeckt ist die fachliche Kernlogik wie Tennis-Zählregeln, Punkt-Attribution/Statistik, Spieler-Regeln und KI-Analyse inkl. Fehlerpfade 502/422/409.</w:t>
+      </w:r>
+      <w:r>
+        <w:br/>
+      </w:r>
+      <w:r>
+        <w:t xml:space="preserve">Die IntegrationTests fahren gegen eine echte PostgreSQL Instanz inkl. Flyway und JWT, der</w:t>
       </w:r>
       <w:r>
         <w:t xml:space="preserve"> </w:t>
@@ -8976,19 +9181,19 @@
         <w:t xml:space="preserve"> </w:t>
       </w:r>
       <w:r>
-        <w:t xml:space="preserve">sichert Schichten-/Modulgrenzen. Die Branch-Coverage (80 %) liegt erwartungsgemäss</w:t>
-      </w:r>
-      <w:r>
-        <w:t xml:space="preserve"> </w:t>
-      </w:r>
-      <w:r>
-        <w:t xml:space="preserve">unter der Line-Coverage — die offenen Zweige sind überwiegend defensive Pfade (Guards, Mapper-Null-Prüfungen, seltene Scoring-Verzweigungen); d</w:t>
-      </w:r>
-      <w:r>
-        <w:t xml:space="preserve"> </w:t>
-      </w:r>
-      <w:r>
-        <w:t xml:space="preserve">as 70-%-Gate verankert die Untergrenze ohne Tests für triviale Zweige zu erzwingen.</w:t>
+        <w:t xml:space="preserve">sichert die Einhaltung der Schichten-/Modulgrenzen.</w:t>
+      </w:r>
+      <w:r>
+        <w:br/>
+      </w:r>
+      <w:r>
+        <w:t xml:space="preserve">Die Branch-Coverage (80 %) liegt erwartungsgemäss unter der Line-Coverage — die offenen Zweige sind überwiegend defensive Pfade (Guards, Mapper-Null-Prüfungen,</w:t>
+      </w:r>
+      <w:r>
+        <w:t xml:space="preserve"> </w:t>
+      </w:r>
+      <w:r>
+        <w:t xml:space="preserve">seltene Scoring-Verzweigungen). Das 70-%-Gate sichert eine Untergrenze, ohne für jeden trivialen Zweig einen Test zu erzwingen.</w:t>
       </w:r>
       <w:r>
         <w:t xml:space="preserve"> </w:t>
@@ -9019,9 +9224,9 @@
         </w:pict>
       </w:r>
     </w:p>
-    <w:bookmarkEnd w:id="76"/>
-    <w:bookmarkEnd w:id="77"/>
-    <w:bookmarkStart w:id="78" w:name="architekturentscheidungen"/>
+    <w:bookmarkEnd w:id="78"/>
+    <w:bookmarkEnd w:id="79"/>
+    <w:bookmarkStart w:id="80" w:name="architekturentscheidungen"/>
     <w:p>
       <w:pPr>
         <w:pStyle w:val="Heading2"/>
@@ -9035,7 +9240,7 @@
         <w:pStyle w:val="FirstParagraph"/>
       </w:pPr>
       <w:r>
-        <w:t xml:space="preserve">Architecture Decision Records (ADR), je als Entscheidung + Begründung. Alle Status</w:t>
+        <w:t xml:space="preserve">Architecture Decision Records (ADR), jede Entscheidung mit Begründung. Alle Status sind</w:t>
       </w:r>
       <w:r>
         <w:t xml:space="preserve"> </w:t>
@@ -9045,10 +9250,10 @@
           <w:b/>
           <w:bCs/>
         </w:rPr>
-        <w:t xml:space="preserve">Akzeptiert</w:t>
-      </w:r>
-      <w:r>
-        <w:t xml:space="preserve">. Inhaltlich manuell entschieden (siehe §14.2); die KI half nur beim Ausformulieren.</w:t>
+        <w:t xml:space="preserve">akzeptiert</w:t>
+      </w:r>
+      <w:r>
+        <w:t xml:space="preserve">. Inhaltlich manuell entschieden (siehe §14.2), die KI half nur beim Ausformulieren.</w:t>
       </w:r>
     </w:p>
     <w:p>
@@ -9066,7 +9271,19 @@
         <w:t xml:space="preserve"> </w:t>
       </w:r>
       <w:r>
-        <w:t xml:space="preserve">V1 ist klein und wird von einem kleinen Team gebaut; Microservice-Komplexität (Service Discovery, verteilte Transaktionen, Netzwerk-Overhead) ist nicht gerechtfertigt. Die Modularisierung als Gradle-Multi-Module erzwingt Modulgrenzen auf Compile-Ebene und erleichtert spätere Service-Extraktion.</w:t>
+        <w:t xml:space="preserve">V1 ist klein und wird von einem kleinen Team gebaut. Die Microservice-Komplexität (Komplexeres Deployment, Netzwerk-Overhead,</w:t>
+      </w:r>
+      <w:r>
+        <w:t xml:space="preserve"> </w:t>
+      </w:r>
+      <w:r>
+        <w:t xml:space="preserve">Fehlerbehandlung und Recovery bei Ausfall …) ist hier nicht gerechtfertigt. Die Modularisierung als Gradle-Multi-Module erzwingt Modulgrenzen auf Compile-Ebene</w:t>
+      </w:r>
+      <w:r>
+        <w:t xml:space="preserve"> </w:t>
+      </w:r>
+      <w:r>
+        <w:t xml:space="preserve">und erleichtert eine spätere Service-Extraktion.</w:t>
       </w:r>
     </w:p>
     <w:p>
@@ -9099,7 +9316,13 @@
         <w:t xml:space="preserve"> </w:t>
       </w:r>
       <w:r>
-        <w:t xml:space="preserve">ans Backend. Ermöglicht unabhängige Skalierung und saubere Separation of Concerns (übliches SPA-+-REST-Muster).</w:t>
+        <w:t xml:space="preserve">ans Backend.</w:t>
+      </w:r>
+      <w:r>
+        <w:t xml:space="preserve"> </w:t>
+      </w:r>
+      <w:r>
+        <w:t xml:space="preserve">Ermöglicht unabhängige Skalierung und saubere Separation of Concerns (übliches SPA-+-REST-Muster).</w:t>
       </w:r>
     </w:p>
     <w:p>
@@ -9153,7 +9376,7 @@
         <w:t xml:space="preserve"> </w:t>
       </w:r>
       <w:r>
-        <w:t xml:space="preserve">JSON/REST ist Web-Standard, gut tooling-unterstützt und via OpenAPI/Swagger dokumentierbar. GraphQL erhöht die Komplexität unnötig.</w:t>
+        <w:t xml:space="preserve">JSON/REST ist Web-Standard, gut tooling-unterstützt und via OpenAPI/Swagger dokumentierbar. GraphQL würde die Komplexität unnötig erhöhen.</w:t>
       </w:r>
     </w:p>
     <w:p>
@@ -9171,7 +9394,13 @@
         <w:t xml:space="preserve"> </w:t>
       </w:r>
       <w:r>
-        <w:t xml:space="preserve">Eine PostgreSQL-Instanz, stabiles Schema (6 Kernentitäten): Flyway versioniert plain-SQL ohne XML/YAML-Overhead und ist in Spring Boot auto-konfiguriert. Liquibase-Flexibilität (DB-agnostisch, Rollback-Skripte, Diff) ist nicht nötig (kein DB-Wechsel geplant; Rollbacks via Backup). Skripte unter</w:t>
+        <w:t xml:space="preserve">Eine PostgreSQL-Instanz, stabiles Schema (6 Kernentitäten): Flyway versioniert plain-SQL ohne XML/YAML-Overhead und ist in Spring Boot auto-konfiguriert.</w:t>
+      </w:r>
+      <w:r>
+        <w:t xml:space="preserve"> </w:t>
+      </w:r>
+      <w:r>
+        <w:t xml:space="preserve">Liquibase-Flexibilität (DB-agnostisch, Rollback-Skripte, Diff) ist nicht nötig (kein DB-Wechsel geplant; Rollbacks via Backup). Skripte unter</w:t>
       </w:r>
       <w:r>
         <w:t xml:space="preserve"> </w:t>
@@ -9213,7 +9442,19 @@
         <w:t xml:space="preserve"> </w:t>
       </w:r>
       <w:r>
-        <w:t xml:space="preserve">Spring Modulith verworfen, weil es modulübergreifend standardmässig auf Application-Events (asynchron) setzt — unnötige Komplexität für synchrone Antworten. Explizite Application-Layer-Interfaces (Ports &amp; Adapters) bilden die Kommunikation sauberer ab; Gradle-Module erzwingen Grenzen zur Compile-Zeit (unerwünschte Abhängigkeiten = Build-Fehler) und erleichtern spätere Service-Extraktion.</w:t>
+        <w:t xml:space="preserve">Spring Modulith verworfen, weil es modulübergreifend standardmässig auf Application-Events (asynchron)</w:t>
+      </w:r>
+      <w:r>
+        <w:t xml:space="preserve"> </w:t>
+      </w:r>
+      <w:r>
+        <w:t xml:space="preserve">setzt — unnötige Komplexität für synchrone Antworten. Explizite Application-Layer-Interfaces (Ports &amp; Adapters) bilden die Kommunikation sauberer ab.</w:t>
+      </w:r>
+      <w:r>
+        <w:t xml:space="preserve"> </w:t>
+      </w:r>
+      <w:r>
+        <w:t xml:space="preserve">Gradle-Module erzwingen Grenzen zur Compile-Zeit (unerwünschte Abhängigkeiten = Build-Fehler) und erleichtern spätere Service-Extraktion.</w:t>
       </w:r>
     </w:p>
     <w:p>
@@ -9231,7 +9472,19 @@
         <w:t xml:space="preserve"> </w:t>
       </w:r>
       <w:r>
-        <w:t xml:space="preserve">Nutzer bedienen die App während des Matches auf Tablet/Smartphone; Material liefert out-of-the-box touch-optimierte, responsive Komponenten für schnelle Punkterfassung, ist eng mit Angular verzahnt und kostenfrei. ngx-charts ergänzt die Statistik-Visualisierung (FA-08). PrimeNG (Alternative) wäre für V1 Over-Engineering.</w:t>
+        <w:t xml:space="preserve">Nutzer bedienen die App während des Matches auf Tablet/Smartphone. Material liefert out-of-the-box touch-optimierte,</w:t>
+      </w:r>
+      <w:r>
+        <w:t xml:space="preserve"> </w:t>
+      </w:r>
+      <w:r>
+        <w:t xml:space="preserve">responsive Komponenten für schnelle Punkterfassung, ist eng mit Angular verzahnt und kostenfrei. ngx-charts ergänzt die Statistik-Visualisierung (FA-08). Die Alternative PrimeNG</w:t>
+      </w:r>
+      <w:r>
+        <w:t xml:space="preserve"> </w:t>
+      </w:r>
+      <w:r>
+        <w:t xml:space="preserve">wäre für V1 Over-Engineering.</w:t>
       </w:r>
     </w:p>
     <w:p>
@@ -9243,731 +9496,919 @@
           <w:b/>
           <w:bCs/>
         </w:rPr>
-        <w:t xml:space="preserve">ADR-09 ·</w:t>
-      </w:r>
+        <w:t xml:space="preserve">ADR-09 · angular-oauth2-oidc statt keycloak-angular.</w:t>
+      </w:r>
+      <w:r>
+        <w:t xml:space="preserve"> </w:t>
+      </w:r>
+      <w:r>
+        <w:t xml:space="preserve">Generische, standard-konforme OIDC-Library ohne Keycloak-Coupling im Frontend-Code — ein IDP-Wechsel ändert nur Konfiguration, nicht Code.</w:t>
+      </w:r>
+      <w:r>
+        <w:t xml:space="preserve"> </w:t>
+      </w:r>
+      <w:r>
+        <w:t xml:space="preserve">Schlanker (keine</w:t>
+      </w:r>
+      <w:r>
+        <w:t xml:space="preserve"> </w:t>
+      </w:r>
+      <w:r>
+        <w:rPr>
+          <w:rStyle w:val="VerbatimChar"/>
+        </w:rPr>
+        <w:t xml:space="preserve">keycloak-js</w:t>
+      </w:r>
+      <w:r>
+        <w:t xml:space="preserve">-Abhängigkeit), native PKCE-Unterstützung, aktiv gepflegt. Umsetzung:</w:t>
+      </w:r>
+      <w:r>
+        <w:t xml:space="preserve"> </w:t>
+      </w:r>
+      <w:r>
+        <w:rPr>
+          <w:rStyle w:val="VerbatimChar"/>
+        </w:rPr>
+        <w:t xml:space="preserve">OAuthModuleConfig</w:t>
+      </w:r>
+      <w:r>
+        <w:t xml:space="preserve">, Bearer-Token-Interceptor,</w:t>
+      </w:r>
+      <w:r>
+        <w:t xml:space="preserve"> </w:t>
+      </w:r>
+      <w:r>
+        <w:rPr>
+          <w:rStyle w:val="VerbatimChar"/>
+        </w:rPr>
+        <w:t xml:space="preserve">CanActivateFn</w:t>
+      </w:r>
+      <w:r>
+        <w:t xml:space="preserve">-Guard auf allen Routes.</w:t>
+      </w:r>
+    </w:p>
+    <w:p>
+      <w:pPr>
+        <w:pStyle w:val="BodyText"/>
+      </w:pPr>
       <w:r>
         <w:rPr>
           <w:b/>
           <w:bCs/>
         </w:rPr>
-        <w:t xml:space="preserve"> </w:t>
-      </w:r>
-      <w:r>
-        <w:rPr>
-          <w:rStyle w:val="VerbatimChar"/>
+        <w:t xml:space="preserve">ADR-10 · Spring AI mit OpenAI. Provider-Abstraktion via</w:t>
+      </w:r>
+      <w:r>
+        <w:rPr>
           <w:b/>
           <w:bCs/>
         </w:rPr>
-        <w:t xml:space="preserve">angular-oauth2-oidc</w:t>
-      </w:r>
-      <w:r>
-        <w:rPr>
+        <w:t xml:space="preserve"> </w:t>
+      </w:r>
+      <w:r>
+        <w:rPr>
+          <w:rStyle w:val="VerbatimChar"/>
           <w:b/>
           <w:bCs/>
         </w:rPr>
-        <w:t xml:space="preserve"> </w:t>
+        <w:t xml:space="preserve">LlmClientPort</w:t>
       </w:r>
       <w:r>
         <w:rPr>
           <w:b/>
           <w:bCs/>
         </w:rPr>
-        <w:t xml:space="preserve">statt</w:t>
+        <w:t xml:space="preserve">.</w:t>
+      </w:r>
+      <w:r>
+        <w:t xml:space="preserve"> </w:t>
+      </w:r>
+      <w:r>
+        <w:t xml:space="preserve">Spring AI 2.0.x (Boot-4-kompatibel) liefert mit</w:t>
+      </w:r>
+      <w:r>
+        <w:t xml:space="preserve"> </w:t>
+      </w:r>
+      <w:r>
+        <w:rPr>
+          <w:rStyle w:val="VerbatimChar"/>
+        </w:rPr>
+        <w:t xml:space="preserve">ChatClient.entity(Class)</w:t>
+      </w:r>
+      <w:r>
+        <w:t xml:space="preserve"> </w:t>
+      </w:r>
+      <w:r>
+        <w:t xml:space="preserve">strukturierten JSON-Output</w:t>
+      </w:r>
+      <w:r>
+        <w:t xml:space="preserve"> </w:t>
+      </w:r>
+      <w:r>
+        <w:t xml:space="preserve">statt fragiler Parser. OpenAI als initialer Provider (Default</w:t>
+      </w:r>
+      <w:r>
+        <w:t xml:space="preserve"> </w:t>
+      </w:r>
+      <w:r>
+        <w:rPr>
+          <w:rStyle w:val="VerbatimChar"/>
+        </w:rPr>
+        <w:t xml:space="preserve">gpt-4o-mini</w:t>
+      </w:r>
+      <w:r>
+        <w:t xml:space="preserve">, via Property tauschbar); ein zweiter Adapter (Anthropic, Ollama) ist über den Out-Port</w:t>
+      </w:r>
+      <w:r>
+        <w:t xml:space="preserve"> </w:t>
+      </w:r>
+      <w:r>
+        <w:rPr>
+          <w:rStyle w:val="VerbatimChar"/>
+        </w:rPr>
+        <w:t xml:space="preserve">LlmClientPort</w:t>
+      </w:r>
+      <w:r>
+        <w:t xml:space="preserve"> </w:t>
+      </w:r>
+      <w:r>
+        <w:t xml:space="preserve">ohne Use-Case-Eingriff ergänzbar. Aktivierung des</w:t>
+      </w:r>
+      <w:r>
+        <w:t xml:space="preserve"> </w:t>
+      </w:r>
+      <w:r>
+        <w:rPr>
+          <w:rStyle w:val="VerbatimChar"/>
+        </w:rPr>
+        <w:t xml:space="preserve">OpenAiLlmAdapter</w:t>
+      </w:r>
+      <w:r>
+        <w:t xml:space="preserve"> </w:t>
+      </w:r>
+      <w:r>
+        <w:t xml:space="preserve">per</w:t>
+      </w:r>
+      <w:r>
+        <w:t xml:space="preserve"> </w:t>
+      </w:r>
+      <w:r>
+        <w:rPr>
+          <w:rStyle w:val="VerbatimChar"/>
+        </w:rPr>
+        <w:t xml:space="preserve">@ConditionalOnExpression</w:t>
+      </w:r>
+      <w:r>
+        <w:t xml:space="preserve"> </w:t>
+      </w:r>
+      <w:r>
+        <w:t xml:space="preserve">auf nicht-leeren API-Key, sonst deterministischer</w:t>
+      </w:r>
+      <w:r>
+        <w:t xml:space="preserve"> </w:t>
+      </w:r>
+      <w:r>
+        <w:rPr>
+          <w:rStyle w:val="VerbatimChar"/>
+        </w:rPr>
+        <w:t xml:space="preserve">FakeLlmClientAdapter</w:t>
+      </w:r>
+      <w:r>
+        <w:t xml:space="preserve">.</w:t>
+      </w:r>
+      <w:r>
+        <w:t xml:space="preserve"> </w:t>
+      </w:r>
+      <w:r>
+        <w:t xml:space="preserve">Analyse wird einmal pro Match generiert und persistiert (Kostenkontrolle, Reproduzierbarkeit).</w:t>
+      </w:r>
+      <w:r>
+        <w:t xml:space="preserve"> </w:t>
       </w:r>
       <w:r>
         <w:rPr>
           <w:b/>
           <w:bCs/>
         </w:rPr>
-        <w:t xml:space="preserve"> </w:t>
-      </w:r>
-      <w:r>
-        <w:rPr>
-          <w:rStyle w:val="VerbatimChar"/>
+        <w:t xml:space="preserve">Bewusst kein RAG / keine Vektor-DB:</w:t>
+      </w:r>
+      <w:r>
+        <w:t xml:space="preserve"> </w:t>
+      </w:r>
+      <w:r>
+        <w:t xml:space="preserve">der Analyse-Input ist strukturierte</w:t>
+      </w:r>
+      <w:r>
+        <w:t xml:space="preserve"> </w:t>
+      </w:r>
+      <w:r>
+        <w:t xml:space="preserve">Numerik (wenige Dutzend Felder pro Match), passt in einen Prompt-Context; eine Embedding-Schicht wäre Over-Engineering. Für V2 (Head-to-Head über N Matches) wird das neu bewertet.</w:t>
+      </w:r>
+    </w:p>
+    <w:p>
+      <w:pPr>
+        <w:pStyle w:val="BodyText"/>
+      </w:pPr>
+      <w:r>
+        <w:rPr>
           <w:b/>
           <w:bCs/>
         </w:rPr>
-        <w:t xml:space="preserve">keycloak-angular</w:t>
+        <w:t xml:space="preserve">ADR-11 · GitHub Actions und aggregiertes JaCoCo-Coverage-Gate.</w:t>
+      </w:r>
+      <w:r>
+        <w:t xml:space="preserve"> </w:t>
+      </w:r>
+      <w:r>
+        <w:t xml:space="preserve">Qualität wird erzwungen, nicht nur empfohlen: Zwei GitHub-Actions-Workflows (Backend und Frontend) laufen bei</w:t>
+      </w:r>
+      <w:r>
+        <w:t xml:space="preserve"> </w:t>
+      </w:r>
+      <w:r>
+        <w:t xml:space="preserve">jedem Push und Pull Request auf</w:t>
+      </w:r>
+      <w:r>
+        <w:t xml:space="preserve"> </w:t>
+      </w:r>
+      <w:r>
+        <w:rPr>
+          <w:rStyle w:val="VerbatimChar"/>
+        </w:rPr>
+        <w:t xml:space="preserve">develop</w:t>
+      </w:r>
+      <w:r>
+        <w:t xml:space="preserve"> </w:t>
+      </w:r>
+      <w:r>
+        <w:t xml:space="preserve">und</w:t>
+      </w:r>
+      <w:r>
+        <w:t xml:space="preserve"> </w:t>
+      </w:r>
+      <w:r>
+        <w:rPr>
+          <w:rStyle w:val="VerbatimChar"/>
+        </w:rPr>
+        <w:t xml:space="preserve">main</w:t>
+      </w:r>
+      <w:r>
+        <w:t xml:space="preserve"> </w:t>
+      </w:r>
+      <w:r>
+        <w:t xml:space="preserve">und sind als</w:t>
+      </w:r>
+      <w:r>
+        <w:t xml:space="preserve"> </w:t>
+      </w:r>
+      <w:r>
+        <w:rPr>
+          <w:i/>
+          <w:iCs/>
+        </w:rPr>
+        <w:t xml:space="preserve">required status checks</w:t>
+      </w:r>
+      <w:r>
+        <w:t xml:space="preserve"> </w:t>
+      </w:r>
+      <w:r>
+        <w:t xml:space="preserve">gesetzt — ohne beide grün kein Merge.</w:t>
+      </w:r>
+      <w:r>
+        <w:t xml:space="preserve"> </w:t>
+      </w:r>
+      <w:r>
+        <w:t xml:space="preserve">Die Backend-Coverage misst JaCoCo modulübergreifend als Summe: Die Integrationstests liegen im</w:t>
+      </w:r>
+      <w:r>
+        <w:t xml:space="preserve"> </w:t>
+      </w:r>
+      <w:r>
+        <w:rPr>
+          <w:rStyle w:val="VerbatimChar"/>
+        </w:rPr>
+        <w:t xml:space="preserve">app</w:t>
+      </w:r>
+      <w:r>
+        <w:t xml:space="preserve">-Modul, decken aber alle Module ab,</w:t>
+      </w:r>
+      <w:r>
+        <w:t xml:space="preserve"> </w:t>
+      </w:r>
+      <w:r>
+        <w:t xml:space="preserve">weshalb ein Gate pro Modul zu niedrig zählen würde. Das Gate hängt in</w:t>
+      </w:r>
+      <w:r>
+        <w:t xml:space="preserve"> </w:t>
+      </w:r>
+      <w:r>
+        <w:rPr>
+          <w:rStyle w:val="VerbatimChar"/>
+        </w:rPr>
+        <w:t xml:space="preserve">check</w:t>
+      </w:r>
+      <w:r>
+        <w:t xml:space="preserve"> </w:t>
+      </w:r>
+      <w:r>
+        <w:t xml:space="preserve">und verlangt</w:t>
+      </w:r>
+      <w:r>
+        <w:t xml:space="preserve"> </w:t>
       </w:r>
       <w:r>
         <w:rPr>
           <w:b/>
           <w:bCs/>
         </w:rPr>
-        <w:t xml:space="preserve">.</w:t>
-      </w:r>
-      <w:r>
-        <w:t xml:space="preserve"> </w:t>
-      </w:r>
-      <w:r>
-        <w:t xml:space="preserve">Generische, standard-konforme OIDC-Library ohne Keycloak-Coupling im Frontend-Code — ein IDP-Wechsel ändert nur Konfiguration, nicht Code. Schlanker (keine</w:t>
-      </w:r>
-      <w:r>
-        <w:t xml:space="preserve"> </w:t>
-      </w:r>
-      <w:r>
-        <w:rPr>
-          <w:rStyle w:val="VerbatimChar"/>
-        </w:rPr>
-        <w:t xml:space="preserve">keycloak-js</w:t>
-      </w:r>
-      <w:r>
-        <w:t xml:space="preserve">-Abhängigkeit), native PKCE-Unterstützung, aktiv gepflegt. Umsetzung:</w:t>
-      </w:r>
-      <w:r>
-        <w:t xml:space="preserve"> </w:t>
-      </w:r>
-      <w:r>
-        <w:rPr>
-          <w:rStyle w:val="VerbatimChar"/>
-        </w:rPr>
-        <w:t xml:space="preserve">OAuthModuleConfig</w:t>
-      </w:r>
-      <w:r>
-        <w:t xml:space="preserve">, Bearer-Token-Interceptor,</w:t>
-      </w:r>
-      <w:r>
-        <w:t xml:space="preserve"> </w:t>
-      </w:r>
-      <w:r>
-        <w:rPr>
-          <w:rStyle w:val="VerbatimChar"/>
-        </w:rPr>
-        <w:t xml:space="preserve">CanActivateFn</w:t>
-      </w:r>
-      <w:r>
-        <w:t xml:space="preserve">-Guard auf allen Routes.</w:t>
-      </w:r>
-    </w:p>
-    <w:p>
-      <w:pPr>
-        <w:pStyle w:val="BodyText"/>
-      </w:pPr>
+        <w:t xml:space="preserve">85 % Line / 70 % Branch</w:t>
+      </w:r>
+      <w:r>
+        <w:t xml:space="preserve"> </w:t>
+      </w:r>
+      <w:r>
+        <w:t xml:space="preserve">—</w:t>
+      </w:r>
+      <w:r>
+        <w:t xml:space="preserve"> </w:t>
+      </w:r>
+      <w:r>
+        <w:t xml:space="preserve">bewusst knapp unter dem Ist-Stand (~95 % / ~80 %), damit normale Schwankungen den Build nicht brechen. Die Workflows laufen</w:t>
+      </w:r>
+      <w:r>
+        <w:t xml:space="preserve"> </w:t>
+      </w:r>
+      <w:r>
+        <w:t xml:space="preserve">absichtlich</w:t>
+      </w:r>
+      <w:r>
+        <w:t xml:space="preserve"> </w:t>
+      </w:r>
       <w:r>
         <w:rPr>
           <w:b/>
           <w:bCs/>
         </w:rPr>
-        <w:t xml:space="preserve">ADR-10 · Spring AI mit OpenAI; Provider-Abstraktion via</w:t>
-      </w:r>
+        <w:t xml:space="preserve">ohne Pfadfilter</w:t>
+      </w:r>
+      <w:r>
+        <w:t xml:space="preserve">, da ein</w:t>
+      </w:r>
+      <w:r>
+        <w:t xml:space="preserve"> </w:t>
+      </w:r>
+      <w:r>
+        <w:rPr>
+          <w:rStyle w:val="VerbatimChar"/>
+        </w:rPr>
+        <w:t xml:space="preserve">required Check</w:t>
+      </w:r>
+      <w:r>
+        <w:t xml:space="preserve">, der wegen eines Pfadfilters gar nicht erst startet, den Merge sonst</w:t>
+      </w:r>
+      <w:r>
+        <w:t xml:space="preserve"> </w:t>
+      </w:r>
+      <w:r>
+        <w:t xml:space="preserve">dauerhaft blockieren würde. Damit ein Administrator zur Not auch ohne die</w:t>
+      </w:r>
+      <w:r>
+        <w:t xml:space="preserve"> </w:t>
+      </w:r>
+      <w:r>
+        <w:rPr>
+          <w:rStyle w:val="VerbatimChar"/>
+        </w:rPr>
+        <w:t xml:space="preserve">required Checks</w:t>
+      </w:r>
+      <w:r>
+        <w:t xml:space="preserve"> </w:t>
+      </w:r>
+      <w:r>
+        <w:t xml:space="preserve">einen Merge durchführen kann, bleibt</w:t>
+      </w:r>
+      <w:r>
+        <w:t xml:space="preserve"> </w:t>
+      </w:r>
+      <w:r>
+        <w:rPr>
+          <w:rStyle w:val="VerbatimChar"/>
+        </w:rPr>
+        <w:t xml:space="preserve">enforce_admins</w:t>
+      </w:r>
+      <w:r>
+        <w:t xml:space="preserve"> </w:t>
+      </w:r>
+      <w:r>
+        <w:t xml:space="preserve">auf</w:t>
+      </w:r>
+      <w:r>
+        <w:t xml:space="preserve"> </w:t>
+      </w:r>
+      <w:r>
+        <w:rPr>
+          <w:rStyle w:val="VerbatimChar"/>
+        </w:rPr>
+        <w:t xml:space="preserve">false</w:t>
+      </w:r>
+      <w:r>
+        <w:t xml:space="preserve"> </w:t>
+      </w:r>
+      <w:r>
+        <w:t xml:space="preserve">gesetzt.</w:t>
+      </w:r>
+    </w:p>
+    <w:p>
+      <w:pPr>
+        <w:pStyle w:val="BodyText"/>
+      </w:pPr>
       <w:r>
         <w:rPr>
           <w:b/>
           <w:bCs/>
         </w:rPr>
-        <w:t xml:space="preserve"> </w:t>
-      </w:r>
-      <w:r>
-        <w:rPr>
-          <w:rStyle w:val="VerbatimChar"/>
+        <w:t xml:space="preserve">ADR-12 · Scoring im</w:t>
+      </w:r>
+      <w:r>
+        <w:rPr>
           <w:b/>
           <w:bCs/>
         </w:rPr>
-        <w:t xml:space="preserve">LlmClientPort</w:t>
-      </w:r>
-      <w:r>
-        <w:rPr>
+        <w:t xml:space="preserve"> </w:t>
+      </w:r>
+      <w:r>
+        <w:rPr>
+          <w:rStyle w:val="VerbatimChar"/>
           <w:b/>
           <w:bCs/>
         </w:rPr>
-        <w:t xml:space="preserve">.</w:t>
-      </w:r>
-      <w:r>
-        <w:t xml:space="preserve"> </w:t>
-      </w:r>
-      <w:r>
-        <w:t xml:space="preserve">Spring AI 2.0.x (Boot-4-kompatibel) liefert mit</w:t>
-      </w:r>
-      <w:r>
-        <w:t xml:space="preserve"> </w:t>
-      </w:r>
-      <w:r>
-        <w:rPr>
-          <w:rStyle w:val="VerbatimChar"/>
-        </w:rPr>
-        <w:t xml:space="preserve">ChatClient.entity(Class)</w:t>
-      </w:r>
-      <w:r>
-        <w:t xml:space="preserve"> </w:t>
-      </w:r>
-      <w:r>
-        <w:t xml:space="preserve">strukturierten JSON-Output statt fragiler Parser. OpenAI als initialer Provider (Default</w:t>
-      </w:r>
-      <w:r>
-        <w:t xml:space="preserve"> </w:t>
-      </w:r>
-      <w:r>
-        <w:rPr>
-          <w:rStyle w:val="VerbatimChar"/>
-        </w:rPr>
-        <w:t xml:space="preserve">gpt-4o-mini</w:t>
-      </w:r>
-      <w:r>
-        <w:t xml:space="preserve">, via Property tauschbar); ein zweiter Adapter (Anthropic, Ollama) ist über den Out-Port</w:t>
-      </w:r>
-      <w:r>
-        <w:t xml:space="preserve"> </w:t>
-      </w:r>
-      <w:r>
-        <w:rPr>
-          <w:rStyle w:val="VerbatimChar"/>
-        </w:rPr>
-        <w:t xml:space="preserve">LlmClientPort</w:t>
-      </w:r>
-      <w:r>
-        <w:t xml:space="preserve"> </w:t>
-      </w:r>
-      <w:r>
-        <w:t xml:space="preserve">ohne Use-Case-Eingriff ergänzbar. Aktivierung des</w:t>
-      </w:r>
-      <w:r>
-        <w:t xml:space="preserve"> </w:t>
-      </w:r>
-      <w:r>
-        <w:rPr>
-          <w:rStyle w:val="VerbatimChar"/>
-        </w:rPr>
-        <w:t xml:space="preserve">OpenAiLlmAdapter</w:t>
-      </w:r>
-      <w:r>
-        <w:t xml:space="preserve"> </w:t>
-      </w:r>
-      <w:r>
-        <w:t xml:space="preserve">per</w:t>
-      </w:r>
-      <w:r>
-        <w:t xml:space="preserve"> </w:t>
-      </w:r>
-      <w:r>
-        <w:rPr>
-          <w:rStyle w:val="VerbatimChar"/>
-        </w:rPr>
-        <w:t xml:space="preserve">@ConditionalOnExpression</w:t>
-      </w:r>
-      <w:r>
-        <w:t xml:space="preserve"> </w:t>
-      </w:r>
-      <w:r>
-        <w:t xml:space="preserve">auf nicht-leeren API-Key, sonst deterministischer</w:t>
-      </w:r>
-      <w:r>
-        <w:t xml:space="preserve"> </w:t>
-      </w:r>
-      <w:r>
-        <w:rPr>
-          <w:rStyle w:val="VerbatimChar"/>
-        </w:rPr>
-        <w:t xml:space="preserve">FakeLlmClientAdapter</w:t>
-      </w:r>
-      <w:r>
-        <w:t xml:space="preserve">. Analyse wird einmal pro Match generiert und persistiert (Kostenkontrolle, Reproduzierbarkeit).</w:t>
-      </w:r>
-      <w:r>
-        <w:t xml:space="preserve"> </w:t>
+        <w:t xml:space="preserve">match-module</w:t>
       </w:r>
       <w:r>
         <w:rPr>
           <w:b/>
           <w:bCs/>
         </w:rPr>
-        <w:t xml:space="preserve">Bewusst kein RAG / keine Vektor-DB:</w:t>
-      </w:r>
-      <w:r>
-        <w:t xml:space="preserve"> </w:t>
-      </w:r>
-      <w:r>
-        <w:t xml:space="preserve">der Analyse-Input ist strukturierte Numerik (wenige Dutzend Felder pro Match), passt in einen Prompt-Context; eine Embedding-Schicht wäre Over-Engineering. Für V2 (Head-to-Head über N Matches) wird das neu bewertet.</w:t>
-      </w:r>
-    </w:p>
-    <w:p>
-      <w:pPr>
-        <w:pStyle w:val="BodyText"/>
-      </w:pPr>
+        <w:t xml:space="preserve"> </w:t>
+      </w:r>
       <w:r>
         <w:rPr>
           <w:b/>
           <w:bCs/>
         </w:rPr>
-        <w:t xml:space="preserve">ADR-11 · GitHub Actions + aggregiertes JaCoCo-Coverage-Gate.</w:t>
-      </w:r>
-      <w:r>
-        <w:t xml:space="preserve"> </w:t>
-      </w:r>
-      <w:r>
-        <w:t xml:space="preserve">Qualität wird durchgesetzt statt empfohlen: zwei pfad-ungefilterte Workflows (Backend, Frontend) auf</w:t>
-      </w:r>
-      <w:r>
-        <w:t xml:space="preserve"> </w:t>
-      </w:r>
-      <w:r>
-        <w:rPr>
-          <w:rStyle w:val="VerbatimChar"/>
-        </w:rPr>
-        <w:t xml:space="preserve">develop</w:t>
-      </w:r>
-      <w:r>
-        <w:t xml:space="preserve">/</w:t>
-      </w:r>
-      <w:r>
-        <w:rPr>
-          <w:rStyle w:val="VerbatimChar"/>
-        </w:rPr>
-        <w:t xml:space="preserve">main</w:t>
-      </w:r>
-      <w:r>
-        <w:t xml:space="preserve"> </w:t>
-      </w:r>
-      <w:r>
-        <w:t xml:space="preserve">als required status checks. Coverage modulübergreifend aggregiert (IT im</w:t>
-      </w:r>
-      <w:r>
-        <w:t xml:space="preserve"> </w:t>
-      </w:r>
-      <w:r>
-        <w:rPr>
-          <w:rStyle w:val="VerbatimChar"/>
-        </w:rPr>
-        <w:t xml:space="preserve">app</w:t>
-      </w:r>
-      <w:r>
-        <w:t xml:space="preserve">-Modul decken alle Module ab → per-Modul-Gate würde unterzählen), Gate in</w:t>
-      </w:r>
-      <w:r>
-        <w:t xml:space="preserve"> </w:t>
-      </w:r>
-      <w:r>
-        <w:rPr>
-          <w:rStyle w:val="VerbatimChar"/>
-        </w:rPr>
-        <w:t xml:space="preserve">check</w:t>
-      </w:r>
-      <w:r>
-        <w:t xml:space="preserve"> </w:t>
-      </w:r>
-      <w:r>
-        <w:t xml:space="preserve">(</w:t>
+        <w:t xml:space="preserve">statt eigenem</w:t>
       </w:r>
       <w:r>
         <w:rPr>
           <w:b/>
           <w:bCs/>
         </w:rPr>
-        <w:t xml:space="preserve">85 % Line / 70 % Branch</w:t>
-      </w:r>
-      <w:r>
-        <w:t xml:space="preserve">, knapp unter Ist ~95/80). Pfadfilter entfernt (ein nicht ausgelöster required Check blockiert den Merge dauerhaft);</w:t>
-      </w:r>
-      <w:r>
-        <w:t xml:space="preserve"> </w:t>
-      </w:r>
-      <w:r>
-        <w:rPr>
-          <w:rStyle w:val="VerbatimChar"/>
-        </w:rPr>
-        <w:t xml:space="preserve">enforce_admins=false</w:t>
-      </w:r>
-      <w:r>
-        <w:t xml:space="preserve">.</w:t>
-      </w:r>
-    </w:p>
-    <w:p>
-      <w:pPr>
-        <w:pStyle w:val="BodyText"/>
-      </w:pPr>
-      <w:r>
-        <w:rPr>
+        <w:t xml:space="preserve"> </w:t>
+      </w:r>
+      <w:r>
+        <w:rPr>
+          <w:rStyle w:val="VerbatimChar"/>
           <w:b/>
           <w:bCs/>
         </w:rPr>
-        <w:t xml:space="preserve">ADR-12 · Scoring im</w:t>
+        <w:t xml:space="preserve">scoring-module</w:t>
       </w:r>
       <w:r>
         <w:rPr>
           <w:b/>
           <w:bCs/>
         </w:rPr>
-        <w:t xml:space="preserve"> </w:t>
-      </w:r>
-      <w:r>
-        <w:rPr>
-          <w:rStyle w:val="VerbatimChar"/>
+        <w:t xml:space="preserve">.</w:t>
+      </w:r>
+      <w:r>
+        <w:t xml:space="preserve"> </w:t>
+      </w:r>
+      <w:r>
+        <w:t xml:space="preserve">Bei der Umsetzung konsolidiert: Punkte erfassen/zählen ist das</w:t>
+      </w:r>
+      <w:r>
+        <w:t xml:space="preserve"> </w:t>
+      </w:r>
+      <w:r>
+        <w:rPr>
           <w:b/>
           <w:bCs/>
         </w:rPr>
-        <w:t xml:space="preserve">match-module</w:t>
-      </w:r>
+        <w:t xml:space="preserve">Kernverhalten</w:t>
+      </w:r>
+      <w:r>
+        <w:t xml:space="preserve"> </w:t>
+      </w:r>
+      <w:r>
+        <w:t xml:space="preserve">eines Matches und operiert untrennbar auf dessen Zustand — eine Modulgrenze hätte feingranularen Port-Verkehr ohne fachlichen Mehrwert erzwungen.</w:t>
+      </w:r>
+      <w:r>
+        <w:t xml:space="preserve"> </w:t>
+      </w:r>
+      <w:r>
+        <w:t xml:space="preserve">Scoring bleibt intern als</w:t>
+      </w:r>
+      <w:r>
+        <w:t xml:space="preserve"> </w:t>
+      </w:r>
+      <w:r>
+        <w:rPr>
+          <w:rStyle w:val="VerbatimChar"/>
+        </w:rPr>
+        <w:t xml:space="preserve">ScoringService</w:t>
+      </w:r>
+      <w:r>
+        <w:t xml:space="preserve"> </w:t>
+      </w:r>
+      <w:r>
+        <w:t xml:space="preserve">gekapselt (spätere Extraktion möglich).</w:t>
+      </w:r>
+    </w:p>
+    <w:p>
+      <w:pPr>
+        <w:pStyle w:val="BodyText"/>
+      </w:pPr>
       <w:r>
         <w:rPr>
           <w:b/>
           <w:bCs/>
         </w:rPr>
-        <w:t xml:space="preserve"> </w:t>
-      </w:r>
+        <w:t xml:space="preserve">ADR-13 · Gemeinsames lesendes Domänenmodell statt DTO-Mapping an jeder Grenze.</w:t>
+      </w:r>
+      <w:r>
+        <w:t xml:space="preserve"> </w:t>
+      </w:r>
+      <w:r>
+        <w:t xml:space="preserve">Module rufen fremdes Verhalten nur über Ports auf (RB-T06),</w:t>
+      </w:r>
+      <w:r>
+        <w:t xml:space="preserve"> </w:t>
+      </w:r>
+      <w:r>
+        <w:t xml:space="preserve">verwenden aber stabile Domänen-Wertobjekte direkt als Read-Model (z. B. liest</w:t>
+      </w:r>
+      <w:r>
+        <w:t xml:space="preserve"> </w:t>
+      </w:r>
+      <w:r>
+        <w:rPr>
+          <w:rStyle w:val="VerbatimChar"/>
+        </w:rPr>
+        <w:t xml:space="preserve">statistics-module</w:t>
+      </w:r>
+      <w:r>
+        <w:t xml:space="preserve"> </w:t>
+      </w:r>
+      <w:r>
+        <w:rPr>
+          <w:rStyle w:val="VerbatimChar"/>
+        </w:rPr>
+        <w:t xml:space="preserve">Point</w:t>
+      </w:r>
+      <w:r>
+        <w:t xml:space="preserve">s,</w:t>
+      </w:r>
+      <w:r>
+        <w:t xml:space="preserve"> </w:t>
+      </w:r>
+      <w:r>
+        <w:rPr>
+          <w:rStyle w:val="VerbatimChar"/>
+        </w:rPr>
+        <w:t xml:space="preserve">ai-module</w:t>
+      </w:r>
+      <w:r>
+        <w:t xml:space="preserve"> </w:t>
+      </w:r>
+      <w:r>
+        <w:rPr>
+          <w:rStyle w:val="VerbatimChar"/>
+        </w:rPr>
+        <w:t xml:space="preserve">Match</w:t>
+      </w:r>
+      <w:r>
+        <w:t xml:space="preserve">/</w:t>
+      </w:r>
+      <w:r>
+        <w:rPr>
+          <w:rStyle w:val="VerbatimChar"/>
+        </w:rPr>
+        <w:t xml:space="preserve">Player</w:t>
+      </w:r>
+      <w:r>
+        <w:t xml:space="preserve">/</w:t>
+      </w:r>
+      <w:r>
+        <w:rPr>
+          <w:rStyle w:val="VerbatimChar"/>
+        </w:rPr>
+        <w:t xml:space="preserve">MatchStatistics</w:t>
+      </w:r>
+      <w:r>
+        <w:t xml:space="preserve">).</w:t>
+      </w:r>
+      <w:r>
+        <w:t xml:space="preserve"> </w:t>
+      </w:r>
+      <w:r>
+        <w:t xml:space="preserve">Diese Typen sind framework-frei und stabil. Spiegel-DTOs an jeder Grenze wären für einen Monolithen Over-Engineering und Duplikation.</w:t>
+      </w:r>
+      <w:r>
+        <w:t xml:space="preserve"> </w:t>
+      </w:r>
+      <w:r>
+        <w:t xml:space="preserve">Abhängigkeiten bleiben einwärts gerichtet und zyklenfrei (</w:t>
+      </w:r>
+      <w:r>
+        <w:rPr>
+          <w:rStyle w:val="VerbatimChar"/>
+        </w:rPr>
+        <w:t xml:space="preserve">ArchitectureTest</w:t>
+      </w:r>
+      <w:r>
+        <w:t xml:space="preserve">). Bei späterer Service-Extraktion werden sie zu Vertragstypen/DTOs.</w:t>
+      </w:r>
+    </w:p>
+    <w:p>
+      <w:pPr>
+        <w:pStyle w:val="BodyText"/>
+      </w:pPr>
       <w:r>
         <w:rPr>
           <w:b/>
           <w:bCs/>
         </w:rPr>
-        <w:t xml:space="preserve">statt eigenem</w:t>
-      </w:r>
+        <w:t xml:space="preserve">ADR-14 · Versionierung nach SemVer 2.0.0, Changelog nach „Keep a Changelog” 1.1.0.</w:t>
+      </w:r>
+      <w:r>
+        <w:t xml:space="preserve"> </w:t>
+      </w:r>
+      <w:r>
+        <w:t xml:space="preserve">Beide sind der De-facto-Standard im Java- und JS-Ökosystem.</w:t>
+      </w:r>
+      <w:r>
+        <w:t xml:space="preserve"> </w:t>
+      </w:r>
+      <w:r>
+        <w:t xml:space="preserve">Solange die Version bei</w:t>
+      </w:r>
+      <w:r>
+        <w:t xml:space="preserve"> </w:t>
+      </w:r>
+      <w:r>
+        <w:rPr>
+          <w:rStyle w:val="VerbatimChar"/>
+        </w:rPr>
+        <w:t xml:space="preserve">0.x</w:t>
+      </w:r>
+      <w:r>
+        <w:t xml:space="preserve"> </w:t>
+      </w:r>
+      <w:r>
+        <w:t xml:space="preserve">steht, gilt bereits eine MINOR-Erhöhung als potenziell breaking — das passt zum MVP, dessen Datenmodell und API noch in Bewegung sind.</w:t>
+      </w:r>
+      <w:r>
+        <w:t xml:space="preserve"> </w:t>
+      </w:r>
+      <w:r>
+        <w:t xml:space="preserve">Ab</w:t>
+      </w:r>
+      <w:r>
+        <w:t xml:space="preserve"> </w:t>
+      </w:r>
+      <w:r>
+        <w:rPr>
+          <w:rStyle w:val="VerbatimChar"/>
+        </w:rPr>
+        <w:t xml:space="preserve">1.0.0</w:t>
+      </w:r>
+      <w:r>
+        <w:t xml:space="preserve"> </w:t>
+      </w:r>
+      <w:r>
+        <w:t xml:space="preserve">greifen die strengen SemVer-Regeln (breaking changes nur bei einer MAJOR-Erhöhung). Die Änderungen werden in</w:t>
+      </w:r>
+      <w:r>
+        <w:t xml:space="preserve"> </w:t>
+      </w:r>
+      <w:r>
+        <w:rPr>
+          <w:rStyle w:val="VerbatimChar"/>
+        </w:rPr>
+        <w:t xml:space="preserve">CHANGELOG.md</w:t>
+      </w:r>
+      <w:r>
+        <w:t xml:space="preserve"> </w:t>
+      </w:r>
+      <w:r>
+        <w:t xml:space="preserve">gepflegt.</w:t>
+      </w:r>
+      <w:r>
+        <w:t xml:space="preserve"> </w:t>
+      </w:r>
+      <w:r>
+        <w:t xml:space="preserve">Ein Sammelabschnitt</w:t>
+      </w:r>
+      <w:r>
+        <w:t xml:space="preserve"> </w:t>
+      </w:r>
+      <w:r>
+        <w:rPr>
+          <w:rStyle w:val="VerbatimChar"/>
+        </w:rPr>
+        <w:t xml:space="preserve">[Unreleased]</w:t>
+      </w:r>
+      <w:r>
+        <w:t xml:space="preserve"> </w:t>
+      </w:r>
+      <w:r>
+        <w:t xml:space="preserve">nimmt laufend neue Einträge auf, geordnet nach den Kategorien Added/Changed/Deprecated/Removed/Fixed/Security.</w:t>
+      </w:r>
+      <w:r>
+        <w:t xml:space="preserve"> </w:t>
+      </w:r>
+      <w:r>
+        <w:t xml:space="preserve">Der Changelog wird vorerst bewusst von Hand statt automatisiert geführt — Werkzeuge wie release-please wären für ein Ein-Personen-MVP Over-Engineering.</w:t>
+      </w:r>
+      <w:r>
+        <w:t xml:space="preserve"> </w:t>
+      </w:r>
+      <w:r>
+        <w:t xml:space="preserve">Jede Version wird als Git-Tag</w:t>
+      </w:r>
+      <w:r>
+        <w:t xml:space="preserve"> </w:t>
+      </w:r>
+      <w:r>
+        <w:rPr>
+          <w:rStyle w:val="VerbatimChar"/>
+        </w:rPr>
+        <w:t xml:space="preserve">vX.Y.Z</w:t>
+      </w:r>
+      <w:r>
+        <w:t xml:space="preserve"> </w:t>
+      </w:r>
+      <w:r>
+        <w:t xml:space="preserve">markiert.</w:t>
+      </w:r>
+    </w:p>
+    <w:p>
+      <w:pPr>
+        <w:pStyle w:val="BodyText"/>
+      </w:pPr>
       <w:r>
         <w:rPr>
           <w:b/>
           <w:bCs/>
         </w:rPr>
-        <w:t xml:space="preserve"> </w:t>
-      </w:r>
-      <w:r>
-        <w:rPr>
-          <w:rStyle w:val="VerbatimChar"/>
+        <w:t xml:space="preserve">ADR-15 · Nginx als Laufzeit-Server der SPA (kein Node).</w:t>
+      </w:r>
+      <w:r>
+        <w:t xml:space="preserve"> </w:t>
+      </w:r>
+      <w:r>
+        <w:rPr>
+          <w:rStyle w:val="VerbatimChar"/>
+        </w:rPr>
+        <w:t xml:space="preserve">ng build</w:t>
+      </w:r>
+      <w:r>
+        <w:t xml:space="preserve"> </w:t>
+      </w:r>
+      <w:r>
+        <w:t xml:space="preserve">erzeugt rein statische Artefakte — Node.js ist nur Build-/Testwerkzeug</w:t>
+      </w:r>
+      <w:r>
+        <w:t xml:space="preserve"> </w:t>
+      </w:r>
+      <w:r>
+        <w:t xml:space="preserve">(CI, Dockerfile-Build-Stage,</w:t>
+      </w:r>
+      <w:r>
+        <w:t xml:space="preserve"> </w:t>
+      </w:r>
+      <w:r>
+        <w:rPr>
+          <w:rStyle w:val="VerbatimChar"/>
+        </w:rPr>
+        <w:t xml:space="preserve">ng serve</w:t>
+      </w:r>
+      <w:r>
+        <w:t xml:space="preserve">), nicht Laufzeit. Ein Multi-Stage-Build liefert das finale Image auf</w:t>
+      </w:r>
+      <w:r>
+        <w:t xml:space="preserve"> </w:t>
+      </w:r>
+      <w:r>
+        <w:rPr>
+          <w:rStyle w:val="VerbatimChar"/>
+        </w:rPr>
+        <w:t xml:space="preserve">nginx-unprivileged:alpine</w:t>
+      </w:r>
+      <w:r>
+        <w:t xml:space="preserve"> </w:t>
+      </w:r>
+      <w:r>
+        <w:t xml:space="preserve">(kein Node im Image → kleine Angriffsfläche,</w:t>
+      </w:r>
+      <w:r>
+        <w:t xml:space="preserve"> </w:t>
+      </w:r>
+      <w:r>
+        <w:rPr>
+          <w:rStyle w:val="VerbatimChar"/>
+        </w:rPr>
+        <w:t xml:space="preserve">mem_limit: 128m</w:t>
+      </w:r>
+      <w:r>
+        <w:t xml:space="preserve">, non-root UID 101,</w:t>
+      </w:r>
+      <w:r>
+        <w:t xml:space="preserve"> </w:t>
+      </w:r>
+      <w:r>
+        <w:rPr>
+          <w:rStyle w:val="VerbatimChar"/>
+        </w:rPr>
+        <w:t xml:space="preserve">read_only</w:t>
+      </w:r>
+      <w:r>
+        <w:t xml:space="preserve">). Nginx übernimmt zugleich TLS-Terminierung und</w:t>
+      </w:r>
+      <w:r>
+        <w:t xml:space="preserve"> </w:t>
+      </w:r>
+      <w:r>
+        <w:t xml:space="preserve">HTTP→HTTPS-Redirect (</w:t>
+      </w:r>
+      <w:r>
+        <w:rPr>
+          <w:rStyle w:val="VerbatimChar"/>
+        </w:rPr>
+        <w:t xml:space="preserve">nginx.prod.conf</w:t>
+      </w:r>
+      <w:r>
+        <w:t xml:space="preserve">), Reverse-Proxy</w:t>
+      </w:r>
+      <w:r>
+        <w:t xml:space="preserve"> </w:t>
+      </w:r>
+      <w:r>
+        <w:rPr>
+          <w:rStyle w:val="VerbatimChar"/>
+        </w:rPr>
+        <w:t xml:space="preserve">/api/</w:t>
+      </w:r>
+      <w:r>
+        <w:t xml:space="preserve"> </w:t>
+      </w:r>
+      <w:r>
+        <w:t xml:space="preserve">ans Backend (eine Origin → kein CORS, Backend ohne öffentlichen Port), Security-Header</w:t>
+      </w:r>
+      <w:r>
+        <w:t xml:space="preserve"> </w:t>
+      </w:r>
+      <w:r>
+        <w:t xml:space="preserve">(CSP/HSTS/…) und Per-IP-Rate-Limit auf den KI-Endpoint sowie SPA-Fallback (</w:t>
+      </w:r>
+      <w:r>
+        <w:rPr>
+          <w:rStyle w:val="VerbatimChar"/>
+        </w:rPr>
+        <w:t xml:space="preserve">try_files … /index.html</w:t>
+      </w:r>
+      <w:r>
+        <w:t xml:space="preserve">) für Deep-Links. Ein Node-Runtime-Server wäre</w:t>
+      </w:r>
+      <w:r>
+        <w:t xml:space="preserve"> </w:t>
+      </w:r>
+      <w:r>
+        <w:t xml:space="preserve">nur bei SSR/Angular Universal nötig — für die reine Client-SPA Over-Engineering. Ergänzt die Container-Trennung aus ADR-02.</w:t>
+      </w:r>
+    </w:p>
+    <w:p>
+      <w:pPr>
+        <w:pStyle w:val="BodyText"/>
+      </w:pPr>
+      <w:r>
+        <w:rPr>
           <w:b/>
           <w:bCs/>
         </w:rPr>
-        <w:t xml:space="preserve">scoring-module</w:t>
-      </w:r>
-      <w:r>
-        <w:rPr>
-          <w:b/>
-          <w:bCs/>
-        </w:rPr>
-        <w:t xml:space="preserve">.</w:t>
-      </w:r>
-      <w:r>
-        <w:t xml:space="preserve"> </w:t>
-      </w:r>
-      <w:r>
-        <w:t xml:space="preserve">Bei der Umsetzung konsolidiert: Punkte erfassen/zählen ist das</w:t>
-      </w:r>
-      <w:r>
-        <w:t xml:space="preserve"> </w:t>
-      </w:r>
-      <w:r>
-        <w:rPr>
-          <w:b/>
-          <w:bCs/>
-        </w:rPr>
-        <w:t xml:space="preserve">Kernverhalten</w:t>
-      </w:r>
-      <w:r>
-        <w:t xml:space="preserve"> </w:t>
-      </w:r>
-      <w:r>
-        <w:t xml:space="preserve">eines Matches und operiert untrennbar auf dessen Zustand — eine Modulgrenze hätte feingranularen Port-Verkehr ohne fachlichen Mehrwert erzwungen. Scoring bleibt intern als</w:t>
-      </w:r>
-      <w:r>
-        <w:t xml:space="preserve"> </w:t>
-      </w:r>
-      <w:r>
-        <w:rPr>
-          <w:rStyle w:val="VerbatimChar"/>
-        </w:rPr>
-        <w:t xml:space="preserve">ScoringService</w:t>
-      </w:r>
-      <w:r>
-        <w:t xml:space="preserve"> </w:t>
-      </w:r>
-      <w:r>
-        <w:t xml:space="preserve">gekapselt (spätere Extraktion möglich).</w:t>
-      </w:r>
-    </w:p>
-    <w:p>
-      <w:pPr>
-        <w:pStyle w:val="BodyText"/>
-      </w:pPr>
-      <w:r>
-        <w:rPr>
-          <w:b/>
-          <w:bCs/>
-        </w:rPr>
-        <w:t xml:space="preserve">ADR-13 · Gemeinsames lesendes Domänenmodell statt DTO-Mapping an jeder Grenze.</w:t>
-      </w:r>
-      <w:r>
-        <w:t xml:space="preserve"> </w:t>
-      </w:r>
-      <w:r>
-        <w:t xml:space="preserve">Module rufen fremdes Verhalten nur über Ports auf (RB-T06), verwenden aber stabile Domänen-Wertobjekte direkt als Read-Model (z. B. liest</w:t>
-      </w:r>
-      <w:r>
-        <w:t xml:space="preserve"> </w:t>
-      </w:r>
-      <w:r>
-        <w:rPr>
-          <w:rStyle w:val="VerbatimChar"/>
-        </w:rPr>
-        <w:t xml:space="preserve">statistics-module</w:t>
-      </w:r>
-      <w:r>
-        <w:t xml:space="preserve"> </w:t>
-      </w:r>
-      <w:r>
-        <w:rPr>
-          <w:rStyle w:val="VerbatimChar"/>
-        </w:rPr>
-        <w:t xml:space="preserve">Point</w:t>
-      </w:r>
-      <w:r>
-        <w:t xml:space="preserve">s,</w:t>
-      </w:r>
-      <w:r>
-        <w:t xml:space="preserve"> </w:t>
-      </w:r>
-      <w:r>
-        <w:rPr>
-          <w:rStyle w:val="VerbatimChar"/>
-        </w:rPr>
-        <w:t xml:space="preserve">ai-module</w:t>
-      </w:r>
-      <w:r>
-        <w:t xml:space="preserve"> </w:t>
-      </w:r>
-      <w:r>
-        <w:rPr>
-          <w:rStyle w:val="VerbatimChar"/>
-        </w:rPr>
-        <w:t xml:space="preserve">Match</w:t>
-      </w:r>
-      <w:r>
-        <w:t xml:space="preserve">/</w:t>
-      </w:r>
-      <w:r>
-        <w:rPr>
-          <w:rStyle w:val="VerbatimChar"/>
-        </w:rPr>
-        <w:t xml:space="preserve">Player</w:t>
-      </w:r>
-      <w:r>
-        <w:t xml:space="preserve">/</w:t>
-      </w:r>
-      <w:r>
-        <w:rPr>
-          <w:rStyle w:val="VerbatimChar"/>
-        </w:rPr>
-        <w:t xml:space="preserve">MatchStatistics</w:t>
-      </w:r>
-      <w:r>
-        <w:t xml:space="preserve">). Diese Typen sind framework-frei und stabil; Spiegel-DTOs an jeder Grenze wären für einen Monolithen Over-Engineering und Duplikation. Abhängigkeiten bleiben einwärts/zyklenfrei (</w:t>
-      </w:r>
-      <w:r>
-        <w:rPr>
-          <w:rStyle w:val="VerbatimChar"/>
-        </w:rPr>
-        <w:t xml:space="preserve">ArchitectureTest</w:t>
-      </w:r>
-      <w:r>
-        <w:t xml:space="preserve">). Bei späterer Service-Extraktion werden sie zu Vertragstypen/DTOs.</w:t>
-      </w:r>
-    </w:p>
-    <w:p>
-      <w:pPr>
-        <w:pStyle w:val="BodyText"/>
-      </w:pPr>
-      <w:r>
-        <w:rPr>
-          <w:b/>
-          <w:bCs/>
-        </w:rPr>
-        <w:t xml:space="preserve">ADR-14 · SemVer 2.0.0 + Keep a Changelog 1.1.0.</w:t>
-      </w:r>
-      <w:r>
-        <w:t xml:space="preserve"> </w:t>
-      </w:r>
-      <w:r>
-        <w:t xml:space="preserve">Branchenstandard im Java-/JS-Ökosystem. Pre-1.0 (</w:t>
-      </w:r>
-      <w:r>
-        <w:rPr>
-          <w:rStyle w:val="VerbatimChar"/>
-        </w:rPr>
-        <w:t xml:space="preserve">0.x</w:t>
-      </w:r>
-      <w:r>
-        <w:t xml:space="preserve">): MINOR gilt als potenziell breaking (passt zum MVP, Datenmodell/API in Bewegung); ab</w:t>
-      </w:r>
-      <w:r>
-        <w:t xml:space="preserve"> </w:t>
-      </w:r>
-      <w:r>
-        <w:rPr>
-          <w:rStyle w:val="VerbatimChar"/>
-        </w:rPr>
-        <w:t xml:space="preserve">1.0.0</w:t>
-      </w:r>
-      <w:r>
-        <w:t xml:space="preserve"> </w:t>
-      </w:r>
-      <w:r>
-        <w:t xml:space="preserve">greifen die strengen Regeln.</w:t>
-      </w:r>
-      <w:r>
-        <w:t xml:space="preserve"> </w:t>
-      </w:r>
-      <w:r>
-        <w:rPr>
-          <w:rStyle w:val="VerbatimChar"/>
-        </w:rPr>
-        <w:t xml:space="preserve">CHANGELOG.md</w:t>
-      </w:r>
-      <w:r>
-        <w:t xml:space="preserve"> </w:t>
-      </w:r>
-      <w:r>
-        <w:t xml:space="preserve">mit</w:t>
-      </w:r>
-      <w:r>
-        <w:t xml:space="preserve"> </w:t>
-      </w:r>
-      <w:r>
-        <w:rPr>
-          <w:rStyle w:val="VerbatimChar"/>
-        </w:rPr>
-        <w:t xml:space="preserve">[Unreleased]</w:t>
-      </w:r>
-      <w:r>
-        <w:t xml:space="preserve">-Sammelabschnitt und Kategorien Added/Changed/Deprecated/Removed/Fixed/Security. Bewusst (vorerst) nicht automatisiert (release-please o. ä. wäre für ein Ein-Personen-MVP Over-Engineering). Git-Tags</w:t>
-      </w:r>
-      <w:r>
-        <w:t xml:space="preserve"> </w:t>
-      </w:r>
-      <w:r>
-        <w:rPr>
-          <w:rStyle w:val="VerbatimChar"/>
-        </w:rPr>
-        <w:t xml:space="preserve">vX.Y.Z</w:t>
-      </w:r>
-      <w:r>
-        <w:t xml:space="preserve"> </w:t>
-      </w:r>
-      <w:r>
-        <w:t xml:space="preserve">je Version.</w:t>
-      </w:r>
-    </w:p>
-    <w:p>
-      <w:pPr>
-        <w:pStyle w:val="BodyText"/>
-      </w:pPr>
-      <w:r>
-        <w:rPr>
-          <w:b/>
-          <w:bCs/>
-        </w:rPr>
-        <w:t xml:space="preserve">ADR-15 · Nginx als Laufzeit-Server der SPA (kein Node).</w:t>
-      </w:r>
-      <w:r>
-        <w:t xml:space="preserve"> </w:t>
-      </w:r>
-      <w:r>
-        <w:rPr>
-          <w:rStyle w:val="VerbatimChar"/>
-        </w:rPr>
-        <w:t xml:space="preserve">ng build</w:t>
-      </w:r>
-      <w:r>
-        <w:t xml:space="preserve"> </w:t>
-      </w:r>
-      <w:r>
-        <w:t xml:space="preserve">erzeugt rein statische Artefakte — Node.js ist nur Build-/Testwerkzeug (CI, Dockerfile-Build-Stage,</w:t>
-      </w:r>
-      <w:r>
-        <w:t xml:space="preserve"> </w:t>
-      </w:r>
-      <w:r>
-        <w:rPr>
-          <w:rStyle w:val="VerbatimChar"/>
-        </w:rPr>
-        <w:t xml:space="preserve">ng serve</w:t>
-      </w:r>
-      <w:r>
-        <w:t xml:space="preserve">), nicht Laufzeit. Ein Multi-Stage-Build liefert das finale Image auf</w:t>
-      </w:r>
-      <w:r>
-        <w:t xml:space="preserve"> </w:t>
-      </w:r>
-      <w:r>
-        <w:rPr>
-          <w:rStyle w:val="VerbatimChar"/>
-        </w:rPr>
-        <w:t xml:space="preserve">nginx-unprivileged:alpine</w:t>
-      </w:r>
-      <w:r>
-        <w:t xml:space="preserve"> </w:t>
-      </w:r>
-      <w:r>
-        <w:t xml:space="preserve">(kein Node im Image → kleine Angriffsfläche,</w:t>
-      </w:r>
-      <w:r>
-        <w:t xml:space="preserve"> </w:t>
-      </w:r>
-      <w:r>
-        <w:rPr>
-          <w:rStyle w:val="VerbatimChar"/>
-        </w:rPr>
-        <w:t xml:space="preserve">mem_limit: 128m</w:t>
-      </w:r>
-      <w:r>
-        <w:t xml:space="preserve">, non-root UID 101,</w:t>
-      </w:r>
-      <w:r>
-        <w:t xml:space="preserve"> </w:t>
-      </w:r>
-      <w:r>
-        <w:rPr>
-          <w:rStyle w:val="VerbatimChar"/>
-        </w:rPr>
-        <w:t xml:space="preserve">read_only</w:t>
-      </w:r>
-      <w:r>
-        <w:t xml:space="preserve">). Nginx übernimmt zugleich TLS-Terminierung + HTTP→HTTPS-Redirect (</w:t>
-      </w:r>
-      <w:r>
-        <w:rPr>
-          <w:rStyle w:val="VerbatimChar"/>
-        </w:rPr>
-        <w:t xml:space="preserve">nginx.prod.conf</w:t>
-      </w:r>
-      <w:r>
-        <w:t xml:space="preserve">), Reverse-Proxy</w:t>
-      </w:r>
-      <w:r>
-        <w:t xml:space="preserve"> </w:t>
-      </w:r>
-      <w:r>
-        <w:rPr>
-          <w:rStyle w:val="VerbatimChar"/>
-        </w:rPr>
-        <w:t xml:space="preserve">/api/</w:t>
-      </w:r>
-      <w:r>
-        <w:t xml:space="preserve"> </w:t>
-      </w:r>
-      <w:r>
-        <w:t xml:space="preserve">ans Backend (eine Origin → kein CORS, Backend ohne öffentlichen Port), Security-Header (CSP/HSTS/…) und Per-IP-Rate-Limit auf den KI-Endpoint sowie SPA-Fallback (</w:t>
-      </w:r>
-      <w:r>
-        <w:rPr>
-          <w:rStyle w:val="VerbatimChar"/>
-        </w:rPr>
-        <w:t xml:space="preserve">try_files … /index.html</w:t>
-      </w:r>
-      <w:r>
-        <w:t xml:space="preserve">) für Deep-Links. Ein Node-Runtime-Server wäre nur bei SSR/Angular Universal nötig — für die reine Client-SPA Over-Engineering. Ergänzt die Container-Trennung aus ADR-02.</w:t>
-      </w:r>
-    </w:p>
-    <w:p>
-      <w:pPr>
-        <w:pStyle w:val="BodyText"/>
-      </w:pPr>
-      <w:r>
-        <w:rPr>
-          <w:b/>
-          <w:bCs/>
-        </w:rPr>
         <w:t xml:space="preserve">ADR-16 · MailHog als SMTP-Sink im Dev, echter Provider erst in Prod.</w:t>
       </w:r>
       <w:r>
         <w:t xml:space="preserve"> </w:t>
       </w:r>
       <w:r>
-        <w:t xml:space="preserve">Keycloak versendet Verifizierungs-/Passwort-Mails (verifyEmail, §7.1.3). Im Dev fängt der Container</w:t>
+        <w:t xml:space="preserve">Keycloak versendet Verifizierungs-/Passwort-Mails (verifyEmail, §7.1.3).</w:t>
+      </w:r>
+      <w:r>
+        <w:t xml:space="preserve"> </w:t>
+      </w:r>
+      <w:r>
+        <w:t xml:space="preserve">Im Dev fängt der Container</w:t>
       </w:r>
       <w:r>
         <w:t xml:space="preserve"> </w:t>
@@ -10009,7 +10450,25 @@
         <w:t xml:space="preserve"> </w:t>
       </w:r>
       <w:r>
-        <w:t xml:space="preserve">Web-UI) statt real zuzustellen: kein Provider-Account/API-Key/Domain-Setup nötig, keine Zustellkosten, keine versehentlichen Mails an echte Adressen, jede Test-Mail sofort in der Web-UI einsehbar. Ein transaktionaler Dienst (Mailgun/SendGrid) wäre im Dev Over-Engineering. Prod ersetzt MailHog durch echtes SMTP — gleiche Keycloak-Konfiguration, nur</w:t>
+        <w:t xml:space="preserve">Web-UI) statt real zuzustellen, so ist kein Provider-Account/API-Key/Domain-Setup</w:t>
+      </w:r>
+      <w:r>
+        <w:t xml:space="preserve"> </w:t>
+      </w:r>
+      <w:r>
+        <w:t xml:space="preserve">für die Entwicklung nötig, keine Zustellkosten, keine versehentlichen Mails an echte Adressen, jede Test-Mail ist sofort in der Web-UI einsehbar.</w:t>
+      </w:r>
+      <w:r>
+        <w:t xml:space="preserve"> </w:t>
+      </w:r>
+      <w:r>
+        <w:t xml:space="preserve">Ein transaktionaler Dienst (Mailgun/SendGrid) wäre im Dev Over-Engineering. In Produktion wird MailHog durch einen echten SMTP-Server ersetzt.</w:t>
+      </w:r>
+      <w:r>
+        <w:t xml:space="preserve"> </w:t>
+      </w:r>
+      <w:r>
+        <w:t xml:space="preserve">Die Keycloak-Konfiguration bleibt dabei unverändert, nur die</w:t>
       </w:r>
       <w:r>
         <w:t xml:space="preserve"> </w:t>
@@ -10021,10 +10480,10 @@
         <w:t xml:space="preserve">${KC_SMTP_*}</w:t>
       </w:r>
       <w:r>
-        <w:t xml:space="preserve"> </w:t>
-      </w:r>
-      <w:r>
-        <w:t xml:space="preserve">umgesetzt (</w:t>
+        <w:t xml:space="preserve">-Umgebungsvariablen werden mit echten Werten belegt. Das Compose-Overlay</w:t>
+      </w:r>
+      <w:r>
+        <w:t xml:space="preserve"> </w:t>
       </w:r>
       <w:r>
         <w:rPr>
@@ -10033,10 +10492,10 @@
         <w:t xml:space="preserve">compose.prod.yml</w:t>
       </w:r>
       <w:r>
-        <w:t xml:space="preserve">:</w:t>
-      </w:r>
-      <w:r>
-        <w:t xml:space="preserve"> </w:t>
+        <w:t xml:space="preserve"> </w:t>
+      </w:r>
+      <w:r>
+        <w:t xml:space="preserve">entfernt zusätzlich den MailHog-Dienst (</w:t>
       </w:r>
       <w:r>
         <w:rPr>
@@ -10045,7 +10504,7 @@
         <w:t xml:space="preserve">mailhog: !reset null</w:t>
       </w:r>
       <w:r>
-        <w:t xml:space="preserve">). Umsetzung von RB-T07.</w:t>
+        <w:t xml:space="preserve">). Damit ist die Randbedingung RB-T07 umgesetzt.</w:t>
       </w:r>
     </w:p>
     <w:p>
@@ -10055,8 +10514,8 @@
         </w:pict>
       </w:r>
     </w:p>
-    <w:bookmarkEnd w:id="78"/>
-    <w:bookmarkStart w:id="82" w:name="qualitätsanforderungen"/>
+    <w:bookmarkEnd w:id="80"/>
+    <w:bookmarkStart w:id="84" w:name="qualitätsanforderungen"/>
     <w:p>
       <w:pPr>
         <w:pStyle w:val="Heading2"/>
@@ -10065,7 +10524,7 @@
         <w:t xml:space="preserve">10. Qualitätsanforderungen</w:t>
       </w:r>
     </w:p>
-    <w:bookmarkStart w:id="79" w:name="funktionale-anforderungen-smart"/>
+    <w:bookmarkStart w:id="81" w:name="funktionale-anforderungen-smart"/>
     <w:p>
       <w:pPr>
         <w:pStyle w:val="Heading3"/>
@@ -10076,7 +10535,7 @@
     </w:p>
     <w:p>
       <w:pPr>
-        <w:pStyle w:val="BlockText"/>
+        <w:pStyle w:val="FirstParagraph"/>
       </w:pPr>
       <w:r>
         <w:t xml:space="preserve">Antwortzeit-Ziele sind übergreifend in §1.2 (QZ-03/04/06) und §10.2 (NFA-01) festgelegt (Write ≤ 250 ms, Read ≤ 500 ms, KI ≤ 60 s) und werden unten nicht je FA wiederholt.</w:t>
@@ -10090,10 +10549,10 @@
         <w:tblLook w:firstRow="1" w:lastRow="0" w:firstColumn="0" w:lastColumn="0" w:noHBand="0" w:noVBand="0" w:val="0020"/>
       </w:tblPr>
       <w:tblGrid>
-        <w:gridCol w:w="586"/>
-        <w:gridCol w:w="1906"/>
-        <w:gridCol w:w="4106"/>
-        <w:gridCol w:w="1320"/>
+        <w:gridCol w:w="597"/>
+        <w:gridCol w:w="1942"/>
+        <w:gridCol w:w="4034"/>
+        <w:gridCol w:w="1344"/>
       </w:tblGrid>
       <w:tr>
         <w:trPr>
@@ -10228,19 +10687,7 @@
               <w:pStyle w:val="Compact"/>
             </w:pPr>
             <w:r>
-              <w:t xml:space="preserve">OAuth2 Authorization Code + PKCE über Keycloak. Access-Token (15 min), Refresh-Token (30 Tage). Mit gültigem Token alle geschützten Endpunkte → 200; ohne → 401 (ausser</w:t>
-            </w:r>
-            <w:r>
-              <w:t xml:space="preserve"> </w:t>
-            </w:r>
-            <w:r>
-              <w:rPr>
-                <w:rStyle w:val="VerbatimChar"/>
-              </w:rPr>
-              <w:t xml:space="preserve">/health</w:t>
-            </w:r>
-            <w:r>
-              <w:t xml:space="preserve">).</w:t>
+              <w:t xml:space="preserve">OAuth2 Authorization Code mit PKCE über Keycloak. Access-Token (15 min), Refresh-Token (30 Tage). Mit gültigem Token alle geschützten Endpunkte → 200; ohne → 401 (ausser dem öffentlichen Health-Check).</w:t>
             </w:r>
           </w:p>
         </w:tc>
@@ -10290,13 +10737,7 @@
               <w:pStyle w:val="Compact"/>
             </w:pPr>
             <w:r>
-              <w:rPr>
-                <w:rStyle w:val="VerbatimChar"/>
-              </w:rPr>
-              <w:t xml:space="preserve">POST /api/players</w:t>
-            </w:r>
-            <w:r>
-              <w:t xml:space="preserve">. Pflicht: Vor-/Nachname (≤ 50), Geschlecht, Spielhand, Backhand-Typ. Optional: Ranking (&gt; 0), Nationalität (ISO 3166-1 α-2), Geburtsdatum (ISO 8601). Erfolg → 201 mit UUID; Formatfehler → 400 (Feld + Grund).</w:t>
+              <w:t xml:space="preserve">Erfasst einen neuen Spieler. Pflichtfelder Vor-/Nachname (≤ 50), Geschlecht, Spielhand, Backhand-Typ. Optional: Ranking (&gt; 0), Nationalität (ISO 3166-1 α-2), Geburtsdatum (ISO 8601). Erfolg → 201 mit UUID; Formatfehler → 400 (Feld + Grund).</w:t>
             </w:r>
           </w:p>
         </w:tc>
@@ -10346,16 +10787,7 @@
               <w:pStyle w:val="Compact"/>
             </w:pPr>
             <w:r>
-              <w:rPr>
-                <w:rStyle w:val="VerbatimChar"/>
-              </w:rPr>
-              <w:t xml:space="preserve">GET /api/players?firstName=&amp;lastName=</w:t>
-            </w:r>
-            <w:r>
-              <w:t xml:space="preserve"> </w:t>
-            </w:r>
-            <w:r>
-              <w:t xml:space="preserve">(mind. ein Parameter, sonst 400). Paginierte Liste (max. 50/Seite, Nachname aufsteigend); keine Treffer → leere Liste (200).</w:t>
+              <w:t xml:space="preserve">Sucht einen Spieler. Mindestens ein Suchparameter ist erforderlich (sonst 400). Paginierte Liste (max. 50/Seite, Nachname aufsteigend); keine Treffer → leere Liste (200).</w:t>
             </w:r>
           </w:p>
         </w:tc>
@@ -10405,13 +10837,7 @@
               <w:pStyle w:val="Compact"/>
             </w:pPr>
             <w:r>
-              <w:rPr>
-                <w:rStyle w:val="VerbatimChar"/>
-              </w:rPr>
-              <w:t xml:space="preserve">POST /api/matches</w:t>
-            </w:r>
-            <w:r>
-              <w:t xml:space="preserve">. Pflicht:</w:t>
+              <w:t xml:space="preserve">Erstellt einen neuen Match. Pflichtfelder</w:t>
             </w:r>
             <w:r>
               <w:t xml:space="preserve"> </w:t>
@@ -10536,19 +10962,7 @@
               <w:pStyle w:val="Compact"/>
             </w:pPr>
             <w:r>
-              <w:rPr>
-                <w:rStyle w:val="VerbatimChar"/>
-              </w:rPr>
-              <w:t xml:space="preserve">POST /api/matches/{id}/points</w:t>
-            </w:r>
-            <w:r>
-              <w:t xml:space="preserve"> </w:t>
-            </w:r>
-            <w:r>
-              <w:t xml:space="preserve">(Match</w:t>
-            </w:r>
-            <w:r>
-              <w:t xml:space="preserve"> </w:t>
+              <w:t xml:space="preserve">Erfasst einen Punkt in einem laufenden Match (</w:t>
             </w:r>
             <w:r>
               <w:rPr>
@@ -10557,7 +10971,22 @@
               <w:t xml:space="preserve">IN_PROGRESS</w:t>
             </w:r>
             <w:r>
-              <w:t xml:space="preserve">). Pflicht:</w:t>
+              <w:t xml:space="preserve">). Pflicht ist nur</w:t>
+            </w:r>
+            <w:r>
+              <w:t xml:space="preserve"> </w:t>
+            </w:r>
+            <w:r>
+              <w:rPr>
+                <w:rStyle w:val="VerbatimChar"/>
+              </w:rPr>
+              <w:t xml:space="preserve">winner</w:t>
+            </w:r>
+            <w:r>
+              <w:t xml:space="preserve"> </w:t>
+            </w:r>
+            <w:r>
+              <w:t xml:space="preserve">(1/2). Optional: die typisierten Attribute</w:t>
             </w:r>
             <w:r>
               <w:t xml:space="preserve"> </w:t>
@@ -10596,7 +11025,7 @@
               <w:t xml:space="preserve"> </w:t>
             </w:r>
             <w:r>
-              <w:t xml:space="preserve">(typisierte Enums). Optional:</w:t>
+              <w:t xml:space="preserve">(ohne Attribut = „Quick-Point“),</w:t>
             </w:r>
             <w:r>
               <w:t xml:space="preserve"> </w:t>
@@ -10611,7 +11040,37 @@
               <w:t xml:space="preserve"> </w:t>
             </w:r>
             <w:r>
-              <w:t xml:space="preserve">(≤ 500). Erfolg → 201 mit aktualisiertem Spielstand; ungültige Enums/fehlende Pflichtfelder → 400.</w:t>
+              <w:t xml:space="preserve">(≤ 500) und</w:t>
+            </w:r>
+            <w:r>
+              <w:t xml:space="preserve"> </w:t>
+            </w:r>
+            <w:r>
+              <w:rPr>
+                <w:rStyle w:val="VerbatimChar"/>
+              </w:rPr>
+              <w:t xml:space="preserve">serveAttempt</w:t>
+            </w:r>
+            <w:r>
+              <w:t xml:space="preserve"> </w:t>
+            </w:r>
+            <w:r>
+              <w:t xml:space="preserve">(1/2). Erfolg → 201 mit aktualisiertem Spielstand; fehlendes</w:t>
+            </w:r>
+            <w:r>
+              <w:t xml:space="preserve"> </w:t>
+            </w:r>
+            <w:r>
+              <w:rPr>
+                <w:rStyle w:val="VerbatimChar"/>
+              </w:rPr>
+              <w:t xml:space="preserve">winner</w:t>
+            </w:r>
+            <w:r>
+              <w:t xml:space="preserve"> </w:t>
+            </w:r>
+            <w:r>
+              <w:t xml:space="preserve">oder ungültige Enum-Werte → 400.</w:t>
             </w:r>
           </w:p>
         </w:tc>
@@ -10724,13 +11183,7 @@
               <w:pStyle w:val="Compact"/>
             </w:pPr>
             <w:r>
-              <w:rPr>
-                <w:rStyle w:val="VerbatimChar"/>
-              </w:rPr>
-              <w:t xml:space="preserve">GET /api/statistics/head-to-head?player1=&amp;player2=</w:t>
-            </w:r>
-            <w:r>
-              <w:t xml:space="preserve">. Je Spieler: Aufschlag (First/Second Serve Won%, Aces, DF), Return (Return Points Won% 1./2., Break Points Won%, Return Games Won%), Rallye (Winners%, UE%), Match-Bilanz (Siege/Niederlagen, Satzbilanz). Bilanz nur aus abgeschlossenen Matches; unbekannte ID → 404.</w:t>
+              <w:t xml:space="preserve">Head-to-Head-Statistik zweier Spieler. Je Spieler: Aufschlag (First/Second Serve Won%, Aces, DF), Return (Return Points Won% 1./2., Break Points Won%, Return Games Won%), Rallye (Winners%, UE%), Match-Bilanz (Siege/Niederlagen, Satzbilanz). Bilanz nur aus abgeschlossenen Matches; unbekannte ID → 404.</w:t>
             </w:r>
           </w:p>
         </w:tc>
@@ -10780,7 +11233,7 @@
               <w:pStyle w:val="Compact"/>
             </w:pPr>
             <w:r>
-              <w:t xml:space="preserve">Keycloak-Federation „Mit Google anmelden”; erster Login legt automatisch ein TSaS-Konto mit verifizierter Google-E-Mail an. Gleiche Rechte wie lokal registriert.</w:t>
+              <w:t xml:space="preserve">Keycloak-Federation „Mit Google anmelden“; erster Login legt automatisch ein TSaS-Konto mit verifizierter Google-E-Mail an. Gleiche Rechte wie lokal registriert.</w:t>
             </w:r>
           </w:p>
         </w:tc>
@@ -10880,19 +11333,7 @@
               <w:pStyle w:val="Compact"/>
             </w:pPr>
             <w:r>
-              <w:rPr>
-                <w:rStyle w:val="VerbatimChar"/>
-              </w:rPr>
-              <w:t xml:space="preserve">POST /api/matches/{id}/analysis</w:t>
-            </w:r>
-            <w:r>
-              <w:t xml:space="preserve"> </w:t>
-            </w:r>
-            <w:r>
-              <w:t xml:space="preserve">(Match</w:t>
-            </w:r>
-            <w:r>
-              <w:t xml:space="preserve"> </w:t>
+              <w:t xml:space="preserve">KI-Postmortem für ein abgeschlossenes Match (</w:t>
             </w:r>
             <w:r>
               <w:rPr>
@@ -10928,22 +11369,7 @@
               <w:t xml:space="preserve"> </w:t>
             </w:r>
             <w:r>
-              <w:t xml:space="preserve">persistiert).</w:t>
-            </w:r>
-            <w:r>
-              <w:t xml:space="preserve"> </w:t>
-            </w:r>
-            <w:r>
-              <w:rPr>
-                <w:rStyle w:val="VerbatimChar"/>
-              </w:rPr>
-              <w:t xml:space="preserve">GET …/analysis</w:t>
-            </w:r>
-            <w:r>
-              <w:t xml:space="preserve"> </w:t>
-            </w:r>
-            <w:r>
-              <w:t xml:space="preserve">liest aus DB ohne LLM-Aufruf. Sprache Deutsch.</w:t>
+              <w:t xml:space="preserve">persistiert). Erneutes Lesen liefert die gespeicherte Analyse ohne LLM-Aufruf. Sprache Deutsch.</w:t>
             </w:r>
             <w:r>
               <w:t xml:space="preserve"> </w:t>
@@ -10959,16 +11385,7 @@
               <w:t xml:space="preserve"> </w:t>
             </w:r>
             <w:r>
-              <w:rPr>
-                <w:rStyle w:val="VerbatimChar"/>
-              </w:rPr>
-              <w:t xml:space="preserve">PATCH …/recommendations/{index}</w:t>
-            </w:r>
-            <w:r>
-              <w:t xml:space="preserve"> </w:t>
-            </w:r>
-            <w:r>
-              <w:t xml:space="preserve">setzt je Empfehlung Status</w:t>
+              <w:t xml:space="preserve">je Empfehlung Status</w:t>
             </w:r>
             <w:r>
               <w:t xml:space="preserve"> </w:t>
@@ -10983,7 +11400,7 @@
               <w:t xml:space="preserve"> </w:t>
             </w:r>
             <w:r>
-              <w:t xml:space="preserve">(+ Begründung ≤ 500); Codes 200/400/404/409. Neu-Generieren setzt den Review zurück.</w:t>
+              <w:t xml:space="preserve">setzbar (+ Begründung ≤ 500); Codes 200/400/404/409. Neu-Generieren setzt den Review zurück.</w:t>
             </w:r>
           </w:p>
         </w:tc>
@@ -11033,16 +11450,7 @@
               <w:pStyle w:val="Compact"/>
             </w:pPr>
             <w:r>
-              <w:rPr>
-                <w:rStyle w:val="VerbatimChar"/>
-              </w:rPr>
-              <w:t xml:space="preserve">PUT /api/players/{id}</w:t>
-            </w:r>
-            <w:r>
-              <w:t xml:space="preserve"> </w:t>
-            </w:r>
-            <w:r>
-              <w:t xml:space="preserve">(Felder wie FA-03). Erfolg → 200 mit Ressource (inkl.</w:t>
+              <w:t xml:space="preserve">Aktualisiert einen Spieler (Felder wie FA-03). Erfolg → 200 mit Ressource (inkl.</w:t>
             </w:r>
             <w:r>
               <w:t xml:space="preserve"> </w:t>
@@ -11116,31 +11524,7 @@
               <w:pStyle w:val="Compact"/>
             </w:pPr>
             <w:r>
-              <w:rPr>
-                <w:rStyle w:val="VerbatimChar"/>
-              </w:rPr>
-              <w:t xml:space="preserve">DELETE /api/players/{id}</w:t>
-            </w:r>
-            <w:r>
-              <w:t xml:space="preserve"> </w:t>
-            </w:r>
-            <w:r>
-              <w:t xml:space="preserve">→ 204; an Match beteiligt → 409 (Historieschutz), stattdessen</w:t>
-            </w:r>
-            <w:r>
-              <w:t xml:space="preserve"> </w:t>
-            </w:r>
-            <w:r>
-              <w:rPr>
-                <w:rStyle w:val="VerbatimChar"/>
-              </w:rPr>
-              <w:t xml:space="preserve">PATCH /…/deactivate</w:t>
-            </w:r>
-            <w:r>
-              <w:t xml:space="preserve"> </w:t>
-            </w:r>
-            <w:r>
-              <w:t xml:space="preserve">(Soft-Delete</w:t>
+              <w:t xml:space="preserve">Löscht einen Spieler → 204; ist er an einem Match beteiligt → 409 (Historieschutz), stattdessen Deaktivieren (Soft-Delete</w:t>
             </w:r>
             <w:r>
               <w:t xml:space="preserve"> </w:t>
@@ -11152,7 +11536,10 @@
               <w:t xml:space="preserve">active=false</w:t>
             </w:r>
             <w:r>
-              <w:t xml:space="preserve">, → 204). Unbekannt → 404.</w:t>
+              <w:t xml:space="preserve"> </w:t>
+            </w:r>
+            <w:r>
+              <w:t xml:space="preserve">→ 204). Unbekannt → 404.</w:t>
             </w:r>
           </w:p>
         </w:tc>
@@ -11202,31 +11589,7 @@
               <w:pStyle w:val="Compact"/>
             </w:pPr>
             <w:r>
-              <w:rPr>
-                <w:rStyle w:val="VerbatimChar"/>
-              </w:rPr>
-              <w:t xml:space="preserve">POST /…/end</w:t>
-            </w:r>
-            <w:r>
-              <w:t xml:space="preserve"> </w:t>
-            </w:r>
-            <w:r>
-              <w:t xml:space="preserve">finalisiert offenen Stand und leitet Sieger aus Sätzen ab (200).</w:t>
-            </w:r>
-            <w:r>
-              <w:t xml:space="preserve"> </w:t>
-            </w:r>
-            <w:r>
-              <w:rPr>
-                <w:rStyle w:val="VerbatimChar"/>
-              </w:rPr>
-              <w:t xml:space="preserve">POST /…/end/walkover</w:t>
-            </w:r>
-            <w:r>
-              <w:t xml:space="preserve"> </w:t>
-            </w:r>
-            <w:r>
-              <w:t xml:space="preserve">(Body</w:t>
+              <w:t xml:space="preserve">Beenden finalisiert den offenen Stand und leitet den Sieger aus den Sätzen ab (200). Walkover (Body</w:t>
             </w:r>
             <w:r>
               <w:t xml:space="preserve"> </w:t>
@@ -11238,7 +11601,7 @@
               <w:t xml:space="preserve">winner</w:t>
             </w:r>
             <w:r>
-              <w:t xml:space="preserve">) weist Sieg unabhängig vom Stand zu. Walkover auf abgeschlossenem Match → 409, unbekannt → 404, ungültiger</w:t>
+              <w:t xml:space="preserve">) weist den Sieg unabhängig vom Stand zu. Walkover auf abgeschlossenem Match → 409, unbekannt → 404, ungültiger</w:t>
             </w:r>
             <w:r>
               <w:t xml:space="preserve"> </w:t>
@@ -11303,13 +11666,7 @@
               <w:pStyle w:val="Compact"/>
             </w:pPr>
             <w:r>
-              <w:rPr>
-                <w:rStyle w:val="VerbatimChar"/>
-              </w:rPr>
-              <w:t xml:space="preserve">PUT /…/score</w:t>
-            </w:r>
-            <w:r>
-              <w:t xml:space="preserve">. Pflicht: Punkte/Games/Sätze (≥ 0),</w:t>
+              <w:t xml:space="preserve">Manuelle Spielstand-Korrektur. Pflicht: Punkte/Games/Sätze (≥ 0),</w:t>
             </w:r>
             <w:r>
               <w:t xml:space="preserve"> </w:t>
@@ -11461,16 +11818,7 @@
               <w:pStyle w:val="Compact"/>
             </w:pPr>
             <w:r>
-              <w:rPr>
-                <w:rStyle w:val="VerbatimChar"/>
-              </w:rPr>
-              <w:t xml:space="preserve">POST /…/serve/player1|2</w:t>
-            </w:r>
-            <w:r>
-              <w:t xml:space="preserve"> </w:t>
-            </w:r>
-            <w:r>
-              <w:t xml:space="preserve">(kein Body).</w:t>
+              <w:t xml:space="preserve">Setzt den Aufschläger (Spieler 1 oder 2, kein Body).</w:t>
             </w:r>
             <w:r>
               <w:t xml:space="preserve"> </w:t>
@@ -11535,13 +11883,7 @@
               <w:pStyle w:val="Compact"/>
             </w:pPr>
             <w:r>
-              <w:rPr>
-                <w:rStyle w:val="VerbatimChar"/>
-              </w:rPr>
-              <w:t xml:space="preserve">GET /api/matches/{id}/statistics</w:t>
-            </w:r>
-            <w:r>
-              <w:t xml:space="preserve">. Antwort:</w:t>
+              <w:t xml:space="preserve">Statistik eines einzelnen Matches. Antwort:</w:t>
             </w:r>
             <w:r>
               <w:t xml:space="preserve"> </w:t>
@@ -11618,16 +11960,7 @@
               <w:pStyle w:val="Compact"/>
             </w:pPr>
             <w:r>
-              <w:rPr>
-                <w:rStyle w:val="VerbatimChar"/>
-              </w:rPr>
-              <w:t xml:space="preserve">GET /api/dataexport/export</w:t>
-            </w:r>
-            <w:r>
-              <w:t xml:space="preserve"> </w:t>
-            </w:r>
-            <w:r>
-              <w:t xml:space="preserve">liefert JSON-Snapshot der eigenen Daten (</w:t>
+              <w:t xml:space="preserve">Liefert einen JSON-Snapshot der eigenen Daten (</w:t>
             </w:r>
             <w:r>
               <w:rPr>
@@ -11758,16 +12091,7 @@
               <w:pStyle w:val="Compact"/>
             </w:pPr>
             <w:r>
-              <w:rPr>
-                <w:rStyle w:val="VerbatimChar"/>
-              </w:rPr>
-              <w:t xml:space="preserve">DELETE /api/dataexport</w:t>
-            </w:r>
-            <w:r>
-              <w:t xml:space="preserve"> </w:t>
-            </w:r>
-            <w:r>
-              <w:t xml:space="preserve">löscht alle eigenen Aggregate in einer Transaktion (FK-Reihenfolge</w:t>
+              <w:t xml:space="preserve">Löscht alle eigenen Aggregate in einer Transaktion (FK-Reihenfolge</w:t>
             </w:r>
             <w:r>
               <w:t xml:space="preserve"> </w:t>
@@ -11829,13 +12153,7 @@
               <w:pStyle w:val="Compact"/>
             </w:pPr>
             <w:r>
-              <w:rPr>
-                <w:rStyle w:val="VerbatimChar"/>
-              </w:rPr>
-              <w:t xml:space="preserve">POST /api/players/{ownId}/opponent-preparation/{opponentId}</w:t>
-            </w:r>
-            <w:r>
-              <w:t xml:space="preserve">. Lädt beide Profile, aggregiert die Head-to-Head-Statistik (FA-08), LLM via Spring AI. Antwort: 4 Textfelder (</w:t>
+              <w:t xml:space="preserve">Head-to-Head-Vorbereitung gegen einen Gegner. Lädt beide Profile, aggregiert die Head-to-Head-Statistik (FA-08), LLM via Spring AI. Antwort: 4 Textfelder (</w:t>
             </w:r>
             <w:r>
               <w:rPr>
@@ -12012,25 +12330,7 @@
               <w:t xml:space="preserve"> </w:t>
             </w:r>
             <w:r>
-              <w:t xml:space="preserve">lädt beim Boot (</w:t>
-            </w:r>
-            <w:r>
-              <w:rPr>
-                <w:rStyle w:val="VerbatimChar"/>
-              </w:rPr>
-              <w:t xml:space="preserve">GET /api/user-preferences</w:t>
-            </w:r>
-            <w:r>
-              <w:t xml:space="preserve">), schreibt zurück (</w:t>
-            </w:r>
-            <w:r>
-              <w:rPr>
-                <w:rStyle w:val="VerbatimChar"/>
-              </w:rPr>
-              <w:t xml:space="preserve">PUT</w:t>
-            </w:r>
-            <w:r>
-              <w:t xml:space="preserve">), Fallback</w:t>
+              <w:t xml:space="preserve">lädt die Präferenz beim Boot, schreibt sie zurück, Fallback</w:t>
             </w:r>
             <w:r>
               <w:t xml:space="preserve"> </w:t>
@@ -12135,37 +12435,7 @@
               <w:t xml:space="preserve"> </w:t>
             </w:r>
             <w:r>
-              <w:t xml:space="preserve">Notiz pro Spieler/Match, entkoppelt vom Spielstand.</w:t>
-            </w:r>
-            <w:r>
-              <w:t xml:space="preserve"> </w:t>
-            </w:r>
-            <w:r>
-              <w:rPr>
-                <w:rStyle w:val="VerbatimChar"/>
-              </w:rPr>
-              <w:t xml:space="preserve">GET /api/matches/{id}/notes</w:t>
-            </w:r>
-            <w:r>
-              <w:t xml:space="preserve"> </w:t>
-            </w:r>
-            <w:r>
-              <w:t xml:space="preserve">(0–2 Notizen, owner-geprüft),</w:t>
-            </w:r>
-            <w:r>
-              <w:t xml:space="preserve"> </w:t>
-            </w:r>
-            <w:r>
-              <w:rPr>
-                <w:rStyle w:val="VerbatimChar"/>
-              </w:rPr>
-              <w:t xml:space="preserve">PUT /…/notes/{playerId}</w:t>
-            </w:r>
-            <w:r>
-              <w:t xml:space="preserve"> </w:t>
-            </w:r>
-            <w:r>
-              <w:t xml:space="preserve">(Upsert; leere Notiz löscht → 204).</w:t>
+              <w:t xml:space="preserve">Notiz pro Spieler/Match, entkoppelt vom Spielstand. Lesen liefert 0–2 Notizen (owner-geprüft); Schreiben ist ein Upsert (leere Notiz löscht → 204).</w:t>
             </w:r>
             <w:r>
               <w:t xml:space="preserve"> </w:t>
@@ -12224,8 +12494,8 @@
         </w:tc>
       </w:tr>
     </w:tbl>
-    <w:bookmarkEnd w:id="79"/>
-    <w:bookmarkStart w:id="80" w:name="nicht-funktionale-anforderungen-smart"/>
+    <w:bookmarkEnd w:id="81"/>
+    <w:bookmarkStart w:id="82" w:name="nicht-funktionale-anforderungen-smart"/>
     <w:p>
       <w:pPr>
         <w:pStyle w:val="Heading3"/>
@@ -12491,8 +12761,8 @@
         </w:tc>
       </w:tr>
     </w:tbl>
-    <w:bookmarkEnd w:id="80"/>
-    <w:bookmarkStart w:id="81" w:name="abnahmekriterien-je-kernfunktion"/>
+    <w:bookmarkEnd w:id="82"/>
+    <w:bookmarkStart w:id="83" w:name="abnahmekriterien-je-kernfunktion"/>
     <w:p>
       <w:pPr>
         <w:pStyle w:val="Heading3"/>
@@ -12532,22 +12802,22 @@
         <w:t xml:space="preserve">Erfüllt</w:t>
       </w:r>
       <w:r>
-        <w:t xml:space="preserve">, wenn der zugehörige automatisierte Test grün ist (Modul-Tests +</w:t>
-      </w:r>
-      <w:r>
-        <w:t xml:space="preserve"> </w:t>
-      </w:r>
-      <w:r>
-        <w:rPr>
-          <w:rStyle w:val="VerbatimChar"/>
-        </w:rPr>
-        <w:t xml:space="preserve">*IT</w:t>
-      </w:r>
-      <w:r>
-        <w:t xml:space="preserve"> </w:t>
-      </w:r>
-      <w:r>
-        <w:t xml:space="preserve">gegen echtes PostgreSQL, §8.5–8.7).</w:t>
+        <w:t xml:space="preserve">, wenn der zugehörige automatisierte Test grün ist (Modul-Tests plus</w:t>
+      </w:r>
+      <w:r>
+        <w:t xml:space="preserve"> </w:t>
+      </w:r>
+      <w:r>
+        <w:rPr>
+          <w:rStyle w:val="VerbatimChar"/>
+        </w:rPr>
+        <w:t xml:space="preserve">IntegrationTests</w:t>
+      </w:r>
+      <w:r>
+        <w:t xml:space="preserve"> </w:t>
+      </w:r>
+      <w:r>
+        <w:t xml:space="preserve">gegen eine PostgreSQL Instanz, §8.5–8.7).</w:t>
       </w:r>
     </w:p>
     <w:tbl>
@@ -13316,7 +13586,13 @@
         <w:t xml:space="preserve">Antwortzeit</w:t>
       </w:r>
       <w:r>
-        <w:t xml:space="preserve">-Kriterien (QZ-03/04/06, NFA-01) sind als Design-Ziele spezifiziert; ihr formaler Nachweis erfolgt über den NFA-01-Lasttest (noch durchzuführen, vgl. §12).</w:t>
+        <w:t xml:space="preserve">-Kriterien (QZ-03/04/06, NFA-01) sind als Design-Ziele spezifiziert.</w:t>
+      </w:r>
+      <w:r>
+        <w:t xml:space="preserve"> </w:t>
+      </w:r>
+      <w:r>
+        <w:t xml:space="preserve">Ihr formaler Nachweis erfolgt über den NFA-01-Lasttest (noch durchzuführen, vgl. §12).</w:t>
       </w:r>
     </w:p>
     <w:p>
@@ -13326,9 +13602,9 @@
         </w:pict>
       </w:r>
     </w:p>
-    <w:bookmarkEnd w:id="81"/>
-    <w:bookmarkEnd w:id="82"/>
-    <w:bookmarkStart w:id="88" w:name="datenmodell"/>
+    <w:bookmarkEnd w:id="83"/>
+    <w:bookmarkEnd w:id="84"/>
+    <w:bookmarkStart w:id="90" w:name="datenmodell"/>
     <w:p>
       <w:pPr>
         <w:pStyle w:val="Heading2"/>
@@ -13367,18 +13643,18 @@
           <wp:inline>
             <wp:extent cx="5334000" cy="4376115"/>
             <wp:effectExtent b="0" l="0" r="0" t="0"/>
-            <wp:docPr descr="TSaS – Datenmodell" title="" id="84" name="Picture"/>
+            <wp:docPr descr="TSaS – Datenmodell" title="" id="86" name="Picture"/>
             <a:graphic>
               <a:graphicData uri="http://schemas.openxmlformats.org/drawingml/2006/picture">
                 <pic:pic>
                   <pic:nvPicPr>
-                    <pic:cNvPr descr="Datenmodell.png" id="85" name="Picture"/>
+                    <pic:cNvPr descr="Datenmodell.png" id="87" name="Picture"/>
                     <pic:cNvPicPr>
                       <a:picLocks noChangeArrowheads="1" noChangeAspect="1"/>
                     </pic:cNvPicPr>
                   </pic:nvPicPr>
                   <pic:blipFill>
-                    <a:blip r:embed="rId83"/>
+                    <a:blip r:embed="rId85"/>
                     <a:stretch>
                       <a:fillRect/>
                     </a:stretch>
@@ -13431,7 +13707,7 @@
         </w:rPr>
         <w:t xml:space="preserve"> </w:t>
       </w:r>
-      <w:hyperlink r:id="rId86">
+      <w:hyperlink r:id="rId88">
         <w:r>
           <w:rPr>
             <w:rStyle w:val="VerbatimChar"/>
@@ -13530,7 +13806,7 @@
         <w:t xml:space="preserve">sind unten beschrieben.</w:t>
       </w:r>
     </w:p>
-    <w:bookmarkStart w:id="87" w:name="entitätenübersicht"/>
+    <w:bookmarkStart w:id="89" w:name="entitätenübersicht"/>
     <w:p>
       <w:pPr>
         <w:pStyle w:val="Heading3"/>
@@ -14437,9 +14713,9 @@
         </w:pict>
       </w:r>
     </w:p>
-    <w:bookmarkEnd w:id="87"/>
-    <w:bookmarkEnd w:id="88"/>
-    <w:bookmarkStart w:id="89" w:name="risiken-und-technische-schulden"/>
+    <w:bookmarkEnd w:id="89"/>
+    <w:bookmarkEnd w:id="90"/>
+    <w:bookmarkStart w:id="91" w:name="risiken-und-technische-schulden"/>
     <w:p>
       <w:pPr>
         <w:pStyle w:val="Heading2"/>
@@ -14899,6 +15175,69 @@
           </w:p>
         </w:tc>
       </w:tr>
+      <w:tr>
+        <w:tc>
+          <w:tcPr/>
+          <w:p>
+            <w:pPr>
+              <w:pStyle w:val="Compact"/>
+            </w:pPr>
+            <w:r>
+              <w:t xml:space="preserve">R-08</w:t>
+            </w:r>
+          </w:p>
+        </w:tc>
+        <w:tc>
+          <w:tcPr/>
+          <w:p>
+            <w:pPr>
+              <w:pStyle w:val="Compact"/>
+            </w:pPr>
+            <w:r>
+              <w:t xml:space="preserve">Niedrig</w:t>
+            </w:r>
+          </w:p>
+        </w:tc>
+        <w:tc>
+          <w:tcPr/>
+          <w:p>
+            <w:pPr>
+              <w:pStyle w:val="Compact"/>
+            </w:pPr>
+            <w:r>
+              <w:rPr>
+                <w:b/>
+                <w:bCs/>
+              </w:rPr>
+              <w:t xml:space="preserve">Lasttest ausstehend</w:t>
+            </w:r>
+          </w:p>
+        </w:tc>
+        <w:tc>
+          <w:tcPr/>
+          <w:p>
+            <w:pPr>
+              <w:pStyle w:val="Compact"/>
+            </w:pPr>
+            <w:r>
+              <w:t xml:space="preserve">Antwortzeit-/Skalierbarkeitsziele (QZ-03/04/06, NFA-01) sind spezifiziert, aber noch nicht formal per Lasttest nachgewiesen. Nachweis via k6/JMeter (100 Nutzer, p95: Write ≤ 250 ms, Read ≤ 500 ms, Degradation ≤ 20 %). Offen als Ticket</w:t>
+            </w:r>
+            <w:r>
+              <w:t xml:space="preserve"> </w:t>
+            </w:r>
+            <w:r>
+              <w:rPr>
+                <w:b/>
+                <w:bCs/>
+              </w:rPr>
+              <w:t xml:space="preserve">TEN-69</w:t>
+            </w:r>
+            <w:r>
+              <w:t xml:space="preserve">.</w:t>
+            </w:r>
+          </w:p>
+        </w:tc>
+      </w:tr>
     </w:tbl>
     <w:p>
       <w:r>
@@ -14907,8 +15246,8 @@
         </w:pict>
       </w:r>
     </w:p>
-    <w:bookmarkEnd w:id="89"/>
-    <w:bookmarkStart w:id="93" w:name="ki-werkzeuge-im-projekt"/>
+    <w:bookmarkEnd w:id="91"/>
+    <w:bookmarkStart w:id="95" w:name="ki-werkzeuge-im-projekt"/>
     <w:p>
       <w:pPr>
         <w:pStyle w:val="Heading2"/>
@@ -14917,7 +15256,7 @@
         <w:t xml:space="preserve">13. KI-Werkzeuge im Projekt</w:t>
       </w:r>
     </w:p>
-    <w:bookmarkStart w:id="90" w:name="eingesetzte-werkzeuge"/>
+    <w:bookmarkStart w:id="92" w:name="eingesetzte-werkzeuge"/>
     <w:p>
       <w:pPr>
         <w:pStyle w:val="Heading3"/>
@@ -15170,8 +15509,8 @@
         </w:tc>
       </w:tr>
     </w:tbl>
-    <w:bookmarkEnd w:id="90"/>
-    <w:bookmarkStart w:id="91" w:name="einsatz-pro-phase"/>
+    <w:bookmarkEnd w:id="92"/>
+    <w:bookmarkStart w:id="93" w:name="einsatz-pro-phase"/>
     <w:p>
       <w:pPr>
         <w:pStyle w:val="Heading3"/>
@@ -15185,7 +15524,7 @@
         <w:pStyle w:val="Compact"/>
         <w:numPr>
           <w:ilvl w:val="0"/>
-          <w:numId w:val="1009"/>
+          <w:numId w:val="1011"/>
         </w:numPr>
       </w:pPr>
       <w:r>
@@ -15199,7 +15538,19 @@
         <w:t xml:space="preserve"> </w:t>
       </w:r>
       <w:r>
-        <w:t xml:space="preserve">Jede grössere Änderung folgt Brainstorming → Spec → Plan → Implementierung mit TDD. Spec-/Plan-Dokumente unter</w:t>
+        <w:t xml:space="preserve">Jede grössere Änderung folgt der Reihenfolge</w:t>
+      </w:r>
+      <w:r>
+        <w:t xml:space="preserve"> </w:t>
+      </w:r>
+      <w:r>
+        <w:rPr>
+          <w:rStyle w:val="VerbatimChar"/>
+        </w:rPr>
+        <w:t xml:space="preserve">Brainstorming → Spec → Plan → Implementierung mit TDD</w:t>
+      </w:r>
+      <w:r>
+        <w:t xml:space="preserve">. Spec-/Plan-Dokumente unter</w:t>
       </w:r>
       <w:r>
         <w:t xml:space="preserve"> </w:t>
@@ -15229,7 +15580,7 @@
         <w:t xml:space="preserve"> </w:t>
       </w:r>
       <w:r>
-        <w:t xml:space="preserve">(je mit TEN-Ticket im Namen), z. B. AI-Postmortem (FA-11), Bean-Validation (TEN-60), Owner-Binding/RBAC (TEN-55).</w:t>
+        <w:t xml:space="preserve">(je mit dem TEN-Ticket im Namen), z. B. AI-Postmortem (FA-11), Bean-Validation (TEN-60), Owner-Binding/RBAC (TEN-55).</w:t>
       </w:r>
     </w:p>
     <w:p>
@@ -15237,7 +15588,7 @@
         <w:pStyle w:val="Compact"/>
         <w:numPr>
           <w:ilvl w:val="0"/>
-          <w:numId w:val="1009"/>
+          <w:numId w:val="1011"/>
         </w:numPr>
       </w:pPr>
       <w:r>
@@ -15334,7 +15685,7 @@
         <w:pStyle w:val="Compact"/>
         <w:numPr>
           <w:ilvl w:val="0"/>
-          <w:numId w:val="1009"/>
+          <w:numId w:val="1011"/>
         </w:numPr>
       </w:pPr>
       <w:r>
@@ -15371,7 +15722,7 @@
         <w:pStyle w:val="Compact"/>
         <w:numPr>
           <w:ilvl w:val="0"/>
-          <w:numId w:val="1009"/>
+          <w:numId w:val="1011"/>
         </w:numPr>
       </w:pPr>
       <w:r>
@@ -15388,8 +15739,8 @@
         <w:t xml:space="preserve">Punktuelle Aufgaben (Spring AI 2.x Boot-4, JaCoCo-Aggregation, JWT-Mock, Testcontainers + Podman) via Web-Recherche-Subagenten und Context7; Ergebnisse flossen in ADR-10 (R-07) und ADR-11 (Coverage-Schwellen).</w:t>
       </w:r>
     </w:p>
-    <w:bookmarkEnd w:id="91"/>
-    <w:bookmarkStart w:id="92" w:name="eigenständigkeit"/>
+    <w:bookmarkEnd w:id="93"/>
+    <w:bookmarkStart w:id="94" w:name="eigenständigkeit"/>
     <w:p>
       <w:pPr>
         <w:pStyle w:val="Heading3"/>
@@ -15412,7 +15763,13 @@
         <w:t xml:space="preserve">doc/sad/TSaS_Eigenstaendigkeitserklaerung.md</w:t>
       </w:r>
       <w:r>
-        <w:t xml:space="preserve">) bestätigt, dass alle KI-Vorschläge vor Übernahme geprüft, angenommen oder zurückgewiesen wurden. Die drei wichtigsten bewusst</w:t>
+        <w:t xml:space="preserve">) bestätigt, dass alle KI-Vorschläge vor Übernahme geprüft,</w:t>
+      </w:r>
+      <w:r>
+        <w:t xml:space="preserve"> </w:t>
+      </w:r>
+      <w:r>
+        <w:t xml:space="preserve">angenommen oder zurückgewiesen wurden. Die drei wichtigsten bewusst</w:t>
       </w:r>
       <w:r>
         <w:t xml:space="preserve"> </w:t>
@@ -15438,9 +15795,9 @@
         </w:pict>
       </w:r>
     </w:p>
-    <w:bookmarkEnd w:id="92"/>
-    <w:bookmarkEnd w:id="93"/>
-    <w:bookmarkStart w:id="99" w:name="reflexion-und-fazit"/>
+    <w:bookmarkEnd w:id="94"/>
+    <w:bookmarkEnd w:id="95"/>
+    <w:bookmarkStart w:id="106" w:name="reflexion-und-fazit"/>
     <w:p>
       <w:pPr>
         <w:pStyle w:val="Heading2"/>
@@ -15452,6 +15809,20 @@
     <w:p>
       <w:pPr>
         <w:pStyle w:val="FirstParagraph"/>
+      </w:pPr>
+      <w:r>
+        <w:t xml:space="preserve">Die Anwendung entstand auf Basis eines rund zu 70 % vorab erstellten SAD und wurde danach schrittweise mit dem Claude CLI entwickelt — anfangs rein über Prompts,</w:t>
+      </w:r>
+      <w:r>
+        <w:t xml:space="preserve"> </w:t>
+      </w:r>
+      <w:r>
+        <w:t xml:space="preserve">später über Linear-Tickets. Aus dieser Arbeitsweise ergeben sich die folgenden Reflexionen.</w:t>
+      </w:r>
+    </w:p>
+    <w:p>
+      <w:pPr>
+        <w:pStyle w:val="BodyText"/>
       </w:pPr>
       <w:r>
         <w:t xml:space="preserve">Drei Bereiche wurden bewusst</w:t>
@@ -15483,7 +15854,13 @@
         <w:t xml:space="preserve"> </w:t>
       </w:r>
       <w:r>
-        <w:t xml:space="preserve">war wie beim übrigen Code KI-unterstützt. Delegiert wurde nicht die</w:t>
+        <w:t xml:space="preserve">war wie</w:t>
+      </w:r>
+      <w:r>
+        <w:t xml:space="preserve"> </w:t>
+      </w:r>
+      <w:r>
+        <w:t xml:space="preserve">beim übrigen Code KI-unterstützt. Delegiert wurde nicht die</w:t>
       </w:r>
       <w:r>
         <w:t xml:space="preserve"> </w:t>
@@ -15499,7 +15876,7 @@
         <w:t xml:space="preserve">: hier blieb die inhaltliche Verantwortung durchgängig menschlich, KI-Vorschläge wurden geprüft und wo nötig verworfen (konsistent mit §13.3).</w:t>
       </w:r>
     </w:p>
-    <w:bookmarkStart w:id="94" w:name="veto-1-security-konfiguration"/>
+    <w:bookmarkStart w:id="96" w:name="veto-1-security-konfiguration"/>
     <w:p>
       <w:pPr>
         <w:pStyle w:val="Heading3"/>
@@ -15639,8 +16016,8 @@
         <w:t xml:space="preserve">formal „korrekt” ist.</w:t>
       </w:r>
     </w:p>
-    <w:bookmarkEnd w:id="94"/>
-    <w:bookmarkStart w:id="95" w:name="veto-2-architekturentscheidungen-adrs"/>
+    <w:bookmarkEnd w:id="96"/>
+    <w:bookmarkStart w:id="97" w:name="veto-2-architekturentscheidungen-adrs"/>
     <w:p>
       <w:pPr>
         <w:pStyle w:val="Heading3"/>
@@ -15780,8 +16157,8 @@
         <w:t xml:space="preserve">Die Begründungen enthalten konkrete, nicht aus dem Code ableitbare Kontextfaktoren; ADR-12/13 sind explizite Korrekturen früherer Bausteinskizzen.</w:t>
       </w:r>
     </w:p>
-    <w:bookmarkEnd w:id="95"/>
-    <w:bookmarkStart w:id="96" w:name="veto-3-tennis-domänenregeln-im-scoring"/>
+    <w:bookmarkEnd w:id="97"/>
+    <w:bookmarkStart w:id="98" w:name="veto-3-tennis-domänenregeln-im-scoring"/>
     <w:p>
       <w:pPr>
         <w:pStyle w:val="Heading3"/>
@@ -15864,8 +16241,8 @@
         <w:t xml:space="preserve">-Tests, grösstenteils Edge-Case-Tests; die hohe Branch-Coverage (74,2 %) ist direktes Resultat dieser Manuell-Verifikation.</w:t>
       </w:r>
     </w:p>
-    <w:bookmarkEnd w:id="96"/>
-    <w:bookmarkStart w:id="97" w:name="human-in-the-loop"/>
+    <w:bookmarkEnd w:id="98"/>
+    <w:bookmarkStart w:id="99" w:name="human-in-the-loop"/>
     <w:p>
       <w:pPr>
         <w:pStyle w:val="Heading3"/>
@@ -15900,8 +16277,8 @@
         <w:t xml:space="preserve">) und im UI verankert.</w:t>
       </w:r>
     </w:p>
-    <w:bookmarkEnd w:id="97"/>
-    <w:bookmarkStart w:id="98" w:name="übertrag-auf-die-künftige-arbeitsweise"/>
+    <w:bookmarkEnd w:id="99"/>
+    <w:bookmarkStart w:id="100" w:name="übertrag-auf-die-künftige-arbeitsweise"/>
     <w:p>
       <w:pPr>
         <w:pStyle w:val="Heading3"/>
@@ -15915,7 +16292,7 @@
         <w:pStyle w:val="Compact"/>
         <w:numPr>
           <w:ilvl w:val="0"/>
-          <w:numId w:val="1010"/>
+          <w:numId w:val="1012"/>
         </w:numPr>
       </w:pPr>
       <w:r>
@@ -15937,7 +16314,7 @@
         <w:pStyle w:val="Compact"/>
         <w:numPr>
           <w:ilvl w:val="0"/>
-          <w:numId w:val="1010"/>
+          <w:numId w:val="1012"/>
         </w:numPr>
       </w:pPr>
       <w:r>
@@ -15959,7 +16336,7 @@
         <w:pStyle w:val="Compact"/>
         <w:numPr>
           <w:ilvl w:val="0"/>
-          <w:numId w:val="1010"/>
+          <w:numId w:val="1012"/>
         </w:numPr>
       </w:pPr>
       <w:r>
@@ -15981,7 +16358,7 @@
         <w:pStyle w:val="Compact"/>
         <w:numPr>
           <w:ilvl w:val="0"/>
-          <w:numId w:val="1010"/>
+          <w:numId w:val="1012"/>
         </w:numPr>
       </w:pPr>
       <w:r>
@@ -15996,6 +16373,546 @@
       </w:r>
       <w:r>
         <w:t xml:space="preserve">— dedizierte Test-Suites; das 70-%-Branch-Gate hält die Disziplin durch.</w:t>
+      </w:r>
+    </w:p>
+    <w:bookmarkEnd w:id="100"/>
+    <w:bookmarkStart w:id="101" w:name="beobachtungen-aus-der-praxis"/>
+    <w:p>
+      <w:pPr>
+        <w:pStyle w:val="Heading3"/>
+      </w:pPr>
+      <w:r>
+        <w:t xml:space="preserve">14.6 Beobachtungen aus der Praxis</w:t>
+      </w:r>
+    </w:p>
+    <w:p>
+      <w:pPr>
+        <w:pStyle w:val="FirstParagraph"/>
+      </w:pPr>
+      <w:r>
+        <w:t xml:space="preserve">Über das Projekt hinweg haben sich mehrere Muster wiederholt:</w:t>
+      </w:r>
+    </w:p>
+    <w:p>
+      <w:pPr>
+        <w:pStyle w:val="Compact"/>
+        <w:numPr>
+          <w:ilvl w:val="0"/>
+          <w:numId w:val="1013"/>
+        </w:numPr>
+      </w:pPr>
+      <w:r>
+        <w:rPr>
+          <w:b/>
+          <w:bCs/>
+        </w:rPr>
+        <w:t xml:space="preserve">Präzision zahlt sich aus.</w:t>
+      </w:r>
+      <w:r>
+        <w:t xml:space="preserve"> </w:t>
+      </w:r>
+      <w:r>
+        <w:t xml:space="preserve">Je genauer der Prompt, desto besser das Ergebnis. Teils muss man hartnäckig bleiben, bis die KI umsetzt, was man will — und was man glaubte, ihr klar gesagt zu haben.</w:t>
+      </w:r>
+    </w:p>
+    <w:p>
+      <w:pPr>
+        <w:pStyle w:val="Compact"/>
+        <w:numPr>
+          <w:ilvl w:val="0"/>
+          <w:numId w:val="1013"/>
+        </w:numPr>
+      </w:pPr>
+      <w:r>
+        <w:rPr>
+          <w:b/>
+          <w:bCs/>
+        </w:rPr>
+        <w:t xml:space="preserve">KI als Sparring-Partner.</w:t>
+      </w:r>
+      <w:r>
+        <w:t xml:space="preserve"> </w:t>
+      </w:r>
+      <w:r>
+        <w:t xml:space="preserve">Für mich als Backend-Entwickler mit geringem Angular-Wissen war die KI ein wertvoller Gesprächspartner, um Frontend-Vorstellungen zu klären und Stil-Alternativen abzuwägen.</w:t>
+      </w:r>
+    </w:p>
+    <w:p>
+      <w:pPr>
+        <w:pStyle w:val="Compact"/>
+        <w:numPr>
+          <w:ilvl w:val="0"/>
+          <w:numId w:val="1013"/>
+        </w:numPr>
+      </w:pPr>
+      <w:r>
+        <w:rPr>
+          <w:b/>
+          <w:bCs/>
+        </w:rPr>
+        <w:t xml:space="preserve">Solide Vorarbeit ist entscheidend.</w:t>
+      </w:r>
+      <w:r>
+        <w:t xml:space="preserve"> </w:t>
+      </w:r>
+      <w:r>
+        <w:t xml:space="preserve">Nachträgliche Architektur-Refactorings dauern lange und kosten viele Tokens. Die tragenden Entscheidungen (Backend-, Frontend-, Systemarchitektur) müssen früh in einem Dokument festgehalten sein. Das</w:t>
+      </w:r>
+      <w:r>
+        <w:t xml:space="preserve"> </w:t>
+      </w:r>
+      <w:r>
+        <w:rPr>
+          <w:rStyle w:val="VerbatimChar"/>
+        </w:rPr>
+        <w:t xml:space="preserve">CLAUDE.md</w:t>
+      </w:r>
+      <w:r>
+        <w:t xml:space="preserve"> </w:t>
+      </w:r>
+      <w:r>
+        <w:t xml:space="preserve">wird damit zum zentralen Steuerungsinstrument des Architekten — inklusive einer Definition of Done —, damit ein ganzes Team gleichwertigen Code erzeugt.</w:t>
+      </w:r>
+    </w:p>
+    <w:p>
+      <w:pPr>
+        <w:pStyle w:val="Compact"/>
+        <w:numPr>
+          <w:ilvl w:val="0"/>
+          <w:numId w:val="1013"/>
+        </w:numPr>
+      </w:pPr>
+      <w:r>
+        <w:rPr>
+          <w:b/>
+          <w:bCs/>
+        </w:rPr>
+        <w:t xml:space="preserve">Tickets brauchen mehr Sorgfalt.</w:t>
+      </w:r>
+      <w:r>
+        <w:t xml:space="preserve"> </w:t>
+      </w:r>
+      <w:r>
+        <w:t xml:space="preserve">Tasks/Tickets sollten aus einem Template entstehen und deutlich sorgfältiger formuliert sein als bei rein menschlicher Bearbeitung; die KI kann beim Erstellen helfen.</w:t>
+      </w:r>
+    </w:p>
+    <w:p>
+      <w:pPr>
+        <w:pStyle w:val="Compact"/>
+        <w:numPr>
+          <w:ilvl w:val="0"/>
+          <w:numId w:val="1013"/>
+        </w:numPr>
+      </w:pPr>
+      <w:r>
+        <w:rPr>
+          <w:b/>
+          <w:bCs/>
+        </w:rPr>
+        <w:t xml:space="preserve">Neue Architektenaufgaben.</w:t>
+      </w:r>
+      <w:r>
+        <w:t xml:space="preserve"> </w:t>
+      </w:r>
+      <w:r>
+        <w:t xml:space="preserve">Neben den klassischen FA/NFA gehört künftig das Setzen von „Pflöcken” (Rahmenbedingungen/Guardrails für die KI) dazu — sowie die laufende Überwachung, dass diese Richtlinien eingehalten werden. Dafür kann ein zweites LLM unterstützen (vgl. adversariales Review, §14.5).</w:t>
+      </w:r>
+    </w:p>
+    <w:p>
+      <w:pPr>
+        <w:pStyle w:val="Compact"/>
+        <w:numPr>
+          <w:ilvl w:val="0"/>
+          <w:numId w:val="1013"/>
+        </w:numPr>
+      </w:pPr>
+      <w:r>
+        <w:rPr>
+          <w:b/>
+          <w:bCs/>
+        </w:rPr>
+        <w:t xml:space="preserve">Review-Disziplin unter Druck.</w:t>
+      </w:r>
+      <w:r>
+        <w:t xml:space="preserve"> </w:t>
+      </w:r>
+      <w:r>
+        <w:t xml:space="preserve">Bei sehr grossen Diffs (vor allem im Frontend) stiess das manuelle Review an seine Grenzen — die Tragweite war allein im Review kaum noch erfassbar. Konsequenz: Issues müssen kleiner werden und automatisierte Tests gewinnen weiter an Bedeutung, sonst geht der Überblick verloren.</w:t>
+      </w:r>
+    </w:p>
+    <w:bookmarkEnd w:id="101"/>
+    <w:bookmarkStart w:id="102" w:name="X9bc5b362477da63c6898f314fee5bd3535fe289"/>
+    <w:p>
+      <w:pPr>
+        <w:pStyle w:val="Heading3"/>
+      </w:pPr>
+      <w:r>
+        <w:t xml:space="preserve">14.7 Konkrete Beispiele — akzeptiert und korrigiert</w:t>
+      </w:r>
+    </w:p>
+    <w:p>
+      <w:pPr>
+        <w:pStyle w:val="FirstParagraph"/>
+      </w:pPr>
+      <w:r>
+        <w:t xml:space="preserve">Ergänzend zu den Vetos (§14.1–14.3) zeigen zwei belegte Situationen den Umgang mit KI-Vorschlägen:</w:t>
+      </w:r>
+    </w:p>
+    <w:p>
+      <w:pPr>
+        <w:pStyle w:val="Compact"/>
+        <w:numPr>
+          <w:ilvl w:val="0"/>
+          <w:numId w:val="1014"/>
+        </w:numPr>
+      </w:pPr>
+      <w:r>
+        <w:rPr>
+          <w:b/>
+          <w:bCs/>
+        </w:rPr>
+        <w:t xml:space="preserve">Akzeptiert — strukturierter LLM-Output statt selbstgebautem Parser.</w:t>
+      </w:r>
+      <w:r>
+        <w:t xml:space="preserve"> </w:t>
+      </w:r>
+      <w:r>
+        <w:t xml:space="preserve">Für die KI-Match-Analyse schlug die KI vor, die LLM-Antwort nicht als Text zu parsen, sondern über Spring AI direkt in ein typisiertes Java-Objekt zu mappen (</w:t>
+      </w:r>
+      <w:r>
+        <w:rPr>
+          <w:rStyle w:val="VerbatimChar"/>
+        </w:rPr>
+        <w:t xml:space="preserve">ChatClient….entity(MatchAnalysisResult.class)</w:t>
+      </w:r>
+      <w:r>
+        <w:t xml:space="preserve">). Der Vorschlag wurde unverändert übernommen: Er macht den fragilen String-Parser überflüssig und erzwingt die Antwortstruktur (begründet in ADR-10). → Commit</w:t>
+      </w:r>
+      <w:r>
+        <w:t xml:space="preserve"> </w:t>
+      </w:r>
+      <w:r>
+        <w:rPr>
+          <w:rStyle w:val="VerbatimChar"/>
+        </w:rPr>
+        <w:t xml:space="preserve">e02ee0b</w:t>
+      </w:r>
+      <w:r>
+        <w:t xml:space="preserve"> </w:t>
+      </w:r>
+      <w:r>
+        <w:t xml:space="preserve">(</w:t>
+      </w:r>
+      <w:r>
+        <w:rPr>
+          <w:rStyle w:val="VerbatimChar"/>
+        </w:rPr>
+        <w:t xml:space="preserve">OpenAiLlmAdapter.java</w:t>
+      </w:r>
+      <w:r>
+        <w:t xml:space="preserve">).</w:t>
+      </w:r>
+    </w:p>
+    <w:p>
+      <w:pPr>
+        <w:pStyle w:val="Compact"/>
+        <w:numPr>
+          <w:ilvl w:val="0"/>
+          <w:numId w:val="1014"/>
+        </w:numPr>
+      </w:pPr>
+      <w:r>
+        <w:rPr>
+          <w:b/>
+          <w:bCs/>
+        </w:rPr>
+        <w:t xml:space="preserve">Korrigiert — NullPointer in der Statistik.</w:t>
+      </w:r>
+      <w:r>
+        <w:t xml:space="preserve"> </w:t>
+      </w:r>
+      <w:r>
+        <w:t xml:space="preserve">Der generierte</w:t>
+      </w:r>
+      <w:r>
+        <w:t xml:space="preserve"> </w:t>
+      </w:r>
+      <w:r>
+        <w:rPr>
+          <w:rStyle w:val="VerbatimChar"/>
+        </w:rPr>
+        <w:t xml:space="preserve">MatchStatisticsService</w:t>
+      </w:r>
+      <w:r>
+        <w:t xml:space="preserve"> </w:t>
+      </w:r>
+      <w:r>
+        <w:t xml:space="preserve">griff beim Iterieren über alle Punkte auf</w:t>
+      </w:r>
+      <w:r>
+        <w:t xml:space="preserve"> </w:t>
+      </w:r>
+      <w:r>
+        <w:rPr>
+          <w:rStyle w:val="VerbatimChar"/>
+        </w:rPr>
+        <w:t xml:space="preserve">pointType</w:t>
+      </w:r>
+      <w:r>
+        <w:t xml:space="preserve"> </w:t>
+      </w:r>
+      <w:r>
+        <w:t xml:space="preserve">zu. Die später eingeführten „Quick-Points” (schnelle Punkterfassung ohne Attribut, vgl. FA-06) haben aber keinen</w:t>
+      </w:r>
+      <w:r>
+        <w:t xml:space="preserve"> </w:t>
+      </w:r>
+      <w:r>
+        <w:rPr>
+          <w:rStyle w:val="VerbatimChar"/>
+        </w:rPr>
+        <w:t xml:space="preserve">pointType</w:t>
+      </w:r>
+      <w:r>
+        <w:t xml:space="preserve"> </w:t>
+      </w:r>
+      <w:r>
+        <w:t xml:space="preserve">→ NullPointerException. Korrektur: Guard-Klausel (solche Punkte zählen nur zum Stand und überspringen die Attribution) plus Regressionstest. → Commit</w:t>
+      </w:r>
+      <w:r>
+        <w:t xml:space="preserve"> </w:t>
+      </w:r>
+      <w:r>
+        <w:rPr>
+          <w:rStyle w:val="VerbatimChar"/>
+        </w:rPr>
+        <w:t xml:space="preserve">9e35106</w:t>
+      </w:r>
+      <w:r>
+        <w:t xml:space="preserve"> </w:t>
+      </w:r>
+      <w:r>
+        <w:t xml:space="preserve">(+6 Zeilen Service, +17 Zeilen Test).</w:t>
+      </w:r>
+    </w:p>
+    <w:bookmarkEnd w:id="102"/>
+    <w:bookmarkStart w:id="103" w:name="X228c99141e3591c9d8a0034df91e972dbbedc13"/>
+    <w:p>
+      <w:pPr>
+        <w:pStyle w:val="Heading3"/>
+      </w:pPr>
+      <w:r>
+        <w:t xml:space="preserve">14.8 Geeignete und kritische Projekte für den KI-Einsatz</w:t>
+      </w:r>
+    </w:p>
+    <w:p>
+      <w:pPr>
+        <w:pStyle w:val="FirstParagraph"/>
+      </w:pPr>
+      <w:r>
+        <w:t xml:space="preserve">KI ist ein mächtiges Werkzeug für Implementierung und Architekturfindung, hat aber klare Grenzen. Besonders wirksam ist sie bei Projekten mit etabliertem,</w:t>
+      </w:r>
+      <w:r>
+        <w:t xml:space="preserve"> </w:t>
+      </w:r>
+      <w:r>
+        <w:t xml:space="preserve">gut dokumentiertem Tech-Stack und klar umrissenen, in kleine Tickets zerlegten Aufgaben. Zurückhaltender wäre ich in zwei Fällen:</w:t>
+      </w:r>
+    </w:p>
+    <w:p>
+      <w:pPr>
+        <w:pStyle w:val="Compact"/>
+        <w:numPr>
+          <w:ilvl w:val="0"/>
+          <w:numId w:val="1015"/>
+        </w:numPr>
+      </w:pPr>
+      <w:r>
+        <w:rPr>
+          <w:b/>
+          <w:bCs/>
+        </w:rPr>
+        <w:t xml:space="preserve">Reguliertes Umfeld.</w:t>
+      </w:r>
+      <w:r>
+        <w:t xml:space="preserve"> </w:t>
+      </w:r>
+      <w:r>
+        <w:t xml:space="preserve">In der höchsten Kritikalitätsstufe („Fehlverhalten gefährdet Menschenleben” — Medizintechnik, Maschinensteuerungen) würde ich KI nur mit sehr strikten Guards und lückenloser menschlicher Verifikation einsetzen.</w:t>
+      </w:r>
+    </w:p>
+    <w:p>
+      <w:pPr>
+        <w:pStyle w:val="Compact"/>
+        <w:numPr>
+          <w:ilvl w:val="0"/>
+          <w:numId w:val="1015"/>
+        </w:numPr>
+      </w:pPr>
+      <w:r>
+        <w:rPr>
+          <w:b/>
+          <w:bCs/>
+        </w:rPr>
+        <w:t xml:space="preserve">Exotischer Tech-Stack oder brandneue Versionen.</w:t>
+      </w:r>
+      <w:r>
+        <w:t xml:space="preserve"> </w:t>
+      </w:r>
+      <w:r>
+        <w:t xml:space="preserve">Direkt nach dem Release von Spring Boot 4 kam die KI mit der neuen Version noch nicht zurecht und wich auf die ältere aus. Erst Wochen später gelang die Migration. Bei wenig verbreiteten Frameworks fehlt der KI schlicht die Datenbasis. Hier ist mehr manuelle Führung nötig.</w:t>
+      </w:r>
+    </w:p>
+    <w:bookmarkEnd w:id="103"/>
+    <w:bookmarkStart w:id="104" w:name="gefahren-und-offene-fragen"/>
+    <w:p>
+      <w:pPr>
+        <w:pStyle w:val="Heading3"/>
+      </w:pPr>
+      <w:r>
+        <w:t xml:space="preserve">14.9 Gefahren und offene Fragen</w:t>
+      </w:r>
+    </w:p>
+    <w:p>
+      <w:pPr>
+        <w:pStyle w:val="Compact"/>
+        <w:numPr>
+          <w:ilvl w:val="0"/>
+          <w:numId w:val="1016"/>
+        </w:numPr>
+      </w:pPr>
+      <w:r>
+        <w:rPr>
+          <w:b/>
+          <w:bCs/>
+        </w:rPr>
+        <w:t xml:space="preserve">Kompetenzaufbau.</w:t>
+      </w:r>
+      <w:r>
+        <w:t xml:space="preserve"> </w:t>
+      </w:r>
+      <w:r>
+        <w:t xml:space="preserve">Unerfahrene Entwickler setzen Tickets mit KI schneller um, aber nicht zwangsläufig besser da sie noch nicht über das Wissen verfügen was gut oder weniger gut ist. Dir Frage für die Zukunft lautet</w:t>
+      </w:r>
+      <w:r>
+        <w:t xml:space="preserve"> </w:t>
+      </w:r>
+      <w:r>
+        <w:t xml:space="preserve">“Wie bilden wir Juniors zu Seniors aus, wenn weniger Code selbst geschrieben wird?”</w:t>
+      </w:r>
+      <w:r>
+        <w:t xml:space="preserve"> </w:t>
+      </w:r>
+      <w:r>
+        <w:t xml:space="preserve">Müssen sie künftig nur noch Code lesen können oder genügt das alleinige Verständnis für einen guten Aufbau, für gute Tickets und Architektur-Trade-offs zu entscheiden?</w:t>
+      </w:r>
+    </w:p>
+    <w:p>
+      <w:pPr>
+        <w:pStyle w:val="Compact"/>
+        <w:numPr>
+          <w:ilvl w:val="0"/>
+          <w:numId w:val="1016"/>
+        </w:numPr>
+      </w:pPr>
+      <w:r>
+        <w:rPr>
+          <w:b/>
+          <w:bCs/>
+        </w:rPr>
+        <w:t xml:space="preserve">Kontrollverlust.</w:t>
+      </w:r>
+      <w:r>
+        <w:t xml:space="preserve"> </w:t>
+      </w:r>
+      <w:r>
+        <w:t xml:space="preserve">Das Gefühl „das ist mein Code” schwindet. Bleibt die KI stecken, wird die manuelle Fehlersuche aufwendiger, weil man sich erst in den generierten Code einarbeiten muss. Evt. kommt hier dann in Zukunft auch KI (anderes LLM) zum Einsatz was das Gefühl dann noch verstärkt.</w:t>
+      </w:r>
+    </w:p>
+    <w:p>
+      <w:pPr>
+        <w:pStyle w:val="Compact"/>
+        <w:numPr>
+          <w:ilvl w:val="0"/>
+          <w:numId w:val="1016"/>
+        </w:numPr>
+      </w:pPr>
+      <w:r>
+        <w:rPr>
+          <w:b/>
+          <w:bCs/>
+        </w:rPr>
+        <w:t xml:space="preserve">Ethik und Regulatorik.</w:t>
+      </w:r>
+      <w:r>
+        <w:t xml:space="preserve"> </w:t>
+      </w:r>
+      <w:r>
+        <w:t xml:space="preserve">Wie weit darf KI in stark regulierten oder sicherheitskritischen Bereichen eingesetzt werden, und wie gehen wir mit den gesellschaftlichen Folgen um (Entscheidungshoheit, Überwachung, wegfallende Tätigkeiten)? Diese Fragen bleiben bewusst über den Projektrahmen hinaus offen.</w:t>
+      </w:r>
+    </w:p>
+    <w:p>
+      <w:pPr>
+        <w:pStyle w:val="Compact"/>
+        <w:numPr>
+          <w:ilvl w:val="0"/>
+          <w:numId w:val="1016"/>
+        </w:numPr>
+      </w:pPr>
+      <w:r>
+        <w:rPr>
+          <w:b/>
+          <w:bCs/>
+        </w:rPr>
+        <w:t xml:space="preserve">Arbeitsplatzverlust, Wertschätzung.</w:t>
+      </w:r>
+      <w:r>
+        <w:t xml:space="preserve"> </w:t>
+      </w:r>
+      <w:r>
+        <w:t xml:space="preserve">Wozu brauche ich noch einen teuren SW-Ingenieur/Architekten. Ich lasse die KI schreiben die ist schneller und billiger. Die Architektur interessiert mich nicht ich will Ergebnisse. Solchen Manager-Gedanken werden wir uns stellen müssen, wie es Berichten aus den Medien bereits zeigen.</w:t>
+      </w:r>
+    </w:p>
+    <w:bookmarkEnd w:id="104"/>
+    <w:bookmarkStart w:id="105" w:name="fazit"/>
+    <w:p>
+      <w:pPr>
+        <w:pStyle w:val="Heading3"/>
+      </w:pPr>
+      <w:r>
+        <w:t xml:space="preserve">14.10 Fazit</w:t>
+      </w:r>
+    </w:p>
+    <w:p>
+      <w:pPr>
+        <w:pStyle w:val="FirstParagraph"/>
+      </w:pPr>
+      <w:r>
+        <w:t xml:space="preserve">KI wird aus der Softwareentwicklung nicht mehr wegzudenken sein und bald so selbstverständlich genutzt werden wie heute die Code-Completion in der IDE.</w:t>
+      </w:r>
+      <w:r>
+        <w:t xml:space="preserve"> </w:t>
+      </w:r>
+      <w:r>
+        <w:t xml:space="preserve">Software-Ingenieure bleiben nötig, aber ihre Arbeit verschiebt sich: weg vom reinen Codieren, hin zu Dokumentation, präziser Ticket-Formulierung und Architekturentscheidungen.</w:t>
+      </w:r>
+      <w:r>
+        <w:t xml:space="preserve"> </w:t>
+      </w:r>
+      <w:r>
+        <w:t xml:space="preserve">Für dieses Projekt hat sich die Kombination aus solider Vorarbeit (SAD,</w:t>
+      </w:r>
+      <w:r>
+        <w:t xml:space="preserve"> </w:t>
+      </w:r>
+      <w:r>
+        <w:rPr>
+          <w:rStyle w:val="VerbatimChar"/>
+        </w:rPr>
+        <w:t xml:space="preserve">CLAUDE.md</w:t>
+      </w:r>
+      <w:r>
+        <w:t xml:space="preserve">), klar delegierbaren Aufgaben und konsequent menschlicher Verifikation der kritischen Teile bewährt.</w:t>
       </w:r>
     </w:p>
     <w:p>
@@ -16005,9 +16922,9 @@
         </w:pict>
       </w:r>
     </w:p>
-    <w:bookmarkEnd w:id="98"/>
-    <w:bookmarkEnd w:id="99"/>
-    <w:bookmarkStart w:id="100" w:name="glossar"/>
+    <w:bookmarkEnd w:id="105"/>
+    <w:bookmarkEnd w:id="106"/>
+    <w:bookmarkStart w:id="107" w:name="glossar"/>
     <w:p>
       <w:pPr>
         <w:pStyle w:val="Heading2"/>
@@ -16531,8 +17448,8 @@
         </w:tc>
       </w:tr>
     </w:tbl>
-    <w:bookmarkEnd w:id="100"/>
-    <w:bookmarkEnd w:id="101"/>
+    <w:bookmarkEnd w:id="107"/>
+    <w:bookmarkEnd w:id="108"/>
     <w:sectPr>
       <w:footnotePr>
         <w:numRestart w:val="eachSect"/>
@@ -16825,6 +17742,91 @@
       <w:start w:val="1"/>
       <w:numFmt w:val="decimal"/>
       <w:lvlText w:val="%9."/>
+      <w:lvlJc w:val="left"/>
+      <w:pPr>
+        <w:ind w:left="6480" w:hanging="360"/>
+      </w:pPr>
+    </w:lvl>
+  </w:abstractNum>
+  <w:abstractNum w:abstractNumId="99731">
+    <w:nsid w:val="00A99731"/>
+    <w:multiLevelType w:val="multilevel"/>
+    <w:lvl w:ilvl="0">
+      <w:start w:val="1"/>
+      <w:numFmt w:val="lowerLetter"/>
+      <w:lvlText w:val="(%1)"/>
+      <w:lvlJc w:val="left"/>
+      <w:pPr>
+        <w:ind w:left="720" w:hanging="360"/>
+      </w:pPr>
+    </w:lvl>
+    <w:lvl w:ilvl="1">
+      <w:start w:val="1"/>
+      <w:numFmt w:val="lowerLetter"/>
+      <w:lvlText w:val="(%2)"/>
+      <w:lvlJc w:val="left"/>
+      <w:pPr>
+        <w:ind w:left="1440" w:hanging="360"/>
+      </w:pPr>
+    </w:lvl>
+    <w:lvl w:ilvl="2">
+      <w:start w:val="1"/>
+      <w:numFmt w:val="lowerLetter"/>
+      <w:lvlText w:val="(%3)"/>
+      <w:lvlJc w:val="left"/>
+      <w:pPr>
+        <w:ind w:left="2160" w:hanging="360"/>
+      </w:pPr>
+    </w:lvl>
+    <w:lvl w:ilvl="3">
+      <w:start w:val="1"/>
+      <w:numFmt w:val="lowerLetter"/>
+      <w:lvlText w:val="(%4)"/>
+      <w:lvlJc w:val="left"/>
+      <w:pPr>
+        <w:ind w:left="2880" w:hanging="360"/>
+      </w:pPr>
+    </w:lvl>
+    <w:lvl w:ilvl="4">
+      <w:start w:val="1"/>
+      <w:numFmt w:val="lowerLetter"/>
+      <w:lvlText w:val="(%5)"/>
+      <w:lvlJc w:val="left"/>
+      <w:pPr>
+        <w:ind w:left="3600" w:hanging="360"/>
+      </w:pPr>
+    </w:lvl>
+    <w:lvl w:ilvl="5">
+      <w:start w:val="1"/>
+      <w:numFmt w:val="lowerLetter"/>
+      <w:lvlText w:val="(%6)"/>
+      <w:lvlJc w:val="left"/>
+      <w:pPr>
+        <w:ind w:left="4320" w:hanging="360"/>
+      </w:pPr>
+    </w:lvl>
+    <w:lvl w:ilvl="6">
+      <w:start w:val="1"/>
+      <w:numFmt w:val="lowerLetter"/>
+      <w:lvlText w:val="(%7)"/>
+      <w:lvlJc w:val="left"/>
+      <w:pPr>
+        <w:ind w:left="5040" w:hanging="360"/>
+      </w:pPr>
+    </w:lvl>
+    <w:lvl w:ilvl="7">
+      <w:start w:val="1"/>
+      <w:numFmt w:val="lowerLetter"/>
+      <w:lvlText w:val="(%8)"/>
+      <w:lvlJc w:val="left"/>
+      <w:pPr>
+        <w:ind w:left="5760" w:hanging="360"/>
+      </w:pPr>
+    </w:lvl>
+    <w:lvl w:ilvl="8">
+      <w:start w:val="1"/>
+      <w:numFmt w:val="lowerLetter"/>
+      <w:lvlText w:val="(%9)"/>
       <w:lvlJc w:val="left"/>
       <w:pPr>
         <w:ind w:left="6480" w:hanging="360"/>
@@ -16940,9 +17942,54 @@
     <w:abstractNumId w:val="991"/>
   </w:num>
   <w:num w:numId="1009">
+    <w:abstractNumId w:val="99731"/>
+    <w:lvlOverride w:ilvl="0">
+      <w:startOverride w:val="1"/>
+    </w:lvlOverride>
+    <w:lvlOverride w:ilvl="1">
+      <w:startOverride w:val="1"/>
+    </w:lvlOverride>
+    <w:lvlOverride w:ilvl="2">
+      <w:startOverride w:val="1"/>
+    </w:lvlOverride>
+    <w:lvlOverride w:ilvl="3">
+      <w:startOverride w:val="1"/>
+    </w:lvlOverride>
+    <w:lvlOverride w:ilvl="4">
+      <w:startOverride w:val="1"/>
+    </w:lvlOverride>
+    <w:lvlOverride w:ilvl="5">
+      <w:startOverride w:val="1"/>
+    </w:lvlOverride>
+    <w:lvlOverride w:ilvl="6">
+      <w:startOverride w:val="1"/>
+    </w:lvlOverride>
+    <w:lvlOverride w:ilvl="7">
+      <w:startOverride w:val="1"/>
+    </w:lvlOverride>
+    <w:lvlOverride w:ilvl="8">
+      <w:startOverride w:val="1"/>
+    </w:lvlOverride>
+  </w:num>
+  <w:num w:numId="1010">
     <w:abstractNumId w:val="991"/>
   </w:num>
-  <w:num w:numId="1010">
+  <w:num w:numId="1011">
+    <w:abstractNumId w:val="991"/>
+  </w:num>
+  <w:num w:numId="1012">
+    <w:abstractNumId w:val="991"/>
+  </w:num>
+  <w:num w:numId="1013">
+    <w:abstractNumId w:val="991"/>
+  </w:num>
+  <w:num w:numId="1014">
+    <w:abstractNumId w:val="991"/>
+  </w:num>
+  <w:num w:numId="1015">
+    <w:abstractNumId w:val="991"/>
+  </w:num>
+  <w:num w:numId="1016">
     <w:abstractNumId w:val="991"/>
   </w:num>
 </w:numbering>

</xml_diff>

<commit_message>
docs(sad): polish wording, fix FA-06, weave in AI-experience reflections (#49)
- §10.1 FA table: drop HTTP URLs, fix FA-06 (only `winner` is mandatory;
  point attributes are optional → "Quick-Points"); fixes broken FA-16 row
- §14: weave the standalone "Erfahrungen mit AI Coding" doc into the chapter
  (observations, accepted/corrected examples, project suitability, dangers &
  open questions, conclusion); delete the now-redundant source file
- §12: add R-08 (load test pending) referencing TEN-69
- Clearer wording for §8.3 (error handling), §8.5 (AI tests), ADR-11, ADR-14,
  ADR-16
- Rebuild TSaS_SAD_arc42_2.docx
- Ignore Office lock files (~$*)

Co-authored-by: Claude Opus 4.8 (1M context) <noreply@anthropic.com>
</commit_message>
<xml_diff>
--- a/doc/sad/TSaS_SAD_arc42_2.docx
+++ b/doc/sad/TSaS_SAD_arc42_2.docx
@@ -2,7 +2,7 @@
 <file path=word/document.xml><?xml version="1.0" encoding="utf-8"?>
 <w:document xmlns:w="http://schemas.openxmlformats.org/wordprocessingml/2006/main" xmlns:m="http://schemas.openxmlformats.org/officeDocument/2006/math" xmlns:r="http://schemas.openxmlformats.org/officeDocument/2006/relationships" xmlns:o="urn:schemas-microsoft-com:office:office" xmlns:v="urn:schemas-microsoft-com:vml" xmlns:w10="urn:schemas-microsoft-com:office:word" xmlns:a="http://schemas.openxmlformats.org/drawingml/2006/main" xmlns:pic="http://schemas.openxmlformats.org/drawingml/2006/picture" xmlns:wp="http://schemas.openxmlformats.org/drawingml/2006/wordprocessingDrawing">
   <w:body>
-    <w:bookmarkStart w:id="101" w:name="X8e4ebc2e1f4eb088d047a6684ad88a5c65a2b31"/>
+    <w:bookmarkStart w:id="108" w:name="X8e4ebc2e1f4eb088d047a6684ad88a5c65a2b31"/>
     <w:p>
       <w:pPr>
         <w:pStyle w:val="Heading1"/>
@@ -6554,7 +6554,7 @@
     </w:p>
     <w:bookmarkEnd w:id="68"/>
     <w:bookmarkEnd w:id="69"/>
-    <w:bookmarkStart w:id="77" w:name="querschnittliche-konzepte"/>
+    <w:bookmarkStart w:id="79" w:name="querschnittliche-konzepte"/>
     <w:p>
       <w:pPr>
         <w:pStyle w:val="Heading2"/>
@@ -7301,7 +7301,7 @@
         <w:pStyle w:val="FirstParagraph"/>
       </w:pPr>
       <w:r>
-        <w:t xml:space="preserve">Deklarativ über</w:t>
+        <w:t xml:space="preserve">Die Fehlerbehandlung ist deklarativ über</w:t>
       </w:r>
       <w:r>
         <w:t xml:space="preserve"> </w:t>
@@ -7313,133 +7313,168 @@
         <w:t xml:space="preserve">@RestControllerAdvice</w:t>
       </w:r>
       <w:r>
-        <w:t xml:space="preserve">. Querschnittliches liegt zentral im</w:t>
-      </w:r>
-      <w:r>
-        <w:t xml:space="preserve"> </w:t>
-      </w:r>
-      <w:r>
-        <w:rPr>
-          <w:rStyle w:val="VerbatimChar"/>
-        </w:rPr>
-        <w:t xml:space="preserve">common-module</w:t>
-      </w:r>
-      <w:r>
-        <w:t xml:space="preserve"> </w:t>
-      </w:r>
-      <w:r>
-        <w:t xml:space="preserve">(</w:t>
-      </w:r>
-      <w:r>
-        <w:rPr>
-          <w:rStyle w:val="VerbatimChar"/>
-        </w:rPr>
-        <w:t xml:space="preserve">CommonExceptionHandler</w:t>
-      </w:r>
-      <w:r>
-        <w:t xml:space="preserve">,</w:t>
-      </w:r>
-      <w:r>
-        <w:t xml:space="preserve"> </w:t>
-      </w:r>
-      <w:r>
-        <w:rPr>
-          <w:rStyle w:val="VerbatimChar"/>
-        </w:rPr>
-        <w:t xml:space="preserve">LOWEST_PRECEDENCE</w:t>
-      </w:r>
-      <w:r>
-        <w:t xml:space="preserve">):</w:t>
-      </w:r>
-      <w:r>
-        <w:t xml:space="preserve"> </w:t>
-      </w:r>
-      <w:r>
-        <w:rPr>
-          <w:rStyle w:val="VerbatimChar"/>
-        </w:rPr>
-        <w:t xml:space="preserve">ConflictException</w:t>
-      </w:r>
-      <w:r>
-        <w:t xml:space="preserve"> </w:t>
-      </w:r>
-      <w:r>
-        <w:t xml:space="preserve">→ 409, Bean-Validation → 400 (mit Feld-Details), ungültige Argumente → 400. Modulspezifisch:</w:t>
-      </w:r>
-      <w:r>
-        <w:t xml:space="preserve"> </w:t>
-      </w:r>
-      <w:r>
-        <w:rPr>
-          <w:rStyle w:val="VerbatimChar"/>
-        </w:rPr>
-        <w:t xml:space="preserve">GlobalExceptionHandler</w:t>
-      </w:r>
-      <w:r>
-        <w:t xml:space="preserve"> </w:t>
-      </w:r>
-      <w:r>
-        <w:t xml:space="preserve">(Player/Match „nicht gefunden” → 404),</w:t>
-      </w:r>
-      <w:r>
-        <w:t xml:space="preserve"> </w:t>
-      </w:r>
-      <w:r>
-        <w:rPr>
-          <w:rStyle w:val="VerbatimChar"/>
-        </w:rPr>
-        <w:t xml:space="preserve">AiExceptionHandler</w:t>
-      </w:r>
-      <w:r>
-        <w:t xml:space="preserve"> </w:t>
-      </w:r>
-      <w:r>
-        <w:t xml:space="preserve">(</w:t>
-      </w:r>
-      <w:r>
-        <w:rPr>
-          <w:rStyle w:val="VerbatimChar"/>
-        </w:rPr>
-        <w:t xml:space="preserve">InsufficientMatchData</w:t>
-      </w:r>
-      <w:r>
-        <w:t xml:space="preserve"> </w:t>
-      </w:r>
-      <w:r>
-        <w:t xml:space="preserve">→ 422,</w:t>
-      </w:r>
-      <w:r>
-        <w:t xml:space="preserve"> </w:t>
-      </w:r>
-      <w:r>
-        <w:rPr>
-          <w:rStyle w:val="VerbatimChar"/>
-        </w:rPr>
-        <w:t xml:space="preserve">AnalysisGeneration</w:t>
-      </w:r>
-      <w:r>
-        <w:t xml:space="preserve"> </w:t>
-      </w:r>
-      <w:r>
-        <w:t xml:space="preserve">→ 502).</w:t>
-      </w:r>
-    </w:p>
-    <w:p>
-      <w:pPr>
-        <w:pStyle w:val="BodyText"/>
-      </w:pPr>
+        <w:t xml:space="preserve"> </w:t>
+      </w:r>
+      <w:r>
+        <w:t xml:space="preserve">gelöst. Das</w:t>
+      </w:r>
+      <w:r>
+        <w:t xml:space="preserve"> </w:t>
+      </w:r>
       <w:r>
         <w:rPr>
           <w:b/>
           <w:bCs/>
         </w:rPr>
+        <w:t xml:space="preserve">Antwortformat</w:t>
+      </w:r>
+      <w:r>
+        <w:t xml:space="preserve"> </w:t>
+      </w:r>
+      <w:r>
+        <w:t xml:space="preserve">ist durchgängig</w:t>
+      </w:r>
+      <w:r>
+        <w:t xml:space="preserve"> </w:t>
+      </w:r>
+      <w:r>
+        <w:rPr>
+          <w:b/>
+          <w:bCs/>
+        </w:rPr>
+        <w:t xml:space="preserve">RFC 7807</w:t>
+      </w:r>
+      <w:r>
+        <w:t xml:space="preserve"> </w:t>
+      </w:r>
+      <w:r>
+        <w:t xml:space="preserve">über Springs</w:t>
+      </w:r>
+      <w:r>
+        <w:t xml:space="preserve"> </w:t>
+      </w:r>
+      <w:r>
+        <w:rPr>
+          <w:rStyle w:val="VerbatimChar"/>
+        </w:rPr>
+        <w:t xml:space="preserve">ProblemDetail</w:t>
+      </w:r>
+      <w:r>
+        <w:t xml:space="preserve"> </w:t>
+      </w:r>
+      <w:r>
+        <w:t xml:space="preserve">(ersetzt das frühere Ad-hoc-Format); die Schemas der Fehlerantworten (400/404/409/422/502) sind via springdoc unter</w:t>
+      </w:r>
+      <w:r>
+        <w:t xml:space="preserve"> </w:t>
+      </w:r>
+      <w:r>
+        <w:rPr>
+          <w:rStyle w:val="VerbatimChar"/>
+        </w:rPr>
+        <w:t xml:space="preserve">/v3/api-docs</w:t>
+      </w:r>
+      <w:r>
+        <w:t xml:space="preserve"> </w:t>
+      </w:r>
+      <w:r>
+        <w:t xml:space="preserve">dokumentiert.</w:t>
+      </w:r>
+      <w:r>
+        <w:br/>
+      </w:r>
+      <w:r>
+        <w:t xml:space="preserve">Der</w:t>
+      </w:r>
+      <w:r>
+        <w:t xml:space="preserve"> </w:t>
+      </w:r>
+      <w:r>
+        <w:rPr>
+          <w:rStyle w:val="VerbatimChar"/>
+        </w:rPr>
+        <w:t xml:space="preserve">GlobalExceptionHandler</w:t>
+      </w:r>
+      <w:r>
+        <w:t xml:space="preserve"> </w:t>
+      </w:r>
+      <w:r>
+        <w:t xml:space="preserve">behandelt die modulübergreifende</w:t>
+      </w:r>
+      <w:r>
+        <w:t xml:space="preserve"> </w:t>
+      </w:r>
+      <w:r>
+        <w:t xml:space="preserve">“nicht gefunden”</w:t>
+      </w:r>
+      <w:r>
+        <w:t xml:space="preserve">-Domain-Exceptions der fachlichen Module (Player/Match) und führen zu einem 404.</w:t>
+      </w:r>
+      <w:r>
+        <w:br/>
+      </w:r>
+      <w:r>
+        <w:t xml:space="preserve">Querschnittliche Fälle (Konflikte, Validierung, ungültige Argumente) übernimmt der</w:t>
+      </w:r>
+      <w:r>
+        <w:t xml:space="preserve"> </w:t>
+      </w:r>
+      <w:r>
+        <w:rPr>
+          <w:rStyle w:val="VerbatimChar"/>
+        </w:rPr>
+        <w:t xml:space="preserve">CommonExceptionHandler</w:t>
+      </w:r>
+      <w:r>
+        <w:t xml:space="preserve"> </w:t>
+      </w:r>
+      <w:r>
+        <w:t xml:space="preserve">im</w:t>
+      </w:r>
+      <w:r>
+        <w:t xml:space="preserve"> </w:t>
+      </w:r>
+      <w:r>
+        <w:rPr>
+          <w:rStyle w:val="VerbatimChar"/>
+        </w:rPr>
+        <w:t xml:space="preserve">common-module</w:t>
+      </w:r>
+      <w:r>
+        <w:t xml:space="preserve"> </w:t>
+      </w:r>
+      <w:r>
+        <w:t xml:space="preserve">und AI-spezifische Fälle der</w:t>
+      </w:r>
+      <w:r>
+        <w:t xml:space="preserve"> </w:t>
+      </w:r>
+      <w:r>
+        <w:rPr>
+          <w:rStyle w:val="VerbatimChar"/>
+        </w:rPr>
+        <w:t xml:space="preserve">AiExceptionHandler</w:t>
+      </w:r>
+      <w:r>
+        <w:t xml:space="preserve">.</w:t>
+      </w:r>
+    </w:p>
+    <w:p>
+      <w:pPr>
+        <w:pStyle w:val="BodyText"/>
+      </w:pPr>
+      <w:r>
+        <w:rPr>
+          <w:b/>
+          <w:bCs/>
+        </w:rPr>
         <w:t xml:space="preserve">Catch-all + Sanitization (STRIDE I5+I6).</w:t>
       </w:r>
       <w:r>
         <w:t xml:space="preserve"> </w:t>
       </w:r>
       <w:r>
-        <w:t xml:space="preserve">Vier breite Klassen werden abgefangen, ohne interne Details (Klassenpfade, SQL, Stack-Traces) zu lecken:</w:t>
+        <w:t xml:space="preserve">Vier allgemeine Exception-Typen werden als Auffangnetz verwendet. So werden keine interne Details (Klassenpfade, SQL, Stack-Traces) nach aussen gegeben.</w:t>
       </w:r>
     </w:p>
     <w:tbl>
@@ -7656,49 +7691,7 @@
         <w:pStyle w:val="BodyText"/>
       </w:pPr>
       <w:r>
-        <w:t xml:space="preserve">Ergänzend setzen</w:t>
-      </w:r>
-      <w:r>
-        <w:t xml:space="preserve"> </w:t>
-      </w:r>
-      <w:r>
-        <w:rPr>
-          <w:rStyle w:val="VerbatimChar"/>
-        </w:rPr>
-        <w:t xml:space="preserve">server.error.include-*</w:t>
-      </w:r>
-      <w:r>
-        <w:t xml:space="preserve">-Properties Springs Whitelabel-Fallback still.</w:t>
-      </w:r>
-      <w:r>
-        <w:t xml:space="preserve"> </w:t>
-      </w:r>
-      <w:r>
-        <w:rPr>
-          <w:rStyle w:val="VerbatimChar"/>
-        </w:rPr>
-        <w:t xml:space="preserve">CommonExceptionHandlerTest</w:t>
-      </w:r>
-      <w:r>
-        <w:t xml:space="preserve"> </w:t>
-      </w:r>
-      <w:r>
-        <w:t xml:space="preserve">(7 Pfade) assertet, dass weder SQL noch UUIDs noch Klassennamen in</w:t>
-      </w:r>
-      <w:r>
-        <w:t xml:space="preserve"> </w:t>
-      </w:r>
-      <w:r>
-        <w:rPr>
-          <w:rStyle w:val="VerbatimChar"/>
-        </w:rPr>
-        <w:t xml:space="preserve">detail</w:t>
-      </w:r>
-      <w:r>
-        <w:t xml:space="preserve"> </w:t>
-      </w:r>
-      <w:r>
-        <w:t xml:space="preserve">auftauchen. Antwortformat:</w:t>
+        <w:t xml:space="preserve">Damit auch Springs eingebauter</w:t>
       </w:r>
       <w:r>
         <w:t xml:space="preserve"> </w:t>
@@ -7708,40 +7701,94 @@
           <w:b/>
           <w:bCs/>
         </w:rPr>
-        <w:t xml:space="preserve">RFC 7807</w:t>
-      </w:r>
-      <w:r>
-        <w:t xml:space="preserve"> </w:t>
-      </w:r>
-      <w:r>
-        <w:t xml:space="preserve">über Springs</w:t>
-      </w:r>
-      <w:r>
-        <w:t xml:space="preserve"> </w:t>
-      </w:r>
-      <w:r>
-        <w:rPr>
-          <w:rStyle w:val="VerbatimChar"/>
-        </w:rPr>
-        <w:t xml:space="preserve">ProblemDetail</w:t>
-      </w:r>
-      <w:r>
-        <w:t xml:space="preserve"> </w:t>
-      </w:r>
-      <w:r>
-        <w:t xml:space="preserve">(löst das frühere Ad-hoc-Format ab); Schemas (400/404/409/422/502) via springdoc unter</w:t>
-      </w:r>
-      <w:r>
-        <w:t xml:space="preserve"> </w:t>
-      </w:r>
-      <w:r>
-        <w:rPr>
-          <w:rStyle w:val="VerbatimChar"/>
-        </w:rPr>
-        <w:t xml:space="preserve">/v3/api-docs</w:t>
-      </w:r>
-      <w:r>
-        <w:t xml:space="preserve">.</w:t>
+        <w:t xml:space="preserve">Whitelabel-Fallback</w:t>
+      </w:r>
+      <w:r>
+        <w:t xml:space="preserve"> </w:t>
+      </w:r>
+      <w:r>
+        <w:t xml:space="preserve">nichts preisgibt, sind</w:t>
+      </w:r>
+      <w:r>
+        <w:t xml:space="preserve"> </w:t>
+      </w:r>
+      <w:r>
+        <w:rPr>
+          <w:rStyle w:val="VerbatimChar"/>
+        </w:rPr>
+        <w:t xml:space="preserve">server.error.include-message</w:t>
+      </w:r>
+      <w:r>
+        <w:t xml:space="preserve"> </w:t>
+      </w:r>
+      <w:r>
+        <w:t xml:space="preserve">und</w:t>
+      </w:r>
+      <w:r>
+        <w:t xml:space="preserve"> </w:t>
+      </w:r>
+      <w:r>
+        <w:rPr>
+          <w:rStyle w:val="VerbatimChar"/>
+        </w:rPr>
+        <w:t xml:space="preserve">include-stacktrace</w:t>
+      </w:r>
+      <w:r>
+        <w:t xml:space="preserve"> </w:t>
+      </w:r>
+      <w:r>
+        <w:t xml:space="preserve">auf</w:t>
+      </w:r>
+      <w:r>
+        <w:t xml:space="preserve"> </w:t>
+      </w:r>
+      <w:r>
+        <w:rPr>
+          <w:rStyle w:val="VerbatimChar"/>
+        </w:rPr>
+        <w:t xml:space="preserve">never</w:t>
+      </w:r>
+      <w:r>
+        <w:t xml:space="preserve"> </w:t>
+      </w:r>
+      <w:r>
+        <w:t xml:space="preserve">gesetzt — er zeigt dann weder Fehlermeldung noch Stack-Trace.</w:t>
+      </w:r>
+      <w:r>
+        <w:br/>
+      </w:r>
+      <w:r>
+        <w:t xml:space="preserve">Abgesichert wird das durch</w:t>
+      </w:r>
+      <w:r>
+        <w:t xml:space="preserve"> </w:t>
+      </w:r>
+      <w:r>
+        <w:rPr>
+          <w:rStyle w:val="VerbatimChar"/>
+        </w:rPr>
+        <w:t xml:space="preserve">CommonExceptionHandlerTest</w:t>
+      </w:r>
+      <w:r>
+        <w:t xml:space="preserve"> </w:t>
+      </w:r>
+      <w:r>
+        <w:t xml:space="preserve">(7 Testfälle), der prüft, dass in</w:t>
+      </w:r>
+      <w:r>
+        <w:t xml:space="preserve"> </w:t>
+      </w:r>
+      <w:r>
+        <w:rPr>
+          <w:rStyle w:val="VerbatimChar"/>
+        </w:rPr>
+        <w:t xml:space="preserve">detail</w:t>
+      </w:r>
+      <w:r>
+        <w:t xml:space="preserve"> </w:t>
+      </w:r>
+      <w:r>
+        <w:t xml:space="preserve">weder SQL noch UUIDs noch Klassennamen auftauchen.</w:t>
       </w:r>
     </w:p>
     <w:bookmarkEnd w:id="72"/>
@@ -7759,11 +7806,11 @@
         <w:pStyle w:val="FirstParagraph"/>
       </w:pPr>
       <w:r>
-        <w:t xml:space="preserve">Strukturiertes JSON-Logging via SLF4J/Logback. Spring Boot Actuator liefert Health-/Metrics-/Info-Endpunkte (Prometheus/Grafana-fähig).</w:t>
+        <w:t xml:space="preserve">Ein strukturiertes JSON-Logging erfolgt über SLF4J/Logback. Der Spring Boot Actuator liefert Health-/Metrics-/Info-Endpunkte (Prometheus/Grafana-fähig).</w:t>
       </w:r>
     </w:p>
     <w:bookmarkEnd w:id="73"/>
-    <w:bookmarkStart w:id="74" w:name="testkonzept"/>
+    <w:bookmarkStart w:id="76" w:name="testkonzept"/>
     <w:p>
       <w:pPr>
         <w:pStyle w:val="Heading3"/>
@@ -7986,84 +8033,167 @@
         <w:t xml:space="preserve">).</w:t>
       </w:r>
     </w:p>
+    <w:bookmarkStart w:id="74" w:name="begründung-der-werkzeuge"/>
+    <w:p>
+      <w:pPr>
+        <w:pStyle w:val="Heading4"/>
+      </w:pPr>
+      <w:r>
+        <w:t xml:space="preserve">8.5.1 Begründung der Werkzeuge</w:t>
+      </w:r>
+    </w:p>
+    <w:p>
+      <w:pPr>
+        <w:pStyle w:val="Compact"/>
+        <w:numPr>
+          <w:ilvl w:val="0"/>
+          <w:numId w:val="1009"/>
+        </w:numPr>
+      </w:pPr>
+      <w:r>
+        <w:rPr>
+          <w:i/>
+          <w:iCs/>
+        </w:rPr>
+        <w:t xml:space="preserve">Echtes PostgreSQL via Testcontainers statt H2:</w:t>
+      </w:r>
+      <w:r>
+        <w:t xml:space="preserve"> </w:t>
+      </w:r>
+      <w:r>
+        <w:t xml:space="preserve">Persistenz-/Schema-Verhalten ist PostgreSQL-spezifisch und wird gegen dieselbe Engine wie in Prod verifiziert (Flyway V1–V10 real, nativer</w:t>
+      </w:r>
+      <w:r>
+        <w:t xml:space="preserve"> </w:t>
+      </w:r>
+      <w:r>
+        <w:rPr>
+          <w:rStyle w:val="VerbatimChar"/>
+        </w:rPr>
+        <w:t xml:space="preserve">UUID</w:t>
+      </w:r>
+      <w:r>
+        <w:t xml:space="preserve">-Typ,</w:t>
+      </w:r>
+      <w:r>
+        <w:t xml:space="preserve"> </w:t>
+      </w:r>
+      <w:r>
+        <w:rPr>
+          <w:rStyle w:val="VerbatimChar"/>
+        </w:rPr>
+        <w:t xml:space="preserve">CHECK</w:t>
+      </w:r>
+      <w:r>
+        <w:t xml:space="preserve">/</w:t>
+      </w:r>
+      <w:r>
+        <w:rPr>
+          <w:rStyle w:val="VerbatimChar"/>
+        </w:rPr>
+        <w:t xml:space="preserve">ON DELETE CASCADE</w:t>
+      </w:r>
+      <w:r>
+        <w:t xml:space="preserve">); H2 im PG-Modus weicht ab.</w:t>
+      </w:r>
+      <w:r>
+        <w:br/>
+      </w:r>
+    </w:p>
+    <w:p>
+      <w:pPr>
+        <w:pStyle w:val="Compact"/>
+        <w:numPr>
+          <w:ilvl w:val="0"/>
+          <w:numId w:val="1009"/>
+        </w:numPr>
+      </w:pPr>
+      <w:r>
+        <w:rPr>
+          <w:i/>
+          <w:iCs/>
+        </w:rPr>
+        <w:t xml:space="preserve">WireMock für den LLM-Adapter:</w:t>
+      </w:r>
+      <w:r>
+        <w:t xml:space="preserve"> </w:t>
+      </w:r>
+      <w:r>
+        <w:rPr>
+          <w:rStyle w:val="VerbatimChar"/>
+        </w:rPr>
+        <w:t xml:space="preserve">OpenAiLlmAdapterTest</w:t>
+      </w:r>
+      <w:r>
+        <w:t xml:space="preserve"> </w:t>
+      </w:r>
+      <w:r>
+        <w:t xml:space="preserve">stubbt den OpenAI-HTTP-Endpoint und prüft den realen Serialisierungspfad deterministisch, offline, ohne Kosten.</w:t>
+      </w:r>
+      <w:r>
+        <w:br/>
+      </w:r>
+    </w:p>
+    <w:p>
+      <w:pPr>
+        <w:pStyle w:val="Compact"/>
+        <w:numPr>
+          <w:ilvl w:val="0"/>
+          <w:numId w:val="1009"/>
+        </w:numPr>
+      </w:pPr>
+      <w:r>
+        <w:rPr>
+          <w:i/>
+          <w:iCs/>
+        </w:rPr>
+        <w:t xml:space="preserve">Coverage-Gate 85/70:</w:t>
+      </w:r>
+      <w:r>
+        <w:t xml:space="preserve"> </w:t>
+      </w:r>
+      <w:r>
+        <w:t xml:space="preserve">knapp unter Ist-Stand → fängt Regressionen ohne Brechen bei Schwankungen (ADR-11).</w:t>
+      </w:r>
+    </w:p>
+    <w:bookmarkEnd w:id="74"/>
+    <w:bookmarkStart w:id="75" w:name="Xf7234b34e8fd42e05ce6d1c29239cb32179f024"/>
+    <w:p>
+      <w:pPr>
+        <w:pStyle w:val="Heading4"/>
+      </w:pPr>
+      <w:r>
+        <w:t xml:space="preserve">8.5.2 Tests der KI-Anteile (Nichtdeterminismus, Guardrails, Fehlerpfade)</w:t>
+      </w:r>
+    </w:p>
     <w:p>
       <w:pPr>
         <w:pStyle w:val="FirstParagraph"/>
+      </w:pPr>
+      <w:r>
+        <w:t xml:space="preserve">Die KI-Anteile sind wegen Nichtdeterminismus, externer Abhängigkeit und Kosten gesondert abgesichert:</w:t>
+      </w:r>
+    </w:p>
+    <w:p>
+      <w:pPr>
+        <w:pStyle w:val="Compact"/>
+        <w:numPr>
+          <w:ilvl w:val="0"/>
+          <w:numId w:val="1010"/>
+        </w:numPr>
       </w:pPr>
       <w:r>
         <w:rPr>
           <w:b/>
           <w:bCs/>
         </w:rPr>
-        <w:t xml:space="preserve">Begründung der Werkzeuge.</w:t>
-      </w:r>
-      <w:r>
-        <w:t xml:space="preserve"> </w:t>
-      </w:r>
-      <w:r>
-        <w:t xml:space="preserve">(a)</w:t>
-      </w:r>
-      <w:r>
-        <w:t xml:space="preserve"> </w:t>
-      </w:r>
-      <w:r>
-        <w:rPr>
-          <w:i/>
-          <w:iCs/>
-        </w:rPr>
-        <w:t xml:space="preserve">Echtes PostgreSQL via Testcontainers statt H2:</w:t>
-      </w:r>
-      <w:r>
-        <w:t xml:space="preserve"> </w:t>
-      </w:r>
-      <w:r>
-        <w:t xml:space="preserve">Persistenz-/Schema-Verhalten ist PostgreSQL-spezifisch und wird gegen dieselbe Engine wie in Prod verifiziert (Flyway V1–V10 real, nativer</w:t>
-      </w:r>
-      <w:r>
-        <w:t xml:space="preserve"> </w:t>
-      </w:r>
-      <w:r>
-        <w:rPr>
-          <w:rStyle w:val="VerbatimChar"/>
-        </w:rPr>
-        <w:t xml:space="preserve">UUID</w:t>
-      </w:r>
-      <w:r>
-        <w:t xml:space="preserve">-Typ,</w:t>
-      </w:r>
-      <w:r>
-        <w:t xml:space="preserve"> </w:t>
-      </w:r>
-      <w:r>
-        <w:rPr>
-          <w:rStyle w:val="VerbatimChar"/>
-        </w:rPr>
-        <w:t xml:space="preserve">CHECK</w:t>
-      </w:r>
-      <w:r>
-        <w:t xml:space="preserve">/</w:t>
-      </w:r>
-      <w:r>
-        <w:rPr>
-          <w:rStyle w:val="VerbatimChar"/>
-        </w:rPr>
-        <w:t xml:space="preserve">ON DELETE CASCADE</w:t>
-      </w:r>
-      <w:r>
-        <w:t xml:space="preserve">); H2 im PG-Modus weicht ab. (b)</w:t>
-      </w:r>
-      <w:r>
-        <w:t xml:space="preserve"> </w:t>
-      </w:r>
-      <w:r>
-        <w:rPr>
-          <w:i/>
-          <w:iCs/>
-        </w:rPr>
-        <w:t xml:space="preserve">WireMock für den LLM-Adapter:</w:t>
-      </w:r>
-      <w:r>
-        <w:t xml:space="preserve"> </w:t>
+        <w:t xml:space="preserve">Nichtdeterminismus eliminieren.</w:t>
+      </w:r>
+      <w:r>
+        <w:t xml:space="preserve"> </w:t>
+      </w:r>
+      <w:r>
+        <w:t xml:space="preserve">Auf Adapter-Ebene fixiert der WireMock-Stub die LLM-Antwort (</w:t>
       </w:r>
       <w:r>
         <w:rPr>
@@ -8072,71 +8202,62 @@
         <w:t xml:space="preserve">OpenAiLlmAdapterTest</w:t>
       </w:r>
       <w:r>
-        <w:t xml:space="preserve"> </w:t>
-      </w:r>
-      <w:r>
-        <w:t xml:space="preserve">stubbt den OpenAI-HTTP-Endpoint und prüft den realen Serialisierungspfad deterministisch, offline, ohne Kosten. (c)</w:t>
-      </w:r>
-      <w:r>
-        <w:t xml:space="preserve"> </w:t>
-      </w:r>
-      <w:r>
-        <w:rPr>
-          <w:i/>
-          <w:iCs/>
-        </w:rPr>
-        <w:t xml:space="preserve">Coverage-Gate 85/70:</w:t>
-      </w:r>
-      <w:r>
-        <w:t xml:space="preserve"> </w:t>
-      </w:r>
-      <w:r>
-        <w:t xml:space="preserve">knapp unter Ist-Stand → fängt Regressionen ohne Brechen bei Schwankungen (ADR-11).</w:t>
-      </w:r>
-    </w:p>
-    <w:p>
-      <w:pPr>
-        <w:pStyle w:val="BodyText"/>
+        <w:t xml:space="preserve">). Auf Service-/IT-Ebene ersetzt der deterministische</w:t>
+      </w:r>
+      <w:r>
+        <w:t xml:space="preserve"> </w:t>
+      </w:r>
+      <w:r>
+        <w:rPr>
+          <w:rStyle w:val="VerbatimChar"/>
+        </w:rPr>
+        <w:t xml:space="preserve">FakeLlmClientAdapter</w:t>
+      </w:r>
+      <w:r>
+        <w:t xml:space="preserve"> </w:t>
+      </w:r>
+      <w:r>
+        <w:t xml:space="preserve">(aktiv via</w:t>
+      </w:r>
+      <w:r>
+        <w:t xml:space="preserve"> </w:t>
+      </w:r>
+      <w:r>
+        <w:rPr>
+          <w:rStyle w:val="VerbatimChar"/>
+        </w:rPr>
+        <w:t xml:space="preserve">@ConditionalOnMissingBean</w:t>
+      </w:r>
+      <w:r>
+        <w:t xml:space="preserve">, ohne API-Key) den Provider vollständig — die IT belegen das über</w:t>
+      </w:r>
+      <w:r>
+        <w:t xml:space="preserve"> </w:t>
+      </w:r>
+      <w:r>
+        <w:rPr>
+          <w:rStyle w:val="VerbatimChar"/>
+        </w:rPr>
+        <w:t xml:space="preserve">modelUsed = fake-llm</w:t>
+      </w:r>
+      <w:r>
+        <w:t xml:space="preserve">. So sind KI-Pfade reproduzierbar testbar, ohne dass eine generative Antwort das Ergebnis verwackelt.</w:t>
+      </w:r>
+    </w:p>
+    <w:p>
+      <w:pPr>
+        <w:pStyle w:val="Compact"/>
+        <w:numPr>
+          <w:ilvl w:val="0"/>
+          <w:numId w:val="1010"/>
+        </w:numPr>
       </w:pPr>
       <w:r>
         <w:rPr>
           <w:b/>
           <w:bCs/>
         </w:rPr>
-        <w:t xml:space="preserve">Tests der KI-Anteile.</w:t>
-      </w:r>
-      <w:r>
-        <w:t xml:space="preserve"> </w:t>
-      </w:r>
-      <w:r>
-        <w:t xml:space="preserve">Nichtdeterminismus eliminiert (WireMock-Stub auf Adapter-Ebene,</w:t>
-      </w:r>
-      <w:r>
-        <w:t xml:space="preserve"> </w:t>
-      </w:r>
-      <w:r>
-        <w:rPr>
-          <w:rStyle w:val="VerbatimChar"/>
-        </w:rPr>
-        <w:t xml:space="preserve">FakeLlmClientAdapter</w:t>
-      </w:r>
-      <w:r>
-        <w:t xml:space="preserve"> </w:t>
-      </w:r>
-      <w:r>
-        <w:t xml:space="preserve">auf Service/IT-Ebene →</w:t>
-      </w:r>
-      <w:r>
-        <w:t xml:space="preserve"> </w:t>
-      </w:r>
-      <w:r>
-        <w:rPr>
-          <w:rStyle w:val="VerbatimChar"/>
-        </w:rPr>
-        <w:t xml:space="preserve">modelUsed = fake-llm</w:t>
-      </w:r>
-      <w:r>
-        <w:t xml:space="preserve">). Guardrails:</w:t>
+        <w:t xml:space="preserve">Guardrails verifizieren.</w:t>
       </w:r>
       <w:r>
         <w:t xml:space="preserve"> </w:t>
@@ -8151,7 +8272,22 @@
         <w:t xml:space="preserve"> </w:t>
       </w:r>
       <w:r>
-        <w:t xml:space="preserve">prüft</w:t>
+        <w:t xml:space="preserve">prüft die fachlichen Vorbedingungen explizit:</w:t>
+      </w:r>
+      <w:r>
+        <w:t xml:space="preserve"> </w:t>
+      </w:r>
+      <w:r>
+        <w:rPr>
+          <w:rStyle w:val="VerbatimChar"/>
+        </w:rPr>
+        <w:t xml:space="preserve">generate_throwsWhenMatchNotCompleted</w:t>
+      </w:r>
+      <w:r>
+        <w:t xml:space="preserve"> </w:t>
+      </w:r>
+      <w:r>
+        <w:t xml:space="preserve">(Match muss</w:t>
       </w:r>
       <w:r>
         <w:t xml:space="preserve"> </w:t>
@@ -8163,7 +8299,28 @@
         <w:t xml:space="preserve">COMPLETED</w:t>
       </w:r>
       <w:r>
-        <w:t xml:space="preserve">-Vorbedingung und Mindestpunktzahl; Rate-Limit separat (</w:t>
+        <w:t xml:space="preserve"> </w:t>
+      </w:r>
+      <w:r>
+        <w:t xml:space="preserve">sein) und</w:t>
+      </w:r>
+      <w:r>
+        <w:t xml:space="preserve"> </w:t>
+      </w:r>
+      <w:r>
+        <w:rPr>
+          <w:rStyle w:val="VerbatimChar"/>
+        </w:rPr>
+        <w:t xml:space="preserve">generate_throwsWhenTooFewPoints</w:t>
+      </w:r>
+      <w:r>
+        <w:t xml:space="preserve"> </w:t>
+      </w:r>
+      <w:r>
+        <w:t xml:space="preserve">(Mindestpunktzahl). Die Kosten-Guardrail (Rate-Limit) ist separat in</w:t>
+      </w:r>
+      <w:r>
+        <w:t xml:space="preserve"> </w:t>
       </w:r>
       <w:r>
         <w:rPr>
@@ -8172,7 +8329,41 @@
         <w:t xml:space="preserve">MatchAnalysisRateLimitIT</w:t>
       </w:r>
       <w:r>
-        <w:t xml:space="preserve">). Fehlerpfade: LLM-Ausfall persistiert</w:t>
+        <w:t xml:space="preserve"> </w:t>
+      </w:r>
+      <w:r>
+        <w:t xml:space="preserve">abgedeckt (vgl. §7.1.3 / TEN-64).</w:t>
+      </w:r>
+    </w:p>
+    <w:p>
+      <w:pPr>
+        <w:pStyle w:val="Compact"/>
+        <w:numPr>
+          <w:ilvl w:val="0"/>
+          <w:numId w:val="1010"/>
+        </w:numPr>
+      </w:pPr>
+      <w:r>
+        <w:rPr>
+          <w:b/>
+          <w:bCs/>
+        </w:rPr>
+        <w:t xml:space="preserve">Fehlerpfade abdecken.</w:t>
+      </w:r>
+      <w:r>
+        <w:t xml:space="preserve"> </w:t>
+      </w:r>
+      <w:r>
+        <w:rPr>
+          <w:rStyle w:val="VerbatimChar"/>
+        </w:rPr>
+        <w:t xml:space="preserve">generate_persistsFailedAnalysisAndRethrowsOnLlmError</w:t>
+      </w:r>
+      <w:r>
+        <w:t xml:space="preserve"> </w:t>
+      </w:r>
+      <w:r>
+        <w:t xml:space="preserve">belegt: ein LLM-Ausfall persistiert einen</w:t>
       </w:r>
       <w:r>
         <w:t xml:space="preserve"> </w:t>
@@ -8184,10 +8375,23 @@
         <w:t xml:space="preserve">FAILED</w:t>
       </w:r>
       <w:r>
-        <w:t xml:space="preserve"> </w:t>
-      </w:r>
-      <w:r>
-        <w:t xml:space="preserve">und propagiert (→ 502);</w:t>
+        <w:t xml:space="preserve">-Datensatz</w:t>
+      </w:r>
+      <w:r>
+        <w:t xml:space="preserve"> </w:t>
+      </w:r>
+      <w:r>
+        <w:rPr>
+          <w:b/>
+          <w:bCs/>
+        </w:rPr>
+        <w:t xml:space="preserve">und</w:t>
+      </w:r>
+      <w:r>
+        <w:t xml:space="preserve"> </w:t>
+      </w:r>
+      <w:r>
+        <w:t xml:space="preserve">propagiert den Fehler (→ HTTP 502).</w:t>
       </w:r>
       <w:r>
         <w:t xml:space="preserve"> </w:t>
@@ -8202,11 +8406,12 @@
         <w:t xml:space="preserve"> </w:t>
       </w:r>
       <w:r>
-        <w:t xml:space="preserve">prüft 409/422/404 end-to-end.</w:t>
-      </w:r>
-    </w:p>
-    <w:bookmarkEnd w:id="74"/>
-    <w:bookmarkStart w:id="75" w:name="continuous-integration-build-gate"/>
+        <w:t xml:space="preserve">prüft die HTTP-Abbildung end-to-end gegen echtes PostgreSQL (409 nicht beendet, 422 zu wenige Punkte, 404 unbekannt/cross-tenant).</w:t>
+      </w:r>
+    </w:p>
+    <w:bookmarkEnd w:id="75"/>
+    <w:bookmarkEnd w:id="76"/>
+    <w:bookmarkStart w:id="77" w:name="continuous-integration-build-gate"/>
     <w:p>
       <w:pPr>
         <w:pStyle w:val="Heading3"/>
@@ -8388,10 +8593,10 @@
         <w:t xml:space="preserve"> </w:t>
       </w:r>
       <w:r>
-        <w:t xml:space="preserve">(Branch Protection); ohne Pfadfilter (ein nicht ausgelöster required Check würde den Merge blockieren).</w:t>
-      </w:r>
-      <w:r>
-        <w:t xml:space="preserve"> </w:t>
+        <w:t xml:space="preserve">(Branch Protection) ohne Pfadfilter (ein nicht ausgelöster required Check würde den Merge blockieren).</w:t>
+      </w:r>
+      <w:r>
+        <w:br/>
       </w:r>
       <w:r>
         <w:rPr>
@@ -8406,8 +8611,8 @@
         <w:t xml:space="preserve">(Admin-Override im Notfall).</w:t>
       </w:r>
     </w:p>
-    <w:bookmarkEnd w:id="75"/>
-    <w:bookmarkStart w:id="76" w:name="testergebnisse"/>
+    <w:bookmarkEnd w:id="77"/>
+    <w:bookmarkStart w:id="78" w:name="testergebnisse"/>
     <w:p>
       <w:pPr>
         <w:pStyle w:val="Heading3"/>
@@ -8952,16 +9157,16 @@
         <w:t xml:space="preserve">Interpretation.</w:t>
       </w:r>
       <w:r>
-        <w:t xml:space="preserve"> </w:t>
-      </w:r>
-      <w:r>
-        <w:t xml:space="preserve">Abgedeckt ist die fachliche Kernlogik (Tennis-Zählregeln, Punkt-Attribution/Statistik, Spieler-Regeln, KI-Analyse inkl. Fehlerpfade 502/422/409);</w:t>
-      </w:r>
-      <w:r>
-        <w:t xml:space="preserve"> </w:t>
-      </w:r>
-      <w:r>
-        <w:t xml:space="preserve">die IT fahren gegen echtes PostgreSQL inkl. Flyway + JWT, der</w:t>
+        <w:br/>
+      </w:r>
+      <w:r>
+        <w:t xml:space="preserve">Abgedeckt ist die fachliche Kernlogik wie Tennis-Zählregeln, Punkt-Attribution/Statistik, Spieler-Regeln und KI-Analyse inkl. Fehlerpfade 502/422/409.</w:t>
+      </w:r>
+      <w:r>
+        <w:br/>
+      </w:r>
+      <w:r>
+        <w:t xml:space="preserve">Die IntegrationTests fahren gegen eine echte PostgreSQL Instanz inkl. Flyway und JWT, der</w:t>
       </w:r>
       <w:r>
         <w:t xml:space="preserve"> </w:t>
@@ -8976,19 +9181,19 @@
         <w:t xml:space="preserve"> </w:t>
       </w:r>
       <w:r>
-        <w:t xml:space="preserve">sichert Schichten-/Modulgrenzen. Die Branch-Coverage (80 %) liegt erwartungsgemäss</w:t>
-      </w:r>
-      <w:r>
-        <w:t xml:space="preserve"> </w:t>
-      </w:r>
-      <w:r>
-        <w:t xml:space="preserve">unter der Line-Coverage — die offenen Zweige sind überwiegend defensive Pfade (Guards, Mapper-Null-Prüfungen, seltene Scoring-Verzweigungen); d</w:t>
-      </w:r>
-      <w:r>
-        <w:t xml:space="preserve"> </w:t>
-      </w:r>
-      <w:r>
-        <w:t xml:space="preserve">as 70-%-Gate verankert die Untergrenze ohne Tests für triviale Zweige zu erzwingen.</w:t>
+        <w:t xml:space="preserve">sichert die Einhaltung der Schichten-/Modulgrenzen.</w:t>
+      </w:r>
+      <w:r>
+        <w:br/>
+      </w:r>
+      <w:r>
+        <w:t xml:space="preserve">Die Branch-Coverage (80 %) liegt erwartungsgemäss unter der Line-Coverage — die offenen Zweige sind überwiegend defensive Pfade (Guards, Mapper-Null-Prüfungen,</w:t>
+      </w:r>
+      <w:r>
+        <w:t xml:space="preserve"> </w:t>
+      </w:r>
+      <w:r>
+        <w:t xml:space="preserve">seltene Scoring-Verzweigungen). Das 70-%-Gate sichert eine Untergrenze, ohne für jeden trivialen Zweig einen Test zu erzwingen.</w:t>
       </w:r>
       <w:r>
         <w:t xml:space="preserve"> </w:t>
@@ -9019,9 +9224,9 @@
         </w:pict>
       </w:r>
     </w:p>
-    <w:bookmarkEnd w:id="76"/>
-    <w:bookmarkEnd w:id="77"/>
-    <w:bookmarkStart w:id="78" w:name="architekturentscheidungen"/>
+    <w:bookmarkEnd w:id="78"/>
+    <w:bookmarkEnd w:id="79"/>
+    <w:bookmarkStart w:id="80" w:name="architekturentscheidungen"/>
     <w:p>
       <w:pPr>
         <w:pStyle w:val="Heading2"/>
@@ -9035,7 +9240,7 @@
         <w:pStyle w:val="FirstParagraph"/>
       </w:pPr>
       <w:r>
-        <w:t xml:space="preserve">Architecture Decision Records (ADR), je als Entscheidung + Begründung. Alle Status</w:t>
+        <w:t xml:space="preserve">Architecture Decision Records (ADR), jede Entscheidung mit Begründung. Alle Status sind</w:t>
       </w:r>
       <w:r>
         <w:t xml:space="preserve"> </w:t>
@@ -9045,10 +9250,10 @@
           <w:b/>
           <w:bCs/>
         </w:rPr>
-        <w:t xml:space="preserve">Akzeptiert</w:t>
-      </w:r>
-      <w:r>
-        <w:t xml:space="preserve">. Inhaltlich manuell entschieden (siehe §14.2); die KI half nur beim Ausformulieren.</w:t>
+        <w:t xml:space="preserve">akzeptiert</w:t>
+      </w:r>
+      <w:r>
+        <w:t xml:space="preserve">. Inhaltlich manuell entschieden (siehe §14.2), die KI half nur beim Ausformulieren.</w:t>
       </w:r>
     </w:p>
     <w:p>
@@ -9066,7 +9271,19 @@
         <w:t xml:space="preserve"> </w:t>
       </w:r>
       <w:r>
-        <w:t xml:space="preserve">V1 ist klein und wird von einem kleinen Team gebaut; Microservice-Komplexität (Service Discovery, verteilte Transaktionen, Netzwerk-Overhead) ist nicht gerechtfertigt. Die Modularisierung als Gradle-Multi-Module erzwingt Modulgrenzen auf Compile-Ebene und erleichtert spätere Service-Extraktion.</w:t>
+        <w:t xml:space="preserve">V1 ist klein und wird von einem kleinen Team gebaut. Die Microservice-Komplexität (Komplexeres Deployment, Netzwerk-Overhead,</w:t>
+      </w:r>
+      <w:r>
+        <w:t xml:space="preserve"> </w:t>
+      </w:r>
+      <w:r>
+        <w:t xml:space="preserve">Fehlerbehandlung und Recovery bei Ausfall …) ist hier nicht gerechtfertigt. Die Modularisierung als Gradle-Multi-Module erzwingt Modulgrenzen auf Compile-Ebene</w:t>
+      </w:r>
+      <w:r>
+        <w:t xml:space="preserve"> </w:t>
+      </w:r>
+      <w:r>
+        <w:t xml:space="preserve">und erleichtert eine spätere Service-Extraktion.</w:t>
       </w:r>
     </w:p>
     <w:p>
@@ -9099,7 +9316,13 @@
         <w:t xml:space="preserve"> </w:t>
       </w:r>
       <w:r>
-        <w:t xml:space="preserve">ans Backend. Ermöglicht unabhängige Skalierung und saubere Separation of Concerns (übliches SPA-+-REST-Muster).</w:t>
+        <w:t xml:space="preserve">ans Backend.</w:t>
+      </w:r>
+      <w:r>
+        <w:t xml:space="preserve"> </w:t>
+      </w:r>
+      <w:r>
+        <w:t xml:space="preserve">Ermöglicht unabhängige Skalierung und saubere Separation of Concerns (übliches SPA-+-REST-Muster).</w:t>
       </w:r>
     </w:p>
     <w:p>
@@ -9153,7 +9376,7 @@
         <w:t xml:space="preserve"> </w:t>
       </w:r>
       <w:r>
-        <w:t xml:space="preserve">JSON/REST ist Web-Standard, gut tooling-unterstützt und via OpenAPI/Swagger dokumentierbar. GraphQL erhöht die Komplexität unnötig.</w:t>
+        <w:t xml:space="preserve">JSON/REST ist Web-Standard, gut tooling-unterstützt und via OpenAPI/Swagger dokumentierbar. GraphQL würde die Komplexität unnötig erhöhen.</w:t>
       </w:r>
     </w:p>
     <w:p>
@@ -9171,7 +9394,13 @@
         <w:t xml:space="preserve"> </w:t>
       </w:r>
       <w:r>
-        <w:t xml:space="preserve">Eine PostgreSQL-Instanz, stabiles Schema (6 Kernentitäten): Flyway versioniert plain-SQL ohne XML/YAML-Overhead und ist in Spring Boot auto-konfiguriert. Liquibase-Flexibilität (DB-agnostisch, Rollback-Skripte, Diff) ist nicht nötig (kein DB-Wechsel geplant; Rollbacks via Backup). Skripte unter</w:t>
+        <w:t xml:space="preserve">Eine PostgreSQL-Instanz, stabiles Schema (6 Kernentitäten): Flyway versioniert plain-SQL ohne XML/YAML-Overhead und ist in Spring Boot auto-konfiguriert.</w:t>
+      </w:r>
+      <w:r>
+        <w:t xml:space="preserve"> </w:t>
+      </w:r>
+      <w:r>
+        <w:t xml:space="preserve">Liquibase-Flexibilität (DB-agnostisch, Rollback-Skripte, Diff) ist nicht nötig (kein DB-Wechsel geplant; Rollbacks via Backup). Skripte unter</w:t>
       </w:r>
       <w:r>
         <w:t xml:space="preserve"> </w:t>
@@ -9213,7 +9442,19 @@
         <w:t xml:space="preserve"> </w:t>
       </w:r>
       <w:r>
-        <w:t xml:space="preserve">Spring Modulith verworfen, weil es modulübergreifend standardmässig auf Application-Events (asynchron) setzt — unnötige Komplexität für synchrone Antworten. Explizite Application-Layer-Interfaces (Ports &amp; Adapters) bilden die Kommunikation sauberer ab; Gradle-Module erzwingen Grenzen zur Compile-Zeit (unerwünschte Abhängigkeiten = Build-Fehler) und erleichtern spätere Service-Extraktion.</w:t>
+        <w:t xml:space="preserve">Spring Modulith verworfen, weil es modulübergreifend standardmässig auf Application-Events (asynchron)</w:t>
+      </w:r>
+      <w:r>
+        <w:t xml:space="preserve"> </w:t>
+      </w:r>
+      <w:r>
+        <w:t xml:space="preserve">setzt — unnötige Komplexität für synchrone Antworten. Explizite Application-Layer-Interfaces (Ports &amp; Adapters) bilden die Kommunikation sauberer ab.</w:t>
+      </w:r>
+      <w:r>
+        <w:t xml:space="preserve"> </w:t>
+      </w:r>
+      <w:r>
+        <w:t xml:space="preserve">Gradle-Module erzwingen Grenzen zur Compile-Zeit (unerwünschte Abhängigkeiten = Build-Fehler) und erleichtern spätere Service-Extraktion.</w:t>
       </w:r>
     </w:p>
     <w:p>
@@ -9231,7 +9472,19 @@
         <w:t xml:space="preserve"> </w:t>
       </w:r>
       <w:r>
-        <w:t xml:space="preserve">Nutzer bedienen die App während des Matches auf Tablet/Smartphone; Material liefert out-of-the-box touch-optimierte, responsive Komponenten für schnelle Punkterfassung, ist eng mit Angular verzahnt und kostenfrei. ngx-charts ergänzt die Statistik-Visualisierung (FA-08). PrimeNG (Alternative) wäre für V1 Over-Engineering.</w:t>
+        <w:t xml:space="preserve">Nutzer bedienen die App während des Matches auf Tablet/Smartphone. Material liefert out-of-the-box touch-optimierte,</w:t>
+      </w:r>
+      <w:r>
+        <w:t xml:space="preserve"> </w:t>
+      </w:r>
+      <w:r>
+        <w:t xml:space="preserve">responsive Komponenten für schnelle Punkterfassung, ist eng mit Angular verzahnt und kostenfrei. ngx-charts ergänzt die Statistik-Visualisierung (FA-08). Die Alternative PrimeNG</w:t>
+      </w:r>
+      <w:r>
+        <w:t xml:space="preserve"> </w:t>
+      </w:r>
+      <w:r>
+        <w:t xml:space="preserve">wäre für V1 Over-Engineering.</w:t>
       </w:r>
     </w:p>
     <w:p>
@@ -9243,731 +9496,919 @@
           <w:b/>
           <w:bCs/>
         </w:rPr>
-        <w:t xml:space="preserve">ADR-09 ·</w:t>
-      </w:r>
+        <w:t xml:space="preserve">ADR-09 · angular-oauth2-oidc statt keycloak-angular.</w:t>
+      </w:r>
+      <w:r>
+        <w:t xml:space="preserve"> </w:t>
+      </w:r>
+      <w:r>
+        <w:t xml:space="preserve">Generische, standard-konforme OIDC-Library ohne Keycloak-Coupling im Frontend-Code — ein IDP-Wechsel ändert nur Konfiguration, nicht Code.</w:t>
+      </w:r>
+      <w:r>
+        <w:t xml:space="preserve"> </w:t>
+      </w:r>
+      <w:r>
+        <w:t xml:space="preserve">Schlanker (keine</w:t>
+      </w:r>
+      <w:r>
+        <w:t xml:space="preserve"> </w:t>
+      </w:r>
+      <w:r>
+        <w:rPr>
+          <w:rStyle w:val="VerbatimChar"/>
+        </w:rPr>
+        <w:t xml:space="preserve">keycloak-js</w:t>
+      </w:r>
+      <w:r>
+        <w:t xml:space="preserve">-Abhängigkeit), native PKCE-Unterstützung, aktiv gepflegt. Umsetzung:</w:t>
+      </w:r>
+      <w:r>
+        <w:t xml:space="preserve"> </w:t>
+      </w:r>
+      <w:r>
+        <w:rPr>
+          <w:rStyle w:val="VerbatimChar"/>
+        </w:rPr>
+        <w:t xml:space="preserve">OAuthModuleConfig</w:t>
+      </w:r>
+      <w:r>
+        <w:t xml:space="preserve">, Bearer-Token-Interceptor,</w:t>
+      </w:r>
+      <w:r>
+        <w:t xml:space="preserve"> </w:t>
+      </w:r>
+      <w:r>
+        <w:rPr>
+          <w:rStyle w:val="VerbatimChar"/>
+        </w:rPr>
+        <w:t xml:space="preserve">CanActivateFn</w:t>
+      </w:r>
+      <w:r>
+        <w:t xml:space="preserve">-Guard auf allen Routes.</w:t>
+      </w:r>
+    </w:p>
+    <w:p>
+      <w:pPr>
+        <w:pStyle w:val="BodyText"/>
+      </w:pPr>
       <w:r>
         <w:rPr>
           <w:b/>
           <w:bCs/>
         </w:rPr>
-        <w:t xml:space="preserve"> </w:t>
-      </w:r>
-      <w:r>
-        <w:rPr>
-          <w:rStyle w:val="VerbatimChar"/>
+        <w:t xml:space="preserve">ADR-10 · Spring AI mit OpenAI. Provider-Abstraktion via</w:t>
+      </w:r>
+      <w:r>
+        <w:rPr>
           <w:b/>
           <w:bCs/>
         </w:rPr>
-        <w:t xml:space="preserve">angular-oauth2-oidc</w:t>
-      </w:r>
-      <w:r>
-        <w:rPr>
+        <w:t xml:space="preserve"> </w:t>
+      </w:r>
+      <w:r>
+        <w:rPr>
+          <w:rStyle w:val="VerbatimChar"/>
           <w:b/>
           <w:bCs/>
         </w:rPr>
-        <w:t xml:space="preserve"> </w:t>
+        <w:t xml:space="preserve">LlmClientPort</w:t>
       </w:r>
       <w:r>
         <w:rPr>
           <w:b/>
           <w:bCs/>
         </w:rPr>
-        <w:t xml:space="preserve">statt</w:t>
+        <w:t xml:space="preserve">.</w:t>
+      </w:r>
+      <w:r>
+        <w:t xml:space="preserve"> </w:t>
+      </w:r>
+      <w:r>
+        <w:t xml:space="preserve">Spring AI 2.0.x (Boot-4-kompatibel) liefert mit</w:t>
+      </w:r>
+      <w:r>
+        <w:t xml:space="preserve"> </w:t>
+      </w:r>
+      <w:r>
+        <w:rPr>
+          <w:rStyle w:val="VerbatimChar"/>
+        </w:rPr>
+        <w:t xml:space="preserve">ChatClient.entity(Class)</w:t>
+      </w:r>
+      <w:r>
+        <w:t xml:space="preserve"> </w:t>
+      </w:r>
+      <w:r>
+        <w:t xml:space="preserve">strukturierten JSON-Output</w:t>
+      </w:r>
+      <w:r>
+        <w:t xml:space="preserve"> </w:t>
+      </w:r>
+      <w:r>
+        <w:t xml:space="preserve">statt fragiler Parser. OpenAI als initialer Provider (Default</w:t>
+      </w:r>
+      <w:r>
+        <w:t xml:space="preserve"> </w:t>
+      </w:r>
+      <w:r>
+        <w:rPr>
+          <w:rStyle w:val="VerbatimChar"/>
+        </w:rPr>
+        <w:t xml:space="preserve">gpt-4o-mini</w:t>
+      </w:r>
+      <w:r>
+        <w:t xml:space="preserve">, via Property tauschbar); ein zweiter Adapter (Anthropic, Ollama) ist über den Out-Port</w:t>
+      </w:r>
+      <w:r>
+        <w:t xml:space="preserve"> </w:t>
+      </w:r>
+      <w:r>
+        <w:rPr>
+          <w:rStyle w:val="VerbatimChar"/>
+        </w:rPr>
+        <w:t xml:space="preserve">LlmClientPort</w:t>
+      </w:r>
+      <w:r>
+        <w:t xml:space="preserve"> </w:t>
+      </w:r>
+      <w:r>
+        <w:t xml:space="preserve">ohne Use-Case-Eingriff ergänzbar. Aktivierung des</w:t>
+      </w:r>
+      <w:r>
+        <w:t xml:space="preserve"> </w:t>
+      </w:r>
+      <w:r>
+        <w:rPr>
+          <w:rStyle w:val="VerbatimChar"/>
+        </w:rPr>
+        <w:t xml:space="preserve">OpenAiLlmAdapter</w:t>
+      </w:r>
+      <w:r>
+        <w:t xml:space="preserve"> </w:t>
+      </w:r>
+      <w:r>
+        <w:t xml:space="preserve">per</w:t>
+      </w:r>
+      <w:r>
+        <w:t xml:space="preserve"> </w:t>
+      </w:r>
+      <w:r>
+        <w:rPr>
+          <w:rStyle w:val="VerbatimChar"/>
+        </w:rPr>
+        <w:t xml:space="preserve">@ConditionalOnExpression</w:t>
+      </w:r>
+      <w:r>
+        <w:t xml:space="preserve"> </w:t>
+      </w:r>
+      <w:r>
+        <w:t xml:space="preserve">auf nicht-leeren API-Key, sonst deterministischer</w:t>
+      </w:r>
+      <w:r>
+        <w:t xml:space="preserve"> </w:t>
+      </w:r>
+      <w:r>
+        <w:rPr>
+          <w:rStyle w:val="VerbatimChar"/>
+        </w:rPr>
+        <w:t xml:space="preserve">FakeLlmClientAdapter</w:t>
+      </w:r>
+      <w:r>
+        <w:t xml:space="preserve">.</w:t>
+      </w:r>
+      <w:r>
+        <w:t xml:space="preserve"> </w:t>
+      </w:r>
+      <w:r>
+        <w:t xml:space="preserve">Analyse wird einmal pro Match generiert und persistiert (Kostenkontrolle, Reproduzierbarkeit).</w:t>
+      </w:r>
+      <w:r>
+        <w:t xml:space="preserve"> </w:t>
       </w:r>
       <w:r>
         <w:rPr>
           <w:b/>
           <w:bCs/>
         </w:rPr>
-        <w:t xml:space="preserve"> </w:t>
-      </w:r>
-      <w:r>
-        <w:rPr>
-          <w:rStyle w:val="VerbatimChar"/>
+        <w:t xml:space="preserve">Bewusst kein RAG / keine Vektor-DB:</w:t>
+      </w:r>
+      <w:r>
+        <w:t xml:space="preserve"> </w:t>
+      </w:r>
+      <w:r>
+        <w:t xml:space="preserve">der Analyse-Input ist strukturierte</w:t>
+      </w:r>
+      <w:r>
+        <w:t xml:space="preserve"> </w:t>
+      </w:r>
+      <w:r>
+        <w:t xml:space="preserve">Numerik (wenige Dutzend Felder pro Match), passt in einen Prompt-Context; eine Embedding-Schicht wäre Over-Engineering. Für V2 (Head-to-Head über N Matches) wird das neu bewertet.</w:t>
+      </w:r>
+    </w:p>
+    <w:p>
+      <w:pPr>
+        <w:pStyle w:val="BodyText"/>
+      </w:pPr>
+      <w:r>
+        <w:rPr>
           <w:b/>
           <w:bCs/>
         </w:rPr>
-        <w:t xml:space="preserve">keycloak-angular</w:t>
+        <w:t xml:space="preserve">ADR-11 · GitHub Actions und aggregiertes JaCoCo-Coverage-Gate.</w:t>
+      </w:r>
+      <w:r>
+        <w:t xml:space="preserve"> </w:t>
+      </w:r>
+      <w:r>
+        <w:t xml:space="preserve">Qualität wird erzwungen, nicht nur empfohlen: Zwei GitHub-Actions-Workflows (Backend und Frontend) laufen bei</w:t>
+      </w:r>
+      <w:r>
+        <w:t xml:space="preserve"> </w:t>
+      </w:r>
+      <w:r>
+        <w:t xml:space="preserve">jedem Push und Pull Request auf</w:t>
+      </w:r>
+      <w:r>
+        <w:t xml:space="preserve"> </w:t>
+      </w:r>
+      <w:r>
+        <w:rPr>
+          <w:rStyle w:val="VerbatimChar"/>
+        </w:rPr>
+        <w:t xml:space="preserve">develop</w:t>
+      </w:r>
+      <w:r>
+        <w:t xml:space="preserve"> </w:t>
+      </w:r>
+      <w:r>
+        <w:t xml:space="preserve">und</w:t>
+      </w:r>
+      <w:r>
+        <w:t xml:space="preserve"> </w:t>
+      </w:r>
+      <w:r>
+        <w:rPr>
+          <w:rStyle w:val="VerbatimChar"/>
+        </w:rPr>
+        <w:t xml:space="preserve">main</w:t>
+      </w:r>
+      <w:r>
+        <w:t xml:space="preserve"> </w:t>
+      </w:r>
+      <w:r>
+        <w:t xml:space="preserve">und sind als</w:t>
+      </w:r>
+      <w:r>
+        <w:t xml:space="preserve"> </w:t>
+      </w:r>
+      <w:r>
+        <w:rPr>
+          <w:i/>
+          <w:iCs/>
+        </w:rPr>
+        <w:t xml:space="preserve">required status checks</w:t>
+      </w:r>
+      <w:r>
+        <w:t xml:space="preserve"> </w:t>
+      </w:r>
+      <w:r>
+        <w:t xml:space="preserve">gesetzt — ohne beide grün kein Merge.</w:t>
+      </w:r>
+      <w:r>
+        <w:t xml:space="preserve"> </w:t>
+      </w:r>
+      <w:r>
+        <w:t xml:space="preserve">Die Backend-Coverage misst JaCoCo modulübergreifend als Summe: Die Integrationstests liegen im</w:t>
+      </w:r>
+      <w:r>
+        <w:t xml:space="preserve"> </w:t>
+      </w:r>
+      <w:r>
+        <w:rPr>
+          <w:rStyle w:val="VerbatimChar"/>
+        </w:rPr>
+        <w:t xml:space="preserve">app</w:t>
+      </w:r>
+      <w:r>
+        <w:t xml:space="preserve">-Modul, decken aber alle Module ab,</w:t>
+      </w:r>
+      <w:r>
+        <w:t xml:space="preserve"> </w:t>
+      </w:r>
+      <w:r>
+        <w:t xml:space="preserve">weshalb ein Gate pro Modul zu niedrig zählen würde. Das Gate hängt in</w:t>
+      </w:r>
+      <w:r>
+        <w:t xml:space="preserve"> </w:t>
+      </w:r>
+      <w:r>
+        <w:rPr>
+          <w:rStyle w:val="VerbatimChar"/>
+        </w:rPr>
+        <w:t xml:space="preserve">check</w:t>
+      </w:r>
+      <w:r>
+        <w:t xml:space="preserve"> </w:t>
+      </w:r>
+      <w:r>
+        <w:t xml:space="preserve">und verlangt</w:t>
+      </w:r>
+      <w:r>
+        <w:t xml:space="preserve"> </w:t>
       </w:r>
       <w:r>
         <w:rPr>
           <w:b/>
           <w:bCs/>
         </w:rPr>
-        <w:t xml:space="preserve">.</w:t>
-      </w:r>
-      <w:r>
-        <w:t xml:space="preserve"> </w:t>
-      </w:r>
-      <w:r>
-        <w:t xml:space="preserve">Generische, standard-konforme OIDC-Library ohne Keycloak-Coupling im Frontend-Code — ein IDP-Wechsel ändert nur Konfiguration, nicht Code. Schlanker (keine</w:t>
-      </w:r>
-      <w:r>
-        <w:t xml:space="preserve"> </w:t>
-      </w:r>
-      <w:r>
-        <w:rPr>
-          <w:rStyle w:val="VerbatimChar"/>
-        </w:rPr>
-        <w:t xml:space="preserve">keycloak-js</w:t>
-      </w:r>
-      <w:r>
-        <w:t xml:space="preserve">-Abhängigkeit), native PKCE-Unterstützung, aktiv gepflegt. Umsetzung:</w:t>
-      </w:r>
-      <w:r>
-        <w:t xml:space="preserve"> </w:t>
-      </w:r>
-      <w:r>
-        <w:rPr>
-          <w:rStyle w:val="VerbatimChar"/>
-        </w:rPr>
-        <w:t xml:space="preserve">OAuthModuleConfig</w:t>
-      </w:r>
-      <w:r>
-        <w:t xml:space="preserve">, Bearer-Token-Interceptor,</w:t>
-      </w:r>
-      <w:r>
-        <w:t xml:space="preserve"> </w:t>
-      </w:r>
-      <w:r>
-        <w:rPr>
-          <w:rStyle w:val="VerbatimChar"/>
-        </w:rPr>
-        <w:t xml:space="preserve">CanActivateFn</w:t>
-      </w:r>
-      <w:r>
-        <w:t xml:space="preserve">-Guard auf allen Routes.</w:t>
-      </w:r>
-    </w:p>
-    <w:p>
-      <w:pPr>
-        <w:pStyle w:val="BodyText"/>
-      </w:pPr>
+        <w:t xml:space="preserve">85 % Line / 70 % Branch</w:t>
+      </w:r>
+      <w:r>
+        <w:t xml:space="preserve"> </w:t>
+      </w:r>
+      <w:r>
+        <w:t xml:space="preserve">—</w:t>
+      </w:r>
+      <w:r>
+        <w:t xml:space="preserve"> </w:t>
+      </w:r>
+      <w:r>
+        <w:t xml:space="preserve">bewusst knapp unter dem Ist-Stand (~95 % / ~80 %), damit normale Schwankungen den Build nicht brechen. Die Workflows laufen</w:t>
+      </w:r>
+      <w:r>
+        <w:t xml:space="preserve"> </w:t>
+      </w:r>
+      <w:r>
+        <w:t xml:space="preserve">absichtlich</w:t>
+      </w:r>
+      <w:r>
+        <w:t xml:space="preserve"> </w:t>
+      </w:r>
       <w:r>
         <w:rPr>
           <w:b/>
           <w:bCs/>
         </w:rPr>
-        <w:t xml:space="preserve">ADR-10 · Spring AI mit OpenAI; Provider-Abstraktion via</w:t>
-      </w:r>
+        <w:t xml:space="preserve">ohne Pfadfilter</w:t>
+      </w:r>
+      <w:r>
+        <w:t xml:space="preserve">, da ein</w:t>
+      </w:r>
+      <w:r>
+        <w:t xml:space="preserve"> </w:t>
+      </w:r>
+      <w:r>
+        <w:rPr>
+          <w:rStyle w:val="VerbatimChar"/>
+        </w:rPr>
+        <w:t xml:space="preserve">required Check</w:t>
+      </w:r>
+      <w:r>
+        <w:t xml:space="preserve">, der wegen eines Pfadfilters gar nicht erst startet, den Merge sonst</w:t>
+      </w:r>
+      <w:r>
+        <w:t xml:space="preserve"> </w:t>
+      </w:r>
+      <w:r>
+        <w:t xml:space="preserve">dauerhaft blockieren würde. Damit ein Administrator zur Not auch ohne die</w:t>
+      </w:r>
+      <w:r>
+        <w:t xml:space="preserve"> </w:t>
+      </w:r>
+      <w:r>
+        <w:rPr>
+          <w:rStyle w:val="VerbatimChar"/>
+        </w:rPr>
+        <w:t xml:space="preserve">required Checks</w:t>
+      </w:r>
+      <w:r>
+        <w:t xml:space="preserve"> </w:t>
+      </w:r>
+      <w:r>
+        <w:t xml:space="preserve">einen Merge durchführen kann, bleibt</w:t>
+      </w:r>
+      <w:r>
+        <w:t xml:space="preserve"> </w:t>
+      </w:r>
+      <w:r>
+        <w:rPr>
+          <w:rStyle w:val="VerbatimChar"/>
+        </w:rPr>
+        <w:t xml:space="preserve">enforce_admins</w:t>
+      </w:r>
+      <w:r>
+        <w:t xml:space="preserve"> </w:t>
+      </w:r>
+      <w:r>
+        <w:t xml:space="preserve">auf</w:t>
+      </w:r>
+      <w:r>
+        <w:t xml:space="preserve"> </w:t>
+      </w:r>
+      <w:r>
+        <w:rPr>
+          <w:rStyle w:val="VerbatimChar"/>
+        </w:rPr>
+        <w:t xml:space="preserve">false</w:t>
+      </w:r>
+      <w:r>
+        <w:t xml:space="preserve"> </w:t>
+      </w:r>
+      <w:r>
+        <w:t xml:space="preserve">gesetzt.</w:t>
+      </w:r>
+    </w:p>
+    <w:p>
+      <w:pPr>
+        <w:pStyle w:val="BodyText"/>
+      </w:pPr>
       <w:r>
         <w:rPr>
           <w:b/>
           <w:bCs/>
         </w:rPr>
-        <w:t xml:space="preserve"> </w:t>
-      </w:r>
-      <w:r>
-        <w:rPr>
-          <w:rStyle w:val="VerbatimChar"/>
+        <w:t xml:space="preserve">ADR-12 · Scoring im</w:t>
+      </w:r>
+      <w:r>
+        <w:rPr>
           <w:b/>
           <w:bCs/>
         </w:rPr>
-        <w:t xml:space="preserve">LlmClientPort</w:t>
-      </w:r>
-      <w:r>
-        <w:rPr>
+        <w:t xml:space="preserve"> </w:t>
+      </w:r>
+      <w:r>
+        <w:rPr>
+          <w:rStyle w:val="VerbatimChar"/>
           <w:b/>
           <w:bCs/>
         </w:rPr>
-        <w:t xml:space="preserve">.</w:t>
-      </w:r>
-      <w:r>
-        <w:t xml:space="preserve"> </w:t>
-      </w:r>
-      <w:r>
-        <w:t xml:space="preserve">Spring AI 2.0.x (Boot-4-kompatibel) liefert mit</w:t>
-      </w:r>
-      <w:r>
-        <w:t xml:space="preserve"> </w:t>
-      </w:r>
-      <w:r>
-        <w:rPr>
-          <w:rStyle w:val="VerbatimChar"/>
-        </w:rPr>
-        <w:t xml:space="preserve">ChatClient.entity(Class)</w:t>
-      </w:r>
-      <w:r>
-        <w:t xml:space="preserve"> </w:t>
-      </w:r>
-      <w:r>
-        <w:t xml:space="preserve">strukturierten JSON-Output statt fragiler Parser. OpenAI als initialer Provider (Default</w:t>
-      </w:r>
-      <w:r>
-        <w:t xml:space="preserve"> </w:t>
-      </w:r>
-      <w:r>
-        <w:rPr>
-          <w:rStyle w:val="VerbatimChar"/>
-        </w:rPr>
-        <w:t xml:space="preserve">gpt-4o-mini</w:t>
-      </w:r>
-      <w:r>
-        <w:t xml:space="preserve">, via Property tauschbar); ein zweiter Adapter (Anthropic, Ollama) ist über den Out-Port</w:t>
-      </w:r>
-      <w:r>
-        <w:t xml:space="preserve"> </w:t>
-      </w:r>
-      <w:r>
-        <w:rPr>
-          <w:rStyle w:val="VerbatimChar"/>
-        </w:rPr>
-        <w:t xml:space="preserve">LlmClientPort</w:t>
-      </w:r>
-      <w:r>
-        <w:t xml:space="preserve"> </w:t>
-      </w:r>
-      <w:r>
-        <w:t xml:space="preserve">ohne Use-Case-Eingriff ergänzbar. Aktivierung des</w:t>
-      </w:r>
-      <w:r>
-        <w:t xml:space="preserve"> </w:t>
-      </w:r>
-      <w:r>
-        <w:rPr>
-          <w:rStyle w:val="VerbatimChar"/>
-        </w:rPr>
-        <w:t xml:space="preserve">OpenAiLlmAdapter</w:t>
-      </w:r>
-      <w:r>
-        <w:t xml:space="preserve"> </w:t>
-      </w:r>
-      <w:r>
-        <w:t xml:space="preserve">per</w:t>
-      </w:r>
-      <w:r>
-        <w:t xml:space="preserve"> </w:t>
-      </w:r>
-      <w:r>
-        <w:rPr>
-          <w:rStyle w:val="VerbatimChar"/>
-        </w:rPr>
-        <w:t xml:space="preserve">@ConditionalOnExpression</w:t>
-      </w:r>
-      <w:r>
-        <w:t xml:space="preserve"> </w:t>
-      </w:r>
-      <w:r>
-        <w:t xml:space="preserve">auf nicht-leeren API-Key, sonst deterministischer</w:t>
-      </w:r>
-      <w:r>
-        <w:t xml:space="preserve"> </w:t>
-      </w:r>
-      <w:r>
-        <w:rPr>
-          <w:rStyle w:val="VerbatimChar"/>
-        </w:rPr>
-        <w:t xml:space="preserve">FakeLlmClientAdapter</w:t>
-      </w:r>
-      <w:r>
-        <w:t xml:space="preserve">. Analyse wird einmal pro Match generiert und persistiert (Kostenkontrolle, Reproduzierbarkeit).</w:t>
-      </w:r>
-      <w:r>
-        <w:t xml:space="preserve"> </w:t>
+        <w:t xml:space="preserve">match-module</w:t>
       </w:r>
       <w:r>
         <w:rPr>
           <w:b/>
           <w:bCs/>
         </w:rPr>
-        <w:t xml:space="preserve">Bewusst kein RAG / keine Vektor-DB:</w:t>
-      </w:r>
-      <w:r>
-        <w:t xml:space="preserve"> </w:t>
-      </w:r>
-      <w:r>
-        <w:t xml:space="preserve">der Analyse-Input ist strukturierte Numerik (wenige Dutzend Felder pro Match), passt in einen Prompt-Context; eine Embedding-Schicht wäre Over-Engineering. Für V2 (Head-to-Head über N Matches) wird das neu bewertet.</w:t>
-      </w:r>
-    </w:p>
-    <w:p>
-      <w:pPr>
-        <w:pStyle w:val="BodyText"/>
-      </w:pPr>
+        <w:t xml:space="preserve"> </w:t>
+      </w:r>
       <w:r>
         <w:rPr>
           <w:b/>
           <w:bCs/>
         </w:rPr>
-        <w:t xml:space="preserve">ADR-11 · GitHub Actions + aggregiertes JaCoCo-Coverage-Gate.</w:t>
-      </w:r>
-      <w:r>
-        <w:t xml:space="preserve"> </w:t>
-      </w:r>
-      <w:r>
-        <w:t xml:space="preserve">Qualität wird durchgesetzt statt empfohlen: zwei pfad-ungefilterte Workflows (Backend, Frontend) auf</w:t>
-      </w:r>
-      <w:r>
-        <w:t xml:space="preserve"> </w:t>
-      </w:r>
-      <w:r>
-        <w:rPr>
-          <w:rStyle w:val="VerbatimChar"/>
-        </w:rPr>
-        <w:t xml:space="preserve">develop</w:t>
-      </w:r>
-      <w:r>
-        <w:t xml:space="preserve">/</w:t>
-      </w:r>
-      <w:r>
-        <w:rPr>
-          <w:rStyle w:val="VerbatimChar"/>
-        </w:rPr>
-        <w:t xml:space="preserve">main</w:t>
-      </w:r>
-      <w:r>
-        <w:t xml:space="preserve"> </w:t>
-      </w:r>
-      <w:r>
-        <w:t xml:space="preserve">als required status checks. Coverage modulübergreifend aggregiert (IT im</w:t>
-      </w:r>
-      <w:r>
-        <w:t xml:space="preserve"> </w:t>
-      </w:r>
-      <w:r>
-        <w:rPr>
-          <w:rStyle w:val="VerbatimChar"/>
-        </w:rPr>
-        <w:t xml:space="preserve">app</w:t>
-      </w:r>
-      <w:r>
-        <w:t xml:space="preserve">-Modul decken alle Module ab → per-Modul-Gate würde unterzählen), Gate in</w:t>
-      </w:r>
-      <w:r>
-        <w:t xml:space="preserve"> </w:t>
-      </w:r>
-      <w:r>
-        <w:rPr>
-          <w:rStyle w:val="VerbatimChar"/>
-        </w:rPr>
-        <w:t xml:space="preserve">check</w:t>
-      </w:r>
-      <w:r>
-        <w:t xml:space="preserve"> </w:t>
-      </w:r>
-      <w:r>
-        <w:t xml:space="preserve">(</w:t>
+        <w:t xml:space="preserve">statt eigenem</w:t>
       </w:r>
       <w:r>
         <w:rPr>
           <w:b/>
           <w:bCs/>
         </w:rPr>
-        <w:t xml:space="preserve">85 % Line / 70 % Branch</w:t>
-      </w:r>
-      <w:r>
-        <w:t xml:space="preserve">, knapp unter Ist ~95/80). Pfadfilter entfernt (ein nicht ausgelöster required Check blockiert den Merge dauerhaft);</w:t>
-      </w:r>
-      <w:r>
-        <w:t xml:space="preserve"> </w:t>
-      </w:r>
-      <w:r>
-        <w:rPr>
-          <w:rStyle w:val="VerbatimChar"/>
-        </w:rPr>
-        <w:t xml:space="preserve">enforce_admins=false</w:t>
-      </w:r>
-      <w:r>
-        <w:t xml:space="preserve">.</w:t>
-      </w:r>
-    </w:p>
-    <w:p>
-      <w:pPr>
-        <w:pStyle w:val="BodyText"/>
-      </w:pPr>
-      <w:r>
-        <w:rPr>
+        <w:t xml:space="preserve"> </w:t>
+      </w:r>
+      <w:r>
+        <w:rPr>
+          <w:rStyle w:val="VerbatimChar"/>
           <w:b/>
           <w:bCs/>
         </w:rPr>
-        <w:t xml:space="preserve">ADR-12 · Scoring im</w:t>
+        <w:t xml:space="preserve">scoring-module</w:t>
       </w:r>
       <w:r>
         <w:rPr>
           <w:b/>
           <w:bCs/>
         </w:rPr>
-        <w:t xml:space="preserve"> </w:t>
-      </w:r>
-      <w:r>
-        <w:rPr>
-          <w:rStyle w:val="VerbatimChar"/>
+        <w:t xml:space="preserve">.</w:t>
+      </w:r>
+      <w:r>
+        <w:t xml:space="preserve"> </w:t>
+      </w:r>
+      <w:r>
+        <w:t xml:space="preserve">Bei der Umsetzung konsolidiert: Punkte erfassen/zählen ist das</w:t>
+      </w:r>
+      <w:r>
+        <w:t xml:space="preserve"> </w:t>
+      </w:r>
+      <w:r>
+        <w:rPr>
           <w:b/>
           <w:bCs/>
         </w:rPr>
-        <w:t xml:space="preserve">match-module</w:t>
-      </w:r>
+        <w:t xml:space="preserve">Kernverhalten</w:t>
+      </w:r>
+      <w:r>
+        <w:t xml:space="preserve"> </w:t>
+      </w:r>
+      <w:r>
+        <w:t xml:space="preserve">eines Matches und operiert untrennbar auf dessen Zustand — eine Modulgrenze hätte feingranularen Port-Verkehr ohne fachlichen Mehrwert erzwungen.</w:t>
+      </w:r>
+      <w:r>
+        <w:t xml:space="preserve"> </w:t>
+      </w:r>
+      <w:r>
+        <w:t xml:space="preserve">Scoring bleibt intern als</w:t>
+      </w:r>
+      <w:r>
+        <w:t xml:space="preserve"> </w:t>
+      </w:r>
+      <w:r>
+        <w:rPr>
+          <w:rStyle w:val="VerbatimChar"/>
+        </w:rPr>
+        <w:t xml:space="preserve">ScoringService</w:t>
+      </w:r>
+      <w:r>
+        <w:t xml:space="preserve"> </w:t>
+      </w:r>
+      <w:r>
+        <w:t xml:space="preserve">gekapselt (spätere Extraktion möglich).</w:t>
+      </w:r>
+    </w:p>
+    <w:p>
+      <w:pPr>
+        <w:pStyle w:val="BodyText"/>
+      </w:pPr>
       <w:r>
         <w:rPr>
           <w:b/>
           <w:bCs/>
         </w:rPr>
-        <w:t xml:space="preserve"> </w:t>
-      </w:r>
+        <w:t xml:space="preserve">ADR-13 · Gemeinsames lesendes Domänenmodell statt DTO-Mapping an jeder Grenze.</w:t>
+      </w:r>
+      <w:r>
+        <w:t xml:space="preserve"> </w:t>
+      </w:r>
+      <w:r>
+        <w:t xml:space="preserve">Module rufen fremdes Verhalten nur über Ports auf (RB-T06),</w:t>
+      </w:r>
+      <w:r>
+        <w:t xml:space="preserve"> </w:t>
+      </w:r>
+      <w:r>
+        <w:t xml:space="preserve">verwenden aber stabile Domänen-Wertobjekte direkt als Read-Model (z. B. liest</w:t>
+      </w:r>
+      <w:r>
+        <w:t xml:space="preserve"> </w:t>
+      </w:r>
+      <w:r>
+        <w:rPr>
+          <w:rStyle w:val="VerbatimChar"/>
+        </w:rPr>
+        <w:t xml:space="preserve">statistics-module</w:t>
+      </w:r>
+      <w:r>
+        <w:t xml:space="preserve"> </w:t>
+      </w:r>
+      <w:r>
+        <w:rPr>
+          <w:rStyle w:val="VerbatimChar"/>
+        </w:rPr>
+        <w:t xml:space="preserve">Point</w:t>
+      </w:r>
+      <w:r>
+        <w:t xml:space="preserve">s,</w:t>
+      </w:r>
+      <w:r>
+        <w:t xml:space="preserve"> </w:t>
+      </w:r>
+      <w:r>
+        <w:rPr>
+          <w:rStyle w:val="VerbatimChar"/>
+        </w:rPr>
+        <w:t xml:space="preserve">ai-module</w:t>
+      </w:r>
+      <w:r>
+        <w:t xml:space="preserve"> </w:t>
+      </w:r>
+      <w:r>
+        <w:rPr>
+          <w:rStyle w:val="VerbatimChar"/>
+        </w:rPr>
+        <w:t xml:space="preserve">Match</w:t>
+      </w:r>
+      <w:r>
+        <w:t xml:space="preserve">/</w:t>
+      </w:r>
+      <w:r>
+        <w:rPr>
+          <w:rStyle w:val="VerbatimChar"/>
+        </w:rPr>
+        <w:t xml:space="preserve">Player</w:t>
+      </w:r>
+      <w:r>
+        <w:t xml:space="preserve">/</w:t>
+      </w:r>
+      <w:r>
+        <w:rPr>
+          <w:rStyle w:val="VerbatimChar"/>
+        </w:rPr>
+        <w:t xml:space="preserve">MatchStatistics</w:t>
+      </w:r>
+      <w:r>
+        <w:t xml:space="preserve">).</w:t>
+      </w:r>
+      <w:r>
+        <w:t xml:space="preserve"> </w:t>
+      </w:r>
+      <w:r>
+        <w:t xml:space="preserve">Diese Typen sind framework-frei und stabil. Spiegel-DTOs an jeder Grenze wären für einen Monolithen Over-Engineering und Duplikation.</w:t>
+      </w:r>
+      <w:r>
+        <w:t xml:space="preserve"> </w:t>
+      </w:r>
+      <w:r>
+        <w:t xml:space="preserve">Abhängigkeiten bleiben einwärts gerichtet und zyklenfrei (</w:t>
+      </w:r>
+      <w:r>
+        <w:rPr>
+          <w:rStyle w:val="VerbatimChar"/>
+        </w:rPr>
+        <w:t xml:space="preserve">ArchitectureTest</w:t>
+      </w:r>
+      <w:r>
+        <w:t xml:space="preserve">). Bei späterer Service-Extraktion werden sie zu Vertragstypen/DTOs.</w:t>
+      </w:r>
+    </w:p>
+    <w:p>
+      <w:pPr>
+        <w:pStyle w:val="BodyText"/>
+      </w:pPr>
       <w:r>
         <w:rPr>
           <w:b/>
           <w:bCs/>
         </w:rPr>
-        <w:t xml:space="preserve">statt eigenem</w:t>
-      </w:r>
+        <w:t xml:space="preserve">ADR-14 · Versionierung nach SemVer 2.0.0, Changelog nach „Keep a Changelog” 1.1.0.</w:t>
+      </w:r>
+      <w:r>
+        <w:t xml:space="preserve"> </w:t>
+      </w:r>
+      <w:r>
+        <w:t xml:space="preserve">Beide sind der De-facto-Standard im Java- und JS-Ökosystem.</w:t>
+      </w:r>
+      <w:r>
+        <w:t xml:space="preserve"> </w:t>
+      </w:r>
+      <w:r>
+        <w:t xml:space="preserve">Solange die Version bei</w:t>
+      </w:r>
+      <w:r>
+        <w:t xml:space="preserve"> </w:t>
+      </w:r>
+      <w:r>
+        <w:rPr>
+          <w:rStyle w:val="VerbatimChar"/>
+        </w:rPr>
+        <w:t xml:space="preserve">0.x</w:t>
+      </w:r>
+      <w:r>
+        <w:t xml:space="preserve"> </w:t>
+      </w:r>
+      <w:r>
+        <w:t xml:space="preserve">steht, gilt bereits eine MINOR-Erhöhung als potenziell breaking — das passt zum MVP, dessen Datenmodell und API noch in Bewegung sind.</w:t>
+      </w:r>
+      <w:r>
+        <w:t xml:space="preserve"> </w:t>
+      </w:r>
+      <w:r>
+        <w:t xml:space="preserve">Ab</w:t>
+      </w:r>
+      <w:r>
+        <w:t xml:space="preserve"> </w:t>
+      </w:r>
+      <w:r>
+        <w:rPr>
+          <w:rStyle w:val="VerbatimChar"/>
+        </w:rPr>
+        <w:t xml:space="preserve">1.0.0</w:t>
+      </w:r>
+      <w:r>
+        <w:t xml:space="preserve"> </w:t>
+      </w:r>
+      <w:r>
+        <w:t xml:space="preserve">greifen die strengen SemVer-Regeln (breaking changes nur bei einer MAJOR-Erhöhung). Die Änderungen werden in</w:t>
+      </w:r>
+      <w:r>
+        <w:t xml:space="preserve"> </w:t>
+      </w:r>
+      <w:r>
+        <w:rPr>
+          <w:rStyle w:val="VerbatimChar"/>
+        </w:rPr>
+        <w:t xml:space="preserve">CHANGELOG.md</w:t>
+      </w:r>
+      <w:r>
+        <w:t xml:space="preserve"> </w:t>
+      </w:r>
+      <w:r>
+        <w:t xml:space="preserve">gepflegt.</w:t>
+      </w:r>
+      <w:r>
+        <w:t xml:space="preserve"> </w:t>
+      </w:r>
+      <w:r>
+        <w:t xml:space="preserve">Ein Sammelabschnitt</w:t>
+      </w:r>
+      <w:r>
+        <w:t xml:space="preserve"> </w:t>
+      </w:r>
+      <w:r>
+        <w:rPr>
+          <w:rStyle w:val="VerbatimChar"/>
+        </w:rPr>
+        <w:t xml:space="preserve">[Unreleased]</w:t>
+      </w:r>
+      <w:r>
+        <w:t xml:space="preserve"> </w:t>
+      </w:r>
+      <w:r>
+        <w:t xml:space="preserve">nimmt laufend neue Einträge auf, geordnet nach den Kategorien Added/Changed/Deprecated/Removed/Fixed/Security.</w:t>
+      </w:r>
+      <w:r>
+        <w:t xml:space="preserve"> </w:t>
+      </w:r>
+      <w:r>
+        <w:t xml:space="preserve">Der Changelog wird vorerst bewusst von Hand statt automatisiert geführt — Werkzeuge wie release-please wären für ein Ein-Personen-MVP Over-Engineering.</w:t>
+      </w:r>
+      <w:r>
+        <w:t xml:space="preserve"> </w:t>
+      </w:r>
+      <w:r>
+        <w:t xml:space="preserve">Jede Version wird als Git-Tag</w:t>
+      </w:r>
+      <w:r>
+        <w:t xml:space="preserve"> </w:t>
+      </w:r>
+      <w:r>
+        <w:rPr>
+          <w:rStyle w:val="VerbatimChar"/>
+        </w:rPr>
+        <w:t xml:space="preserve">vX.Y.Z</w:t>
+      </w:r>
+      <w:r>
+        <w:t xml:space="preserve"> </w:t>
+      </w:r>
+      <w:r>
+        <w:t xml:space="preserve">markiert.</w:t>
+      </w:r>
+    </w:p>
+    <w:p>
+      <w:pPr>
+        <w:pStyle w:val="BodyText"/>
+      </w:pPr>
       <w:r>
         <w:rPr>
           <w:b/>
           <w:bCs/>
         </w:rPr>
-        <w:t xml:space="preserve"> </w:t>
-      </w:r>
-      <w:r>
-        <w:rPr>
-          <w:rStyle w:val="VerbatimChar"/>
+        <w:t xml:space="preserve">ADR-15 · Nginx als Laufzeit-Server der SPA (kein Node).</w:t>
+      </w:r>
+      <w:r>
+        <w:t xml:space="preserve"> </w:t>
+      </w:r>
+      <w:r>
+        <w:rPr>
+          <w:rStyle w:val="VerbatimChar"/>
+        </w:rPr>
+        <w:t xml:space="preserve">ng build</w:t>
+      </w:r>
+      <w:r>
+        <w:t xml:space="preserve"> </w:t>
+      </w:r>
+      <w:r>
+        <w:t xml:space="preserve">erzeugt rein statische Artefakte — Node.js ist nur Build-/Testwerkzeug</w:t>
+      </w:r>
+      <w:r>
+        <w:t xml:space="preserve"> </w:t>
+      </w:r>
+      <w:r>
+        <w:t xml:space="preserve">(CI, Dockerfile-Build-Stage,</w:t>
+      </w:r>
+      <w:r>
+        <w:t xml:space="preserve"> </w:t>
+      </w:r>
+      <w:r>
+        <w:rPr>
+          <w:rStyle w:val="VerbatimChar"/>
+        </w:rPr>
+        <w:t xml:space="preserve">ng serve</w:t>
+      </w:r>
+      <w:r>
+        <w:t xml:space="preserve">), nicht Laufzeit. Ein Multi-Stage-Build liefert das finale Image auf</w:t>
+      </w:r>
+      <w:r>
+        <w:t xml:space="preserve"> </w:t>
+      </w:r>
+      <w:r>
+        <w:rPr>
+          <w:rStyle w:val="VerbatimChar"/>
+        </w:rPr>
+        <w:t xml:space="preserve">nginx-unprivileged:alpine</w:t>
+      </w:r>
+      <w:r>
+        <w:t xml:space="preserve"> </w:t>
+      </w:r>
+      <w:r>
+        <w:t xml:space="preserve">(kein Node im Image → kleine Angriffsfläche,</w:t>
+      </w:r>
+      <w:r>
+        <w:t xml:space="preserve"> </w:t>
+      </w:r>
+      <w:r>
+        <w:rPr>
+          <w:rStyle w:val="VerbatimChar"/>
+        </w:rPr>
+        <w:t xml:space="preserve">mem_limit: 128m</w:t>
+      </w:r>
+      <w:r>
+        <w:t xml:space="preserve">, non-root UID 101,</w:t>
+      </w:r>
+      <w:r>
+        <w:t xml:space="preserve"> </w:t>
+      </w:r>
+      <w:r>
+        <w:rPr>
+          <w:rStyle w:val="VerbatimChar"/>
+        </w:rPr>
+        <w:t xml:space="preserve">read_only</w:t>
+      </w:r>
+      <w:r>
+        <w:t xml:space="preserve">). Nginx übernimmt zugleich TLS-Terminierung und</w:t>
+      </w:r>
+      <w:r>
+        <w:t xml:space="preserve"> </w:t>
+      </w:r>
+      <w:r>
+        <w:t xml:space="preserve">HTTP→HTTPS-Redirect (</w:t>
+      </w:r>
+      <w:r>
+        <w:rPr>
+          <w:rStyle w:val="VerbatimChar"/>
+        </w:rPr>
+        <w:t xml:space="preserve">nginx.prod.conf</w:t>
+      </w:r>
+      <w:r>
+        <w:t xml:space="preserve">), Reverse-Proxy</w:t>
+      </w:r>
+      <w:r>
+        <w:t xml:space="preserve"> </w:t>
+      </w:r>
+      <w:r>
+        <w:rPr>
+          <w:rStyle w:val="VerbatimChar"/>
+        </w:rPr>
+        <w:t xml:space="preserve">/api/</w:t>
+      </w:r>
+      <w:r>
+        <w:t xml:space="preserve"> </w:t>
+      </w:r>
+      <w:r>
+        <w:t xml:space="preserve">ans Backend (eine Origin → kein CORS, Backend ohne öffentlichen Port), Security-Header</w:t>
+      </w:r>
+      <w:r>
+        <w:t xml:space="preserve"> </w:t>
+      </w:r>
+      <w:r>
+        <w:t xml:space="preserve">(CSP/HSTS/…) und Per-IP-Rate-Limit auf den KI-Endpoint sowie SPA-Fallback (</w:t>
+      </w:r>
+      <w:r>
+        <w:rPr>
+          <w:rStyle w:val="VerbatimChar"/>
+        </w:rPr>
+        <w:t xml:space="preserve">try_files … /index.html</w:t>
+      </w:r>
+      <w:r>
+        <w:t xml:space="preserve">) für Deep-Links. Ein Node-Runtime-Server wäre</w:t>
+      </w:r>
+      <w:r>
+        <w:t xml:space="preserve"> </w:t>
+      </w:r>
+      <w:r>
+        <w:t xml:space="preserve">nur bei SSR/Angular Universal nötig — für die reine Client-SPA Over-Engineering. Ergänzt die Container-Trennung aus ADR-02.</w:t>
+      </w:r>
+    </w:p>
+    <w:p>
+      <w:pPr>
+        <w:pStyle w:val="BodyText"/>
+      </w:pPr>
+      <w:r>
+        <w:rPr>
           <w:b/>
           <w:bCs/>
         </w:rPr>
-        <w:t xml:space="preserve">scoring-module</w:t>
-      </w:r>
-      <w:r>
-        <w:rPr>
-          <w:b/>
-          <w:bCs/>
-        </w:rPr>
-        <w:t xml:space="preserve">.</w:t>
-      </w:r>
-      <w:r>
-        <w:t xml:space="preserve"> </w:t>
-      </w:r>
-      <w:r>
-        <w:t xml:space="preserve">Bei der Umsetzung konsolidiert: Punkte erfassen/zählen ist das</w:t>
-      </w:r>
-      <w:r>
-        <w:t xml:space="preserve"> </w:t>
-      </w:r>
-      <w:r>
-        <w:rPr>
-          <w:b/>
-          <w:bCs/>
-        </w:rPr>
-        <w:t xml:space="preserve">Kernverhalten</w:t>
-      </w:r>
-      <w:r>
-        <w:t xml:space="preserve"> </w:t>
-      </w:r>
-      <w:r>
-        <w:t xml:space="preserve">eines Matches und operiert untrennbar auf dessen Zustand — eine Modulgrenze hätte feingranularen Port-Verkehr ohne fachlichen Mehrwert erzwungen. Scoring bleibt intern als</w:t>
-      </w:r>
-      <w:r>
-        <w:t xml:space="preserve"> </w:t>
-      </w:r>
-      <w:r>
-        <w:rPr>
-          <w:rStyle w:val="VerbatimChar"/>
-        </w:rPr>
-        <w:t xml:space="preserve">ScoringService</w:t>
-      </w:r>
-      <w:r>
-        <w:t xml:space="preserve"> </w:t>
-      </w:r>
-      <w:r>
-        <w:t xml:space="preserve">gekapselt (spätere Extraktion möglich).</w:t>
-      </w:r>
-    </w:p>
-    <w:p>
-      <w:pPr>
-        <w:pStyle w:val="BodyText"/>
-      </w:pPr>
-      <w:r>
-        <w:rPr>
-          <w:b/>
-          <w:bCs/>
-        </w:rPr>
-        <w:t xml:space="preserve">ADR-13 · Gemeinsames lesendes Domänenmodell statt DTO-Mapping an jeder Grenze.</w:t>
-      </w:r>
-      <w:r>
-        <w:t xml:space="preserve"> </w:t>
-      </w:r>
-      <w:r>
-        <w:t xml:space="preserve">Module rufen fremdes Verhalten nur über Ports auf (RB-T06), verwenden aber stabile Domänen-Wertobjekte direkt als Read-Model (z. B. liest</w:t>
-      </w:r>
-      <w:r>
-        <w:t xml:space="preserve"> </w:t>
-      </w:r>
-      <w:r>
-        <w:rPr>
-          <w:rStyle w:val="VerbatimChar"/>
-        </w:rPr>
-        <w:t xml:space="preserve">statistics-module</w:t>
-      </w:r>
-      <w:r>
-        <w:t xml:space="preserve"> </w:t>
-      </w:r>
-      <w:r>
-        <w:rPr>
-          <w:rStyle w:val="VerbatimChar"/>
-        </w:rPr>
-        <w:t xml:space="preserve">Point</w:t>
-      </w:r>
-      <w:r>
-        <w:t xml:space="preserve">s,</w:t>
-      </w:r>
-      <w:r>
-        <w:t xml:space="preserve"> </w:t>
-      </w:r>
-      <w:r>
-        <w:rPr>
-          <w:rStyle w:val="VerbatimChar"/>
-        </w:rPr>
-        <w:t xml:space="preserve">ai-module</w:t>
-      </w:r>
-      <w:r>
-        <w:t xml:space="preserve"> </w:t>
-      </w:r>
-      <w:r>
-        <w:rPr>
-          <w:rStyle w:val="VerbatimChar"/>
-        </w:rPr>
-        <w:t xml:space="preserve">Match</w:t>
-      </w:r>
-      <w:r>
-        <w:t xml:space="preserve">/</w:t>
-      </w:r>
-      <w:r>
-        <w:rPr>
-          <w:rStyle w:val="VerbatimChar"/>
-        </w:rPr>
-        <w:t xml:space="preserve">Player</w:t>
-      </w:r>
-      <w:r>
-        <w:t xml:space="preserve">/</w:t>
-      </w:r>
-      <w:r>
-        <w:rPr>
-          <w:rStyle w:val="VerbatimChar"/>
-        </w:rPr>
-        <w:t xml:space="preserve">MatchStatistics</w:t>
-      </w:r>
-      <w:r>
-        <w:t xml:space="preserve">). Diese Typen sind framework-frei und stabil; Spiegel-DTOs an jeder Grenze wären für einen Monolithen Over-Engineering und Duplikation. Abhängigkeiten bleiben einwärts/zyklenfrei (</w:t>
-      </w:r>
-      <w:r>
-        <w:rPr>
-          <w:rStyle w:val="VerbatimChar"/>
-        </w:rPr>
-        <w:t xml:space="preserve">ArchitectureTest</w:t>
-      </w:r>
-      <w:r>
-        <w:t xml:space="preserve">). Bei späterer Service-Extraktion werden sie zu Vertragstypen/DTOs.</w:t>
-      </w:r>
-    </w:p>
-    <w:p>
-      <w:pPr>
-        <w:pStyle w:val="BodyText"/>
-      </w:pPr>
-      <w:r>
-        <w:rPr>
-          <w:b/>
-          <w:bCs/>
-        </w:rPr>
-        <w:t xml:space="preserve">ADR-14 · SemVer 2.0.0 + Keep a Changelog 1.1.0.</w:t>
-      </w:r>
-      <w:r>
-        <w:t xml:space="preserve"> </w:t>
-      </w:r>
-      <w:r>
-        <w:t xml:space="preserve">Branchenstandard im Java-/JS-Ökosystem. Pre-1.0 (</w:t>
-      </w:r>
-      <w:r>
-        <w:rPr>
-          <w:rStyle w:val="VerbatimChar"/>
-        </w:rPr>
-        <w:t xml:space="preserve">0.x</w:t>
-      </w:r>
-      <w:r>
-        <w:t xml:space="preserve">): MINOR gilt als potenziell breaking (passt zum MVP, Datenmodell/API in Bewegung); ab</w:t>
-      </w:r>
-      <w:r>
-        <w:t xml:space="preserve"> </w:t>
-      </w:r>
-      <w:r>
-        <w:rPr>
-          <w:rStyle w:val="VerbatimChar"/>
-        </w:rPr>
-        <w:t xml:space="preserve">1.0.0</w:t>
-      </w:r>
-      <w:r>
-        <w:t xml:space="preserve"> </w:t>
-      </w:r>
-      <w:r>
-        <w:t xml:space="preserve">greifen die strengen Regeln.</w:t>
-      </w:r>
-      <w:r>
-        <w:t xml:space="preserve"> </w:t>
-      </w:r>
-      <w:r>
-        <w:rPr>
-          <w:rStyle w:val="VerbatimChar"/>
-        </w:rPr>
-        <w:t xml:space="preserve">CHANGELOG.md</w:t>
-      </w:r>
-      <w:r>
-        <w:t xml:space="preserve"> </w:t>
-      </w:r>
-      <w:r>
-        <w:t xml:space="preserve">mit</w:t>
-      </w:r>
-      <w:r>
-        <w:t xml:space="preserve"> </w:t>
-      </w:r>
-      <w:r>
-        <w:rPr>
-          <w:rStyle w:val="VerbatimChar"/>
-        </w:rPr>
-        <w:t xml:space="preserve">[Unreleased]</w:t>
-      </w:r>
-      <w:r>
-        <w:t xml:space="preserve">-Sammelabschnitt und Kategorien Added/Changed/Deprecated/Removed/Fixed/Security. Bewusst (vorerst) nicht automatisiert (release-please o. ä. wäre für ein Ein-Personen-MVP Over-Engineering). Git-Tags</w:t>
-      </w:r>
-      <w:r>
-        <w:t xml:space="preserve"> </w:t>
-      </w:r>
-      <w:r>
-        <w:rPr>
-          <w:rStyle w:val="VerbatimChar"/>
-        </w:rPr>
-        <w:t xml:space="preserve">vX.Y.Z</w:t>
-      </w:r>
-      <w:r>
-        <w:t xml:space="preserve"> </w:t>
-      </w:r>
-      <w:r>
-        <w:t xml:space="preserve">je Version.</w:t>
-      </w:r>
-    </w:p>
-    <w:p>
-      <w:pPr>
-        <w:pStyle w:val="BodyText"/>
-      </w:pPr>
-      <w:r>
-        <w:rPr>
-          <w:b/>
-          <w:bCs/>
-        </w:rPr>
-        <w:t xml:space="preserve">ADR-15 · Nginx als Laufzeit-Server der SPA (kein Node).</w:t>
-      </w:r>
-      <w:r>
-        <w:t xml:space="preserve"> </w:t>
-      </w:r>
-      <w:r>
-        <w:rPr>
-          <w:rStyle w:val="VerbatimChar"/>
-        </w:rPr>
-        <w:t xml:space="preserve">ng build</w:t>
-      </w:r>
-      <w:r>
-        <w:t xml:space="preserve"> </w:t>
-      </w:r>
-      <w:r>
-        <w:t xml:space="preserve">erzeugt rein statische Artefakte — Node.js ist nur Build-/Testwerkzeug (CI, Dockerfile-Build-Stage,</w:t>
-      </w:r>
-      <w:r>
-        <w:t xml:space="preserve"> </w:t>
-      </w:r>
-      <w:r>
-        <w:rPr>
-          <w:rStyle w:val="VerbatimChar"/>
-        </w:rPr>
-        <w:t xml:space="preserve">ng serve</w:t>
-      </w:r>
-      <w:r>
-        <w:t xml:space="preserve">), nicht Laufzeit. Ein Multi-Stage-Build liefert das finale Image auf</w:t>
-      </w:r>
-      <w:r>
-        <w:t xml:space="preserve"> </w:t>
-      </w:r>
-      <w:r>
-        <w:rPr>
-          <w:rStyle w:val="VerbatimChar"/>
-        </w:rPr>
-        <w:t xml:space="preserve">nginx-unprivileged:alpine</w:t>
-      </w:r>
-      <w:r>
-        <w:t xml:space="preserve"> </w:t>
-      </w:r>
-      <w:r>
-        <w:t xml:space="preserve">(kein Node im Image → kleine Angriffsfläche,</w:t>
-      </w:r>
-      <w:r>
-        <w:t xml:space="preserve"> </w:t>
-      </w:r>
-      <w:r>
-        <w:rPr>
-          <w:rStyle w:val="VerbatimChar"/>
-        </w:rPr>
-        <w:t xml:space="preserve">mem_limit: 128m</w:t>
-      </w:r>
-      <w:r>
-        <w:t xml:space="preserve">, non-root UID 101,</w:t>
-      </w:r>
-      <w:r>
-        <w:t xml:space="preserve"> </w:t>
-      </w:r>
-      <w:r>
-        <w:rPr>
-          <w:rStyle w:val="VerbatimChar"/>
-        </w:rPr>
-        <w:t xml:space="preserve">read_only</w:t>
-      </w:r>
-      <w:r>
-        <w:t xml:space="preserve">). Nginx übernimmt zugleich TLS-Terminierung + HTTP→HTTPS-Redirect (</w:t>
-      </w:r>
-      <w:r>
-        <w:rPr>
-          <w:rStyle w:val="VerbatimChar"/>
-        </w:rPr>
-        <w:t xml:space="preserve">nginx.prod.conf</w:t>
-      </w:r>
-      <w:r>
-        <w:t xml:space="preserve">), Reverse-Proxy</w:t>
-      </w:r>
-      <w:r>
-        <w:t xml:space="preserve"> </w:t>
-      </w:r>
-      <w:r>
-        <w:rPr>
-          <w:rStyle w:val="VerbatimChar"/>
-        </w:rPr>
-        <w:t xml:space="preserve">/api/</w:t>
-      </w:r>
-      <w:r>
-        <w:t xml:space="preserve"> </w:t>
-      </w:r>
-      <w:r>
-        <w:t xml:space="preserve">ans Backend (eine Origin → kein CORS, Backend ohne öffentlichen Port), Security-Header (CSP/HSTS/…) und Per-IP-Rate-Limit auf den KI-Endpoint sowie SPA-Fallback (</w:t>
-      </w:r>
-      <w:r>
-        <w:rPr>
-          <w:rStyle w:val="VerbatimChar"/>
-        </w:rPr>
-        <w:t xml:space="preserve">try_files … /index.html</w:t>
-      </w:r>
-      <w:r>
-        <w:t xml:space="preserve">) für Deep-Links. Ein Node-Runtime-Server wäre nur bei SSR/Angular Universal nötig — für die reine Client-SPA Over-Engineering. Ergänzt die Container-Trennung aus ADR-02.</w:t>
-      </w:r>
-    </w:p>
-    <w:p>
-      <w:pPr>
-        <w:pStyle w:val="BodyText"/>
-      </w:pPr>
-      <w:r>
-        <w:rPr>
-          <w:b/>
-          <w:bCs/>
-        </w:rPr>
         <w:t xml:space="preserve">ADR-16 · MailHog als SMTP-Sink im Dev, echter Provider erst in Prod.</w:t>
       </w:r>
       <w:r>
         <w:t xml:space="preserve"> </w:t>
       </w:r>
       <w:r>
-        <w:t xml:space="preserve">Keycloak versendet Verifizierungs-/Passwort-Mails (verifyEmail, §7.1.3). Im Dev fängt der Container</w:t>
+        <w:t xml:space="preserve">Keycloak versendet Verifizierungs-/Passwort-Mails (verifyEmail, §7.1.3).</w:t>
+      </w:r>
+      <w:r>
+        <w:t xml:space="preserve"> </w:t>
+      </w:r>
+      <w:r>
+        <w:t xml:space="preserve">Im Dev fängt der Container</w:t>
       </w:r>
       <w:r>
         <w:t xml:space="preserve"> </w:t>
@@ -10009,7 +10450,25 @@
         <w:t xml:space="preserve"> </w:t>
       </w:r>
       <w:r>
-        <w:t xml:space="preserve">Web-UI) statt real zuzustellen: kein Provider-Account/API-Key/Domain-Setup nötig, keine Zustellkosten, keine versehentlichen Mails an echte Adressen, jede Test-Mail sofort in der Web-UI einsehbar. Ein transaktionaler Dienst (Mailgun/SendGrid) wäre im Dev Over-Engineering. Prod ersetzt MailHog durch echtes SMTP — gleiche Keycloak-Konfiguration, nur</w:t>
+        <w:t xml:space="preserve">Web-UI) statt real zuzustellen, so ist kein Provider-Account/API-Key/Domain-Setup</w:t>
+      </w:r>
+      <w:r>
+        <w:t xml:space="preserve"> </w:t>
+      </w:r>
+      <w:r>
+        <w:t xml:space="preserve">für die Entwicklung nötig, keine Zustellkosten, keine versehentlichen Mails an echte Adressen, jede Test-Mail ist sofort in der Web-UI einsehbar.</w:t>
+      </w:r>
+      <w:r>
+        <w:t xml:space="preserve"> </w:t>
+      </w:r>
+      <w:r>
+        <w:t xml:space="preserve">Ein transaktionaler Dienst (Mailgun/SendGrid) wäre im Dev Over-Engineering. In Produktion wird MailHog durch einen echten SMTP-Server ersetzt.</w:t>
+      </w:r>
+      <w:r>
+        <w:t xml:space="preserve"> </w:t>
+      </w:r>
+      <w:r>
+        <w:t xml:space="preserve">Die Keycloak-Konfiguration bleibt dabei unverändert, nur die</w:t>
       </w:r>
       <w:r>
         <w:t xml:space="preserve"> </w:t>
@@ -10021,10 +10480,10 @@
         <w:t xml:space="preserve">${KC_SMTP_*}</w:t>
       </w:r>
       <w:r>
-        <w:t xml:space="preserve"> </w:t>
-      </w:r>
-      <w:r>
-        <w:t xml:space="preserve">umgesetzt (</w:t>
+        <w:t xml:space="preserve">-Umgebungsvariablen werden mit echten Werten belegt. Das Compose-Overlay</w:t>
+      </w:r>
+      <w:r>
+        <w:t xml:space="preserve"> </w:t>
       </w:r>
       <w:r>
         <w:rPr>
@@ -10033,10 +10492,10 @@
         <w:t xml:space="preserve">compose.prod.yml</w:t>
       </w:r>
       <w:r>
-        <w:t xml:space="preserve">:</w:t>
-      </w:r>
-      <w:r>
-        <w:t xml:space="preserve"> </w:t>
+        <w:t xml:space="preserve"> </w:t>
+      </w:r>
+      <w:r>
+        <w:t xml:space="preserve">entfernt zusätzlich den MailHog-Dienst (</w:t>
       </w:r>
       <w:r>
         <w:rPr>
@@ -10045,7 +10504,7 @@
         <w:t xml:space="preserve">mailhog: !reset null</w:t>
       </w:r>
       <w:r>
-        <w:t xml:space="preserve">). Umsetzung von RB-T07.</w:t>
+        <w:t xml:space="preserve">). Damit ist die Randbedingung RB-T07 umgesetzt.</w:t>
       </w:r>
     </w:p>
     <w:p>
@@ -10055,8 +10514,8 @@
         </w:pict>
       </w:r>
     </w:p>
-    <w:bookmarkEnd w:id="78"/>
-    <w:bookmarkStart w:id="82" w:name="qualitätsanforderungen"/>
+    <w:bookmarkEnd w:id="80"/>
+    <w:bookmarkStart w:id="84" w:name="qualitätsanforderungen"/>
     <w:p>
       <w:pPr>
         <w:pStyle w:val="Heading2"/>
@@ -10065,7 +10524,7 @@
         <w:t xml:space="preserve">10. Qualitätsanforderungen</w:t>
       </w:r>
     </w:p>
-    <w:bookmarkStart w:id="79" w:name="funktionale-anforderungen-smart"/>
+    <w:bookmarkStart w:id="81" w:name="funktionale-anforderungen-smart"/>
     <w:p>
       <w:pPr>
         <w:pStyle w:val="Heading3"/>
@@ -10076,7 +10535,7 @@
     </w:p>
     <w:p>
       <w:pPr>
-        <w:pStyle w:val="BlockText"/>
+        <w:pStyle w:val="FirstParagraph"/>
       </w:pPr>
       <w:r>
         <w:t xml:space="preserve">Antwortzeit-Ziele sind übergreifend in §1.2 (QZ-03/04/06) und §10.2 (NFA-01) festgelegt (Write ≤ 250 ms, Read ≤ 500 ms, KI ≤ 60 s) und werden unten nicht je FA wiederholt.</w:t>
@@ -10090,10 +10549,10 @@
         <w:tblLook w:firstRow="1" w:lastRow="0" w:firstColumn="0" w:lastColumn="0" w:noHBand="0" w:noVBand="0" w:val="0020"/>
       </w:tblPr>
       <w:tblGrid>
-        <w:gridCol w:w="586"/>
-        <w:gridCol w:w="1906"/>
-        <w:gridCol w:w="4106"/>
-        <w:gridCol w:w="1320"/>
+        <w:gridCol w:w="597"/>
+        <w:gridCol w:w="1942"/>
+        <w:gridCol w:w="4034"/>
+        <w:gridCol w:w="1344"/>
       </w:tblGrid>
       <w:tr>
         <w:trPr>
@@ -10228,19 +10687,7 @@
               <w:pStyle w:val="Compact"/>
             </w:pPr>
             <w:r>
-              <w:t xml:space="preserve">OAuth2 Authorization Code + PKCE über Keycloak. Access-Token (15 min), Refresh-Token (30 Tage). Mit gültigem Token alle geschützten Endpunkte → 200; ohne → 401 (ausser</w:t>
-            </w:r>
-            <w:r>
-              <w:t xml:space="preserve"> </w:t>
-            </w:r>
-            <w:r>
-              <w:rPr>
-                <w:rStyle w:val="VerbatimChar"/>
-              </w:rPr>
-              <w:t xml:space="preserve">/health</w:t>
-            </w:r>
-            <w:r>
-              <w:t xml:space="preserve">).</w:t>
+              <w:t xml:space="preserve">OAuth2 Authorization Code mit PKCE über Keycloak. Access-Token (15 min), Refresh-Token (30 Tage). Mit gültigem Token alle geschützten Endpunkte → 200; ohne → 401 (ausser dem öffentlichen Health-Check).</w:t>
             </w:r>
           </w:p>
         </w:tc>
@@ -10290,13 +10737,7 @@
               <w:pStyle w:val="Compact"/>
             </w:pPr>
             <w:r>
-              <w:rPr>
-                <w:rStyle w:val="VerbatimChar"/>
-              </w:rPr>
-              <w:t xml:space="preserve">POST /api/players</w:t>
-            </w:r>
-            <w:r>
-              <w:t xml:space="preserve">. Pflicht: Vor-/Nachname (≤ 50), Geschlecht, Spielhand, Backhand-Typ. Optional: Ranking (&gt; 0), Nationalität (ISO 3166-1 α-2), Geburtsdatum (ISO 8601). Erfolg → 201 mit UUID; Formatfehler → 400 (Feld + Grund).</w:t>
+              <w:t xml:space="preserve">Erfasst einen neuen Spieler. Pflichtfelder Vor-/Nachname (≤ 50), Geschlecht, Spielhand, Backhand-Typ. Optional: Ranking (&gt; 0), Nationalität (ISO 3166-1 α-2), Geburtsdatum (ISO 8601). Erfolg → 201 mit UUID; Formatfehler → 400 (Feld + Grund).</w:t>
             </w:r>
           </w:p>
         </w:tc>
@@ -10346,16 +10787,7 @@
               <w:pStyle w:val="Compact"/>
             </w:pPr>
             <w:r>
-              <w:rPr>
-                <w:rStyle w:val="VerbatimChar"/>
-              </w:rPr>
-              <w:t xml:space="preserve">GET /api/players?firstName=&amp;lastName=</w:t>
-            </w:r>
-            <w:r>
-              <w:t xml:space="preserve"> </w:t>
-            </w:r>
-            <w:r>
-              <w:t xml:space="preserve">(mind. ein Parameter, sonst 400). Paginierte Liste (max. 50/Seite, Nachname aufsteigend); keine Treffer → leere Liste (200).</w:t>
+              <w:t xml:space="preserve">Sucht einen Spieler. Mindestens ein Suchparameter ist erforderlich (sonst 400). Paginierte Liste (max. 50/Seite, Nachname aufsteigend); keine Treffer → leere Liste (200).</w:t>
             </w:r>
           </w:p>
         </w:tc>
@@ -10405,13 +10837,7 @@
               <w:pStyle w:val="Compact"/>
             </w:pPr>
             <w:r>
-              <w:rPr>
-                <w:rStyle w:val="VerbatimChar"/>
-              </w:rPr>
-              <w:t xml:space="preserve">POST /api/matches</w:t>
-            </w:r>
-            <w:r>
-              <w:t xml:space="preserve">. Pflicht:</w:t>
+              <w:t xml:space="preserve">Erstellt einen neuen Match. Pflichtfelder</w:t>
             </w:r>
             <w:r>
               <w:t xml:space="preserve"> </w:t>
@@ -10536,19 +10962,7 @@
               <w:pStyle w:val="Compact"/>
             </w:pPr>
             <w:r>
-              <w:rPr>
-                <w:rStyle w:val="VerbatimChar"/>
-              </w:rPr>
-              <w:t xml:space="preserve">POST /api/matches/{id}/points</w:t>
-            </w:r>
-            <w:r>
-              <w:t xml:space="preserve"> </w:t>
-            </w:r>
-            <w:r>
-              <w:t xml:space="preserve">(Match</w:t>
-            </w:r>
-            <w:r>
-              <w:t xml:space="preserve"> </w:t>
+              <w:t xml:space="preserve">Erfasst einen Punkt in einem laufenden Match (</w:t>
             </w:r>
             <w:r>
               <w:rPr>
@@ -10557,7 +10971,22 @@
               <w:t xml:space="preserve">IN_PROGRESS</w:t>
             </w:r>
             <w:r>
-              <w:t xml:space="preserve">). Pflicht:</w:t>
+              <w:t xml:space="preserve">). Pflicht ist nur</w:t>
+            </w:r>
+            <w:r>
+              <w:t xml:space="preserve"> </w:t>
+            </w:r>
+            <w:r>
+              <w:rPr>
+                <w:rStyle w:val="VerbatimChar"/>
+              </w:rPr>
+              <w:t xml:space="preserve">winner</w:t>
+            </w:r>
+            <w:r>
+              <w:t xml:space="preserve"> </w:t>
+            </w:r>
+            <w:r>
+              <w:t xml:space="preserve">(1/2). Optional: die typisierten Attribute</w:t>
             </w:r>
             <w:r>
               <w:t xml:space="preserve"> </w:t>
@@ -10596,7 +11025,7 @@
               <w:t xml:space="preserve"> </w:t>
             </w:r>
             <w:r>
-              <w:t xml:space="preserve">(typisierte Enums). Optional:</w:t>
+              <w:t xml:space="preserve">(ohne Attribut = „Quick-Point“),</w:t>
             </w:r>
             <w:r>
               <w:t xml:space="preserve"> </w:t>
@@ -10611,7 +11040,37 @@
               <w:t xml:space="preserve"> </w:t>
             </w:r>
             <w:r>
-              <w:t xml:space="preserve">(≤ 500). Erfolg → 201 mit aktualisiertem Spielstand; ungültige Enums/fehlende Pflichtfelder → 400.</w:t>
+              <w:t xml:space="preserve">(≤ 500) und</w:t>
+            </w:r>
+            <w:r>
+              <w:t xml:space="preserve"> </w:t>
+            </w:r>
+            <w:r>
+              <w:rPr>
+                <w:rStyle w:val="VerbatimChar"/>
+              </w:rPr>
+              <w:t xml:space="preserve">serveAttempt</w:t>
+            </w:r>
+            <w:r>
+              <w:t xml:space="preserve"> </w:t>
+            </w:r>
+            <w:r>
+              <w:t xml:space="preserve">(1/2). Erfolg → 201 mit aktualisiertem Spielstand; fehlendes</w:t>
+            </w:r>
+            <w:r>
+              <w:t xml:space="preserve"> </w:t>
+            </w:r>
+            <w:r>
+              <w:rPr>
+                <w:rStyle w:val="VerbatimChar"/>
+              </w:rPr>
+              <w:t xml:space="preserve">winner</w:t>
+            </w:r>
+            <w:r>
+              <w:t xml:space="preserve"> </w:t>
+            </w:r>
+            <w:r>
+              <w:t xml:space="preserve">oder ungültige Enum-Werte → 400.</w:t>
             </w:r>
           </w:p>
         </w:tc>
@@ -10724,13 +11183,7 @@
               <w:pStyle w:val="Compact"/>
             </w:pPr>
             <w:r>
-              <w:rPr>
-                <w:rStyle w:val="VerbatimChar"/>
-              </w:rPr>
-              <w:t xml:space="preserve">GET /api/statistics/head-to-head?player1=&amp;player2=</w:t>
-            </w:r>
-            <w:r>
-              <w:t xml:space="preserve">. Je Spieler: Aufschlag (First/Second Serve Won%, Aces, DF), Return (Return Points Won% 1./2., Break Points Won%, Return Games Won%), Rallye (Winners%, UE%), Match-Bilanz (Siege/Niederlagen, Satzbilanz). Bilanz nur aus abgeschlossenen Matches; unbekannte ID → 404.</w:t>
+              <w:t xml:space="preserve">Head-to-Head-Statistik zweier Spieler. Je Spieler: Aufschlag (First/Second Serve Won%, Aces, DF), Return (Return Points Won% 1./2., Break Points Won%, Return Games Won%), Rallye (Winners%, UE%), Match-Bilanz (Siege/Niederlagen, Satzbilanz). Bilanz nur aus abgeschlossenen Matches; unbekannte ID → 404.</w:t>
             </w:r>
           </w:p>
         </w:tc>
@@ -10780,7 +11233,7 @@
               <w:pStyle w:val="Compact"/>
             </w:pPr>
             <w:r>
-              <w:t xml:space="preserve">Keycloak-Federation „Mit Google anmelden”; erster Login legt automatisch ein TSaS-Konto mit verifizierter Google-E-Mail an. Gleiche Rechte wie lokal registriert.</w:t>
+              <w:t xml:space="preserve">Keycloak-Federation „Mit Google anmelden“; erster Login legt automatisch ein TSaS-Konto mit verifizierter Google-E-Mail an. Gleiche Rechte wie lokal registriert.</w:t>
             </w:r>
           </w:p>
         </w:tc>
@@ -10880,19 +11333,7 @@
               <w:pStyle w:val="Compact"/>
             </w:pPr>
             <w:r>
-              <w:rPr>
-                <w:rStyle w:val="VerbatimChar"/>
-              </w:rPr>
-              <w:t xml:space="preserve">POST /api/matches/{id}/analysis</w:t>
-            </w:r>
-            <w:r>
-              <w:t xml:space="preserve"> </w:t>
-            </w:r>
-            <w:r>
-              <w:t xml:space="preserve">(Match</w:t>
-            </w:r>
-            <w:r>
-              <w:t xml:space="preserve"> </w:t>
+              <w:t xml:space="preserve">KI-Postmortem für ein abgeschlossenes Match (</w:t>
             </w:r>
             <w:r>
               <w:rPr>
@@ -10928,22 +11369,7 @@
               <w:t xml:space="preserve"> </w:t>
             </w:r>
             <w:r>
-              <w:t xml:space="preserve">persistiert).</w:t>
-            </w:r>
-            <w:r>
-              <w:t xml:space="preserve"> </w:t>
-            </w:r>
-            <w:r>
-              <w:rPr>
-                <w:rStyle w:val="VerbatimChar"/>
-              </w:rPr>
-              <w:t xml:space="preserve">GET …/analysis</w:t>
-            </w:r>
-            <w:r>
-              <w:t xml:space="preserve"> </w:t>
-            </w:r>
-            <w:r>
-              <w:t xml:space="preserve">liest aus DB ohne LLM-Aufruf. Sprache Deutsch.</w:t>
+              <w:t xml:space="preserve">persistiert). Erneutes Lesen liefert die gespeicherte Analyse ohne LLM-Aufruf. Sprache Deutsch.</w:t>
             </w:r>
             <w:r>
               <w:t xml:space="preserve"> </w:t>
@@ -10959,16 +11385,7 @@
               <w:t xml:space="preserve"> </w:t>
             </w:r>
             <w:r>
-              <w:rPr>
-                <w:rStyle w:val="VerbatimChar"/>
-              </w:rPr>
-              <w:t xml:space="preserve">PATCH …/recommendations/{index}</w:t>
-            </w:r>
-            <w:r>
-              <w:t xml:space="preserve"> </w:t>
-            </w:r>
-            <w:r>
-              <w:t xml:space="preserve">setzt je Empfehlung Status</w:t>
+              <w:t xml:space="preserve">je Empfehlung Status</w:t>
             </w:r>
             <w:r>
               <w:t xml:space="preserve"> </w:t>
@@ -10983,7 +11400,7 @@
               <w:t xml:space="preserve"> </w:t>
             </w:r>
             <w:r>
-              <w:t xml:space="preserve">(+ Begründung ≤ 500); Codes 200/400/404/409. Neu-Generieren setzt den Review zurück.</w:t>
+              <w:t xml:space="preserve">setzbar (+ Begründung ≤ 500); Codes 200/400/404/409. Neu-Generieren setzt den Review zurück.</w:t>
             </w:r>
           </w:p>
         </w:tc>
@@ -11033,16 +11450,7 @@
               <w:pStyle w:val="Compact"/>
             </w:pPr>
             <w:r>
-              <w:rPr>
-                <w:rStyle w:val="VerbatimChar"/>
-              </w:rPr>
-              <w:t xml:space="preserve">PUT /api/players/{id}</w:t>
-            </w:r>
-            <w:r>
-              <w:t xml:space="preserve"> </w:t>
-            </w:r>
-            <w:r>
-              <w:t xml:space="preserve">(Felder wie FA-03). Erfolg → 200 mit Ressource (inkl.</w:t>
+              <w:t xml:space="preserve">Aktualisiert einen Spieler (Felder wie FA-03). Erfolg → 200 mit Ressource (inkl.</w:t>
             </w:r>
             <w:r>
               <w:t xml:space="preserve"> </w:t>
@@ -11116,31 +11524,7 @@
               <w:pStyle w:val="Compact"/>
             </w:pPr>
             <w:r>
-              <w:rPr>
-                <w:rStyle w:val="VerbatimChar"/>
-              </w:rPr>
-              <w:t xml:space="preserve">DELETE /api/players/{id}</w:t>
-            </w:r>
-            <w:r>
-              <w:t xml:space="preserve"> </w:t>
-            </w:r>
-            <w:r>
-              <w:t xml:space="preserve">→ 204; an Match beteiligt → 409 (Historieschutz), stattdessen</w:t>
-            </w:r>
-            <w:r>
-              <w:t xml:space="preserve"> </w:t>
-            </w:r>
-            <w:r>
-              <w:rPr>
-                <w:rStyle w:val="VerbatimChar"/>
-              </w:rPr>
-              <w:t xml:space="preserve">PATCH /…/deactivate</w:t>
-            </w:r>
-            <w:r>
-              <w:t xml:space="preserve"> </w:t>
-            </w:r>
-            <w:r>
-              <w:t xml:space="preserve">(Soft-Delete</w:t>
+              <w:t xml:space="preserve">Löscht einen Spieler → 204; ist er an einem Match beteiligt → 409 (Historieschutz), stattdessen Deaktivieren (Soft-Delete</w:t>
             </w:r>
             <w:r>
               <w:t xml:space="preserve"> </w:t>
@@ -11152,7 +11536,10 @@
               <w:t xml:space="preserve">active=false</w:t>
             </w:r>
             <w:r>
-              <w:t xml:space="preserve">, → 204). Unbekannt → 404.</w:t>
+              <w:t xml:space="preserve"> </w:t>
+            </w:r>
+            <w:r>
+              <w:t xml:space="preserve">→ 204). Unbekannt → 404.</w:t>
             </w:r>
           </w:p>
         </w:tc>
@@ -11202,31 +11589,7 @@
               <w:pStyle w:val="Compact"/>
             </w:pPr>
             <w:r>
-              <w:rPr>
-                <w:rStyle w:val="VerbatimChar"/>
-              </w:rPr>
-              <w:t xml:space="preserve">POST /…/end</w:t>
-            </w:r>
-            <w:r>
-              <w:t xml:space="preserve"> </w:t>
-            </w:r>
-            <w:r>
-              <w:t xml:space="preserve">finalisiert offenen Stand und leitet Sieger aus Sätzen ab (200).</w:t>
-            </w:r>
-            <w:r>
-              <w:t xml:space="preserve"> </w:t>
-            </w:r>
-            <w:r>
-              <w:rPr>
-                <w:rStyle w:val="VerbatimChar"/>
-              </w:rPr>
-              <w:t xml:space="preserve">POST /…/end/walkover</w:t>
-            </w:r>
-            <w:r>
-              <w:t xml:space="preserve"> </w:t>
-            </w:r>
-            <w:r>
-              <w:t xml:space="preserve">(Body</w:t>
+              <w:t xml:space="preserve">Beenden finalisiert den offenen Stand und leitet den Sieger aus den Sätzen ab (200). Walkover (Body</w:t>
             </w:r>
             <w:r>
               <w:t xml:space="preserve"> </w:t>
@@ -11238,7 +11601,7 @@
               <w:t xml:space="preserve">winner</w:t>
             </w:r>
             <w:r>
-              <w:t xml:space="preserve">) weist Sieg unabhängig vom Stand zu. Walkover auf abgeschlossenem Match → 409, unbekannt → 404, ungültiger</w:t>
+              <w:t xml:space="preserve">) weist den Sieg unabhängig vom Stand zu. Walkover auf abgeschlossenem Match → 409, unbekannt → 404, ungültiger</w:t>
             </w:r>
             <w:r>
               <w:t xml:space="preserve"> </w:t>
@@ -11303,13 +11666,7 @@
               <w:pStyle w:val="Compact"/>
             </w:pPr>
             <w:r>
-              <w:rPr>
-                <w:rStyle w:val="VerbatimChar"/>
-              </w:rPr>
-              <w:t xml:space="preserve">PUT /…/score</w:t>
-            </w:r>
-            <w:r>
-              <w:t xml:space="preserve">. Pflicht: Punkte/Games/Sätze (≥ 0),</w:t>
+              <w:t xml:space="preserve">Manuelle Spielstand-Korrektur. Pflicht: Punkte/Games/Sätze (≥ 0),</w:t>
             </w:r>
             <w:r>
               <w:t xml:space="preserve"> </w:t>
@@ -11461,16 +11818,7 @@
               <w:pStyle w:val="Compact"/>
             </w:pPr>
             <w:r>
-              <w:rPr>
-                <w:rStyle w:val="VerbatimChar"/>
-              </w:rPr>
-              <w:t xml:space="preserve">POST /…/serve/player1|2</w:t>
-            </w:r>
-            <w:r>
-              <w:t xml:space="preserve"> </w:t>
-            </w:r>
-            <w:r>
-              <w:t xml:space="preserve">(kein Body).</w:t>
+              <w:t xml:space="preserve">Setzt den Aufschläger (Spieler 1 oder 2, kein Body).</w:t>
             </w:r>
             <w:r>
               <w:t xml:space="preserve"> </w:t>
@@ -11535,13 +11883,7 @@
               <w:pStyle w:val="Compact"/>
             </w:pPr>
             <w:r>
-              <w:rPr>
-                <w:rStyle w:val="VerbatimChar"/>
-              </w:rPr>
-              <w:t xml:space="preserve">GET /api/matches/{id}/statistics</w:t>
-            </w:r>
-            <w:r>
-              <w:t xml:space="preserve">. Antwort:</w:t>
+              <w:t xml:space="preserve">Statistik eines einzelnen Matches. Antwort:</w:t>
             </w:r>
             <w:r>
               <w:t xml:space="preserve"> </w:t>
@@ -11618,16 +11960,7 @@
               <w:pStyle w:val="Compact"/>
             </w:pPr>
             <w:r>
-              <w:rPr>
-                <w:rStyle w:val="VerbatimChar"/>
-              </w:rPr>
-              <w:t xml:space="preserve">GET /api/dataexport/export</w:t>
-            </w:r>
-            <w:r>
-              <w:t xml:space="preserve"> </w:t>
-            </w:r>
-            <w:r>
-              <w:t xml:space="preserve">liefert JSON-Snapshot der eigenen Daten (</w:t>
+              <w:t xml:space="preserve">Liefert einen JSON-Snapshot der eigenen Daten (</w:t>
             </w:r>
             <w:r>
               <w:rPr>
@@ -11758,16 +12091,7 @@
               <w:pStyle w:val="Compact"/>
             </w:pPr>
             <w:r>
-              <w:rPr>
-                <w:rStyle w:val="VerbatimChar"/>
-              </w:rPr>
-              <w:t xml:space="preserve">DELETE /api/dataexport</w:t>
-            </w:r>
-            <w:r>
-              <w:t xml:space="preserve"> </w:t>
-            </w:r>
-            <w:r>
-              <w:t xml:space="preserve">löscht alle eigenen Aggregate in einer Transaktion (FK-Reihenfolge</w:t>
+              <w:t xml:space="preserve">Löscht alle eigenen Aggregate in einer Transaktion (FK-Reihenfolge</w:t>
             </w:r>
             <w:r>
               <w:t xml:space="preserve"> </w:t>
@@ -11829,13 +12153,7 @@
               <w:pStyle w:val="Compact"/>
             </w:pPr>
             <w:r>
-              <w:rPr>
-                <w:rStyle w:val="VerbatimChar"/>
-              </w:rPr>
-              <w:t xml:space="preserve">POST /api/players/{ownId}/opponent-preparation/{opponentId}</w:t>
-            </w:r>
-            <w:r>
-              <w:t xml:space="preserve">. Lädt beide Profile, aggregiert die Head-to-Head-Statistik (FA-08), LLM via Spring AI. Antwort: 4 Textfelder (</w:t>
+              <w:t xml:space="preserve">Head-to-Head-Vorbereitung gegen einen Gegner. Lädt beide Profile, aggregiert die Head-to-Head-Statistik (FA-08), LLM via Spring AI. Antwort: 4 Textfelder (</w:t>
             </w:r>
             <w:r>
               <w:rPr>
@@ -12012,25 +12330,7 @@
               <w:t xml:space="preserve"> </w:t>
             </w:r>
             <w:r>
-              <w:t xml:space="preserve">lädt beim Boot (</w:t>
-            </w:r>
-            <w:r>
-              <w:rPr>
-                <w:rStyle w:val="VerbatimChar"/>
-              </w:rPr>
-              <w:t xml:space="preserve">GET /api/user-preferences</w:t>
-            </w:r>
-            <w:r>
-              <w:t xml:space="preserve">), schreibt zurück (</w:t>
-            </w:r>
-            <w:r>
-              <w:rPr>
-                <w:rStyle w:val="VerbatimChar"/>
-              </w:rPr>
-              <w:t xml:space="preserve">PUT</w:t>
-            </w:r>
-            <w:r>
-              <w:t xml:space="preserve">), Fallback</w:t>
+              <w:t xml:space="preserve">lädt die Präferenz beim Boot, schreibt sie zurück, Fallback</w:t>
             </w:r>
             <w:r>
               <w:t xml:space="preserve"> </w:t>
@@ -12135,37 +12435,7 @@
               <w:t xml:space="preserve"> </w:t>
             </w:r>
             <w:r>
-              <w:t xml:space="preserve">Notiz pro Spieler/Match, entkoppelt vom Spielstand.</w:t>
-            </w:r>
-            <w:r>
-              <w:t xml:space="preserve"> </w:t>
-            </w:r>
-            <w:r>
-              <w:rPr>
-                <w:rStyle w:val="VerbatimChar"/>
-              </w:rPr>
-              <w:t xml:space="preserve">GET /api/matches/{id}/notes</w:t>
-            </w:r>
-            <w:r>
-              <w:t xml:space="preserve"> </w:t>
-            </w:r>
-            <w:r>
-              <w:t xml:space="preserve">(0–2 Notizen, owner-geprüft),</w:t>
-            </w:r>
-            <w:r>
-              <w:t xml:space="preserve"> </w:t>
-            </w:r>
-            <w:r>
-              <w:rPr>
-                <w:rStyle w:val="VerbatimChar"/>
-              </w:rPr>
-              <w:t xml:space="preserve">PUT /…/notes/{playerId}</w:t>
-            </w:r>
-            <w:r>
-              <w:t xml:space="preserve"> </w:t>
-            </w:r>
-            <w:r>
-              <w:t xml:space="preserve">(Upsert; leere Notiz löscht → 204).</w:t>
+              <w:t xml:space="preserve">Notiz pro Spieler/Match, entkoppelt vom Spielstand. Lesen liefert 0–2 Notizen (owner-geprüft); Schreiben ist ein Upsert (leere Notiz löscht → 204).</w:t>
             </w:r>
             <w:r>
               <w:t xml:space="preserve"> </w:t>
@@ -12224,8 +12494,8 @@
         </w:tc>
       </w:tr>
     </w:tbl>
-    <w:bookmarkEnd w:id="79"/>
-    <w:bookmarkStart w:id="80" w:name="nicht-funktionale-anforderungen-smart"/>
+    <w:bookmarkEnd w:id="81"/>
+    <w:bookmarkStart w:id="82" w:name="nicht-funktionale-anforderungen-smart"/>
     <w:p>
       <w:pPr>
         <w:pStyle w:val="Heading3"/>
@@ -12491,8 +12761,8 @@
         </w:tc>
       </w:tr>
     </w:tbl>
-    <w:bookmarkEnd w:id="80"/>
-    <w:bookmarkStart w:id="81" w:name="abnahmekriterien-je-kernfunktion"/>
+    <w:bookmarkEnd w:id="82"/>
+    <w:bookmarkStart w:id="83" w:name="abnahmekriterien-je-kernfunktion"/>
     <w:p>
       <w:pPr>
         <w:pStyle w:val="Heading3"/>
@@ -12532,22 +12802,22 @@
         <w:t xml:space="preserve">Erfüllt</w:t>
       </w:r>
       <w:r>
-        <w:t xml:space="preserve">, wenn der zugehörige automatisierte Test grün ist (Modul-Tests +</w:t>
-      </w:r>
-      <w:r>
-        <w:t xml:space="preserve"> </w:t>
-      </w:r>
-      <w:r>
-        <w:rPr>
-          <w:rStyle w:val="VerbatimChar"/>
-        </w:rPr>
-        <w:t xml:space="preserve">*IT</w:t>
-      </w:r>
-      <w:r>
-        <w:t xml:space="preserve"> </w:t>
-      </w:r>
-      <w:r>
-        <w:t xml:space="preserve">gegen echtes PostgreSQL, §8.5–8.7).</w:t>
+        <w:t xml:space="preserve">, wenn der zugehörige automatisierte Test grün ist (Modul-Tests plus</w:t>
+      </w:r>
+      <w:r>
+        <w:t xml:space="preserve"> </w:t>
+      </w:r>
+      <w:r>
+        <w:rPr>
+          <w:rStyle w:val="VerbatimChar"/>
+        </w:rPr>
+        <w:t xml:space="preserve">IntegrationTests</w:t>
+      </w:r>
+      <w:r>
+        <w:t xml:space="preserve"> </w:t>
+      </w:r>
+      <w:r>
+        <w:t xml:space="preserve">gegen eine PostgreSQL Instanz, §8.5–8.7).</w:t>
       </w:r>
     </w:p>
     <w:tbl>
@@ -13316,7 +13586,13 @@
         <w:t xml:space="preserve">Antwortzeit</w:t>
       </w:r>
       <w:r>
-        <w:t xml:space="preserve">-Kriterien (QZ-03/04/06, NFA-01) sind als Design-Ziele spezifiziert; ihr formaler Nachweis erfolgt über den NFA-01-Lasttest (noch durchzuführen, vgl. §12).</w:t>
+        <w:t xml:space="preserve">-Kriterien (QZ-03/04/06, NFA-01) sind als Design-Ziele spezifiziert.</w:t>
+      </w:r>
+      <w:r>
+        <w:t xml:space="preserve"> </w:t>
+      </w:r>
+      <w:r>
+        <w:t xml:space="preserve">Ihr formaler Nachweis erfolgt über den NFA-01-Lasttest (noch durchzuführen, vgl. §12).</w:t>
       </w:r>
     </w:p>
     <w:p>
@@ -13326,9 +13602,9 @@
         </w:pict>
       </w:r>
     </w:p>
-    <w:bookmarkEnd w:id="81"/>
-    <w:bookmarkEnd w:id="82"/>
-    <w:bookmarkStart w:id="88" w:name="datenmodell"/>
+    <w:bookmarkEnd w:id="83"/>
+    <w:bookmarkEnd w:id="84"/>
+    <w:bookmarkStart w:id="90" w:name="datenmodell"/>
     <w:p>
       <w:pPr>
         <w:pStyle w:val="Heading2"/>
@@ -13367,18 +13643,18 @@
           <wp:inline>
             <wp:extent cx="5334000" cy="4376115"/>
             <wp:effectExtent b="0" l="0" r="0" t="0"/>
-            <wp:docPr descr="TSaS – Datenmodell" title="" id="84" name="Picture"/>
+            <wp:docPr descr="TSaS – Datenmodell" title="" id="86" name="Picture"/>
             <a:graphic>
               <a:graphicData uri="http://schemas.openxmlformats.org/drawingml/2006/picture">
                 <pic:pic>
                   <pic:nvPicPr>
-                    <pic:cNvPr descr="Datenmodell.png" id="85" name="Picture"/>
+                    <pic:cNvPr descr="Datenmodell.png" id="87" name="Picture"/>
                     <pic:cNvPicPr>
                       <a:picLocks noChangeArrowheads="1" noChangeAspect="1"/>
                     </pic:cNvPicPr>
                   </pic:nvPicPr>
                   <pic:blipFill>
-                    <a:blip r:embed="rId83"/>
+                    <a:blip r:embed="rId85"/>
                     <a:stretch>
                       <a:fillRect/>
                     </a:stretch>
@@ -13431,7 +13707,7 @@
         </w:rPr>
         <w:t xml:space="preserve"> </w:t>
       </w:r>
-      <w:hyperlink r:id="rId86">
+      <w:hyperlink r:id="rId88">
         <w:r>
           <w:rPr>
             <w:rStyle w:val="VerbatimChar"/>
@@ -13530,7 +13806,7 @@
         <w:t xml:space="preserve">sind unten beschrieben.</w:t>
       </w:r>
     </w:p>
-    <w:bookmarkStart w:id="87" w:name="entitätenübersicht"/>
+    <w:bookmarkStart w:id="89" w:name="entitätenübersicht"/>
     <w:p>
       <w:pPr>
         <w:pStyle w:val="Heading3"/>
@@ -14437,9 +14713,9 @@
         </w:pict>
       </w:r>
     </w:p>
-    <w:bookmarkEnd w:id="87"/>
-    <w:bookmarkEnd w:id="88"/>
-    <w:bookmarkStart w:id="89" w:name="risiken-und-technische-schulden"/>
+    <w:bookmarkEnd w:id="89"/>
+    <w:bookmarkEnd w:id="90"/>
+    <w:bookmarkStart w:id="91" w:name="risiken-und-technische-schulden"/>
     <w:p>
       <w:pPr>
         <w:pStyle w:val="Heading2"/>
@@ -14899,6 +15175,69 @@
           </w:p>
         </w:tc>
       </w:tr>
+      <w:tr>
+        <w:tc>
+          <w:tcPr/>
+          <w:p>
+            <w:pPr>
+              <w:pStyle w:val="Compact"/>
+            </w:pPr>
+            <w:r>
+              <w:t xml:space="preserve">R-08</w:t>
+            </w:r>
+          </w:p>
+        </w:tc>
+        <w:tc>
+          <w:tcPr/>
+          <w:p>
+            <w:pPr>
+              <w:pStyle w:val="Compact"/>
+            </w:pPr>
+            <w:r>
+              <w:t xml:space="preserve">Niedrig</w:t>
+            </w:r>
+          </w:p>
+        </w:tc>
+        <w:tc>
+          <w:tcPr/>
+          <w:p>
+            <w:pPr>
+              <w:pStyle w:val="Compact"/>
+            </w:pPr>
+            <w:r>
+              <w:rPr>
+                <w:b/>
+                <w:bCs/>
+              </w:rPr>
+              <w:t xml:space="preserve">Lasttest ausstehend</w:t>
+            </w:r>
+          </w:p>
+        </w:tc>
+        <w:tc>
+          <w:tcPr/>
+          <w:p>
+            <w:pPr>
+              <w:pStyle w:val="Compact"/>
+            </w:pPr>
+            <w:r>
+              <w:t xml:space="preserve">Antwortzeit-/Skalierbarkeitsziele (QZ-03/04/06, NFA-01) sind spezifiziert, aber noch nicht formal per Lasttest nachgewiesen. Nachweis via k6/JMeter (100 Nutzer, p95: Write ≤ 250 ms, Read ≤ 500 ms, Degradation ≤ 20 %). Offen als Ticket</w:t>
+            </w:r>
+            <w:r>
+              <w:t xml:space="preserve"> </w:t>
+            </w:r>
+            <w:r>
+              <w:rPr>
+                <w:b/>
+                <w:bCs/>
+              </w:rPr>
+              <w:t xml:space="preserve">TEN-69</w:t>
+            </w:r>
+            <w:r>
+              <w:t xml:space="preserve">.</w:t>
+            </w:r>
+          </w:p>
+        </w:tc>
+      </w:tr>
     </w:tbl>
     <w:p>
       <w:r>
@@ -14907,8 +15246,8 @@
         </w:pict>
       </w:r>
     </w:p>
-    <w:bookmarkEnd w:id="89"/>
-    <w:bookmarkStart w:id="93" w:name="ki-werkzeuge-im-projekt"/>
+    <w:bookmarkEnd w:id="91"/>
+    <w:bookmarkStart w:id="95" w:name="ki-werkzeuge-im-projekt"/>
     <w:p>
       <w:pPr>
         <w:pStyle w:val="Heading2"/>
@@ -14917,7 +15256,7 @@
         <w:t xml:space="preserve">13. KI-Werkzeuge im Projekt</w:t>
       </w:r>
     </w:p>
-    <w:bookmarkStart w:id="90" w:name="eingesetzte-werkzeuge"/>
+    <w:bookmarkStart w:id="92" w:name="eingesetzte-werkzeuge"/>
     <w:p>
       <w:pPr>
         <w:pStyle w:val="Heading3"/>
@@ -15170,8 +15509,8 @@
         </w:tc>
       </w:tr>
     </w:tbl>
-    <w:bookmarkEnd w:id="90"/>
-    <w:bookmarkStart w:id="91" w:name="einsatz-pro-phase"/>
+    <w:bookmarkEnd w:id="92"/>
+    <w:bookmarkStart w:id="93" w:name="einsatz-pro-phase"/>
     <w:p>
       <w:pPr>
         <w:pStyle w:val="Heading3"/>
@@ -15185,7 +15524,7 @@
         <w:pStyle w:val="Compact"/>
         <w:numPr>
           <w:ilvl w:val="0"/>
-          <w:numId w:val="1009"/>
+          <w:numId w:val="1011"/>
         </w:numPr>
       </w:pPr>
       <w:r>
@@ -15199,7 +15538,19 @@
         <w:t xml:space="preserve"> </w:t>
       </w:r>
       <w:r>
-        <w:t xml:space="preserve">Jede grössere Änderung folgt Brainstorming → Spec → Plan → Implementierung mit TDD. Spec-/Plan-Dokumente unter</w:t>
+        <w:t xml:space="preserve">Jede grössere Änderung folgt der Reihenfolge</w:t>
+      </w:r>
+      <w:r>
+        <w:t xml:space="preserve"> </w:t>
+      </w:r>
+      <w:r>
+        <w:rPr>
+          <w:rStyle w:val="VerbatimChar"/>
+        </w:rPr>
+        <w:t xml:space="preserve">Brainstorming → Spec → Plan → Implementierung mit TDD</w:t>
+      </w:r>
+      <w:r>
+        <w:t xml:space="preserve">. Spec-/Plan-Dokumente unter</w:t>
       </w:r>
       <w:r>
         <w:t xml:space="preserve"> </w:t>
@@ -15229,7 +15580,7 @@
         <w:t xml:space="preserve"> </w:t>
       </w:r>
       <w:r>
-        <w:t xml:space="preserve">(je mit TEN-Ticket im Namen), z. B. AI-Postmortem (FA-11), Bean-Validation (TEN-60), Owner-Binding/RBAC (TEN-55).</w:t>
+        <w:t xml:space="preserve">(je mit dem TEN-Ticket im Namen), z. B. AI-Postmortem (FA-11), Bean-Validation (TEN-60), Owner-Binding/RBAC (TEN-55).</w:t>
       </w:r>
     </w:p>
     <w:p>
@@ -15237,7 +15588,7 @@
         <w:pStyle w:val="Compact"/>
         <w:numPr>
           <w:ilvl w:val="0"/>
-          <w:numId w:val="1009"/>
+          <w:numId w:val="1011"/>
         </w:numPr>
       </w:pPr>
       <w:r>
@@ -15334,7 +15685,7 @@
         <w:pStyle w:val="Compact"/>
         <w:numPr>
           <w:ilvl w:val="0"/>
-          <w:numId w:val="1009"/>
+          <w:numId w:val="1011"/>
         </w:numPr>
       </w:pPr>
       <w:r>
@@ -15371,7 +15722,7 @@
         <w:pStyle w:val="Compact"/>
         <w:numPr>
           <w:ilvl w:val="0"/>
-          <w:numId w:val="1009"/>
+          <w:numId w:val="1011"/>
         </w:numPr>
       </w:pPr>
       <w:r>
@@ -15388,8 +15739,8 @@
         <w:t xml:space="preserve">Punktuelle Aufgaben (Spring AI 2.x Boot-4, JaCoCo-Aggregation, JWT-Mock, Testcontainers + Podman) via Web-Recherche-Subagenten und Context7; Ergebnisse flossen in ADR-10 (R-07) und ADR-11 (Coverage-Schwellen).</w:t>
       </w:r>
     </w:p>
-    <w:bookmarkEnd w:id="91"/>
-    <w:bookmarkStart w:id="92" w:name="eigenständigkeit"/>
+    <w:bookmarkEnd w:id="93"/>
+    <w:bookmarkStart w:id="94" w:name="eigenständigkeit"/>
     <w:p>
       <w:pPr>
         <w:pStyle w:val="Heading3"/>
@@ -15412,7 +15763,13 @@
         <w:t xml:space="preserve">doc/sad/TSaS_Eigenstaendigkeitserklaerung.md</w:t>
       </w:r>
       <w:r>
-        <w:t xml:space="preserve">) bestätigt, dass alle KI-Vorschläge vor Übernahme geprüft, angenommen oder zurückgewiesen wurden. Die drei wichtigsten bewusst</w:t>
+        <w:t xml:space="preserve">) bestätigt, dass alle KI-Vorschläge vor Übernahme geprüft,</w:t>
+      </w:r>
+      <w:r>
+        <w:t xml:space="preserve"> </w:t>
+      </w:r>
+      <w:r>
+        <w:t xml:space="preserve">angenommen oder zurückgewiesen wurden. Die drei wichtigsten bewusst</w:t>
       </w:r>
       <w:r>
         <w:t xml:space="preserve"> </w:t>
@@ -15438,9 +15795,9 @@
         </w:pict>
       </w:r>
     </w:p>
-    <w:bookmarkEnd w:id="92"/>
-    <w:bookmarkEnd w:id="93"/>
-    <w:bookmarkStart w:id="99" w:name="reflexion-und-fazit"/>
+    <w:bookmarkEnd w:id="94"/>
+    <w:bookmarkEnd w:id="95"/>
+    <w:bookmarkStart w:id="106" w:name="reflexion-und-fazit"/>
     <w:p>
       <w:pPr>
         <w:pStyle w:val="Heading2"/>
@@ -15452,6 +15809,20 @@
     <w:p>
       <w:pPr>
         <w:pStyle w:val="FirstParagraph"/>
+      </w:pPr>
+      <w:r>
+        <w:t xml:space="preserve">Die Anwendung entstand auf Basis eines rund zu 70 % vorab erstellten SAD und wurde danach schrittweise mit dem Claude CLI entwickelt — anfangs rein über Prompts,</w:t>
+      </w:r>
+      <w:r>
+        <w:t xml:space="preserve"> </w:t>
+      </w:r>
+      <w:r>
+        <w:t xml:space="preserve">später über Linear-Tickets. Aus dieser Arbeitsweise ergeben sich die folgenden Reflexionen.</w:t>
+      </w:r>
+    </w:p>
+    <w:p>
+      <w:pPr>
+        <w:pStyle w:val="BodyText"/>
       </w:pPr>
       <w:r>
         <w:t xml:space="preserve">Drei Bereiche wurden bewusst</w:t>
@@ -15483,7 +15854,13 @@
         <w:t xml:space="preserve"> </w:t>
       </w:r>
       <w:r>
-        <w:t xml:space="preserve">war wie beim übrigen Code KI-unterstützt. Delegiert wurde nicht die</w:t>
+        <w:t xml:space="preserve">war wie</w:t>
+      </w:r>
+      <w:r>
+        <w:t xml:space="preserve"> </w:t>
+      </w:r>
+      <w:r>
+        <w:t xml:space="preserve">beim übrigen Code KI-unterstützt. Delegiert wurde nicht die</w:t>
       </w:r>
       <w:r>
         <w:t xml:space="preserve"> </w:t>
@@ -15499,7 +15876,7 @@
         <w:t xml:space="preserve">: hier blieb die inhaltliche Verantwortung durchgängig menschlich, KI-Vorschläge wurden geprüft und wo nötig verworfen (konsistent mit §13.3).</w:t>
       </w:r>
     </w:p>
-    <w:bookmarkStart w:id="94" w:name="veto-1-security-konfiguration"/>
+    <w:bookmarkStart w:id="96" w:name="veto-1-security-konfiguration"/>
     <w:p>
       <w:pPr>
         <w:pStyle w:val="Heading3"/>
@@ -15639,8 +16016,8 @@
         <w:t xml:space="preserve">formal „korrekt” ist.</w:t>
       </w:r>
     </w:p>
-    <w:bookmarkEnd w:id="94"/>
-    <w:bookmarkStart w:id="95" w:name="veto-2-architekturentscheidungen-adrs"/>
+    <w:bookmarkEnd w:id="96"/>
+    <w:bookmarkStart w:id="97" w:name="veto-2-architekturentscheidungen-adrs"/>
     <w:p>
       <w:pPr>
         <w:pStyle w:val="Heading3"/>
@@ -15780,8 +16157,8 @@
         <w:t xml:space="preserve">Die Begründungen enthalten konkrete, nicht aus dem Code ableitbare Kontextfaktoren; ADR-12/13 sind explizite Korrekturen früherer Bausteinskizzen.</w:t>
       </w:r>
     </w:p>
-    <w:bookmarkEnd w:id="95"/>
-    <w:bookmarkStart w:id="96" w:name="veto-3-tennis-domänenregeln-im-scoring"/>
+    <w:bookmarkEnd w:id="97"/>
+    <w:bookmarkStart w:id="98" w:name="veto-3-tennis-domänenregeln-im-scoring"/>
     <w:p>
       <w:pPr>
         <w:pStyle w:val="Heading3"/>
@@ -15864,8 +16241,8 @@
         <w:t xml:space="preserve">-Tests, grösstenteils Edge-Case-Tests; die hohe Branch-Coverage (74,2 %) ist direktes Resultat dieser Manuell-Verifikation.</w:t>
       </w:r>
     </w:p>
-    <w:bookmarkEnd w:id="96"/>
-    <w:bookmarkStart w:id="97" w:name="human-in-the-loop"/>
+    <w:bookmarkEnd w:id="98"/>
+    <w:bookmarkStart w:id="99" w:name="human-in-the-loop"/>
     <w:p>
       <w:pPr>
         <w:pStyle w:val="Heading3"/>
@@ -15900,8 +16277,8 @@
         <w:t xml:space="preserve">) und im UI verankert.</w:t>
       </w:r>
     </w:p>
-    <w:bookmarkEnd w:id="97"/>
-    <w:bookmarkStart w:id="98" w:name="übertrag-auf-die-künftige-arbeitsweise"/>
+    <w:bookmarkEnd w:id="99"/>
+    <w:bookmarkStart w:id="100" w:name="übertrag-auf-die-künftige-arbeitsweise"/>
     <w:p>
       <w:pPr>
         <w:pStyle w:val="Heading3"/>
@@ -15915,7 +16292,7 @@
         <w:pStyle w:val="Compact"/>
         <w:numPr>
           <w:ilvl w:val="0"/>
-          <w:numId w:val="1010"/>
+          <w:numId w:val="1012"/>
         </w:numPr>
       </w:pPr>
       <w:r>
@@ -15937,7 +16314,7 @@
         <w:pStyle w:val="Compact"/>
         <w:numPr>
           <w:ilvl w:val="0"/>
-          <w:numId w:val="1010"/>
+          <w:numId w:val="1012"/>
         </w:numPr>
       </w:pPr>
       <w:r>
@@ -15959,7 +16336,7 @@
         <w:pStyle w:val="Compact"/>
         <w:numPr>
           <w:ilvl w:val="0"/>
-          <w:numId w:val="1010"/>
+          <w:numId w:val="1012"/>
         </w:numPr>
       </w:pPr>
       <w:r>
@@ -15981,7 +16358,7 @@
         <w:pStyle w:val="Compact"/>
         <w:numPr>
           <w:ilvl w:val="0"/>
-          <w:numId w:val="1010"/>
+          <w:numId w:val="1012"/>
         </w:numPr>
       </w:pPr>
       <w:r>
@@ -15996,6 +16373,546 @@
       </w:r>
       <w:r>
         <w:t xml:space="preserve">— dedizierte Test-Suites; das 70-%-Branch-Gate hält die Disziplin durch.</w:t>
+      </w:r>
+    </w:p>
+    <w:bookmarkEnd w:id="100"/>
+    <w:bookmarkStart w:id="101" w:name="beobachtungen-aus-der-praxis"/>
+    <w:p>
+      <w:pPr>
+        <w:pStyle w:val="Heading3"/>
+      </w:pPr>
+      <w:r>
+        <w:t xml:space="preserve">14.6 Beobachtungen aus der Praxis</w:t>
+      </w:r>
+    </w:p>
+    <w:p>
+      <w:pPr>
+        <w:pStyle w:val="FirstParagraph"/>
+      </w:pPr>
+      <w:r>
+        <w:t xml:space="preserve">Über das Projekt hinweg haben sich mehrere Muster wiederholt:</w:t>
+      </w:r>
+    </w:p>
+    <w:p>
+      <w:pPr>
+        <w:pStyle w:val="Compact"/>
+        <w:numPr>
+          <w:ilvl w:val="0"/>
+          <w:numId w:val="1013"/>
+        </w:numPr>
+      </w:pPr>
+      <w:r>
+        <w:rPr>
+          <w:b/>
+          <w:bCs/>
+        </w:rPr>
+        <w:t xml:space="preserve">Präzision zahlt sich aus.</w:t>
+      </w:r>
+      <w:r>
+        <w:t xml:space="preserve"> </w:t>
+      </w:r>
+      <w:r>
+        <w:t xml:space="preserve">Je genauer der Prompt, desto besser das Ergebnis. Teils muss man hartnäckig bleiben, bis die KI umsetzt, was man will — und was man glaubte, ihr klar gesagt zu haben.</w:t>
+      </w:r>
+    </w:p>
+    <w:p>
+      <w:pPr>
+        <w:pStyle w:val="Compact"/>
+        <w:numPr>
+          <w:ilvl w:val="0"/>
+          <w:numId w:val="1013"/>
+        </w:numPr>
+      </w:pPr>
+      <w:r>
+        <w:rPr>
+          <w:b/>
+          <w:bCs/>
+        </w:rPr>
+        <w:t xml:space="preserve">KI als Sparring-Partner.</w:t>
+      </w:r>
+      <w:r>
+        <w:t xml:space="preserve"> </w:t>
+      </w:r>
+      <w:r>
+        <w:t xml:space="preserve">Für mich als Backend-Entwickler mit geringem Angular-Wissen war die KI ein wertvoller Gesprächspartner, um Frontend-Vorstellungen zu klären und Stil-Alternativen abzuwägen.</w:t>
+      </w:r>
+    </w:p>
+    <w:p>
+      <w:pPr>
+        <w:pStyle w:val="Compact"/>
+        <w:numPr>
+          <w:ilvl w:val="0"/>
+          <w:numId w:val="1013"/>
+        </w:numPr>
+      </w:pPr>
+      <w:r>
+        <w:rPr>
+          <w:b/>
+          <w:bCs/>
+        </w:rPr>
+        <w:t xml:space="preserve">Solide Vorarbeit ist entscheidend.</w:t>
+      </w:r>
+      <w:r>
+        <w:t xml:space="preserve"> </w:t>
+      </w:r>
+      <w:r>
+        <w:t xml:space="preserve">Nachträgliche Architektur-Refactorings dauern lange und kosten viele Tokens. Die tragenden Entscheidungen (Backend-, Frontend-, Systemarchitektur) müssen früh in einem Dokument festgehalten sein. Das</w:t>
+      </w:r>
+      <w:r>
+        <w:t xml:space="preserve"> </w:t>
+      </w:r>
+      <w:r>
+        <w:rPr>
+          <w:rStyle w:val="VerbatimChar"/>
+        </w:rPr>
+        <w:t xml:space="preserve">CLAUDE.md</w:t>
+      </w:r>
+      <w:r>
+        <w:t xml:space="preserve"> </w:t>
+      </w:r>
+      <w:r>
+        <w:t xml:space="preserve">wird damit zum zentralen Steuerungsinstrument des Architekten — inklusive einer Definition of Done —, damit ein ganzes Team gleichwertigen Code erzeugt.</w:t>
+      </w:r>
+    </w:p>
+    <w:p>
+      <w:pPr>
+        <w:pStyle w:val="Compact"/>
+        <w:numPr>
+          <w:ilvl w:val="0"/>
+          <w:numId w:val="1013"/>
+        </w:numPr>
+      </w:pPr>
+      <w:r>
+        <w:rPr>
+          <w:b/>
+          <w:bCs/>
+        </w:rPr>
+        <w:t xml:space="preserve">Tickets brauchen mehr Sorgfalt.</w:t>
+      </w:r>
+      <w:r>
+        <w:t xml:space="preserve"> </w:t>
+      </w:r>
+      <w:r>
+        <w:t xml:space="preserve">Tasks/Tickets sollten aus einem Template entstehen und deutlich sorgfältiger formuliert sein als bei rein menschlicher Bearbeitung; die KI kann beim Erstellen helfen.</w:t>
+      </w:r>
+    </w:p>
+    <w:p>
+      <w:pPr>
+        <w:pStyle w:val="Compact"/>
+        <w:numPr>
+          <w:ilvl w:val="0"/>
+          <w:numId w:val="1013"/>
+        </w:numPr>
+      </w:pPr>
+      <w:r>
+        <w:rPr>
+          <w:b/>
+          <w:bCs/>
+        </w:rPr>
+        <w:t xml:space="preserve">Neue Architektenaufgaben.</w:t>
+      </w:r>
+      <w:r>
+        <w:t xml:space="preserve"> </w:t>
+      </w:r>
+      <w:r>
+        <w:t xml:space="preserve">Neben den klassischen FA/NFA gehört künftig das Setzen von „Pflöcken” (Rahmenbedingungen/Guardrails für die KI) dazu — sowie die laufende Überwachung, dass diese Richtlinien eingehalten werden. Dafür kann ein zweites LLM unterstützen (vgl. adversariales Review, §14.5).</w:t>
+      </w:r>
+    </w:p>
+    <w:p>
+      <w:pPr>
+        <w:pStyle w:val="Compact"/>
+        <w:numPr>
+          <w:ilvl w:val="0"/>
+          <w:numId w:val="1013"/>
+        </w:numPr>
+      </w:pPr>
+      <w:r>
+        <w:rPr>
+          <w:b/>
+          <w:bCs/>
+        </w:rPr>
+        <w:t xml:space="preserve">Review-Disziplin unter Druck.</w:t>
+      </w:r>
+      <w:r>
+        <w:t xml:space="preserve"> </w:t>
+      </w:r>
+      <w:r>
+        <w:t xml:space="preserve">Bei sehr grossen Diffs (vor allem im Frontend) stiess das manuelle Review an seine Grenzen — die Tragweite war allein im Review kaum noch erfassbar. Konsequenz: Issues müssen kleiner werden und automatisierte Tests gewinnen weiter an Bedeutung, sonst geht der Überblick verloren.</w:t>
+      </w:r>
+    </w:p>
+    <w:bookmarkEnd w:id="101"/>
+    <w:bookmarkStart w:id="102" w:name="X9bc5b362477da63c6898f314fee5bd3535fe289"/>
+    <w:p>
+      <w:pPr>
+        <w:pStyle w:val="Heading3"/>
+      </w:pPr>
+      <w:r>
+        <w:t xml:space="preserve">14.7 Konkrete Beispiele — akzeptiert und korrigiert</w:t>
+      </w:r>
+    </w:p>
+    <w:p>
+      <w:pPr>
+        <w:pStyle w:val="FirstParagraph"/>
+      </w:pPr>
+      <w:r>
+        <w:t xml:space="preserve">Ergänzend zu den Vetos (§14.1–14.3) zeigen zwei belegte Situationen den Umgang mit KI-Vorschlägen:</w:t>
+      </w:r>
+    </w:p>
+    <w:p>
+      <w:pPr>
+        <w:pStyle w:val="Compact"/>
+        <w:numPr>
+          <w:ilvl w:val="0"/>
+          <w:numId w:val="1014"/>
+        </w:numPr>
+      </w:pPr>
+      <w:r>
+        <w:rPr>
+          <w:b/>
+          <w:bCs/>
+        </w:rPr>
+        <w:t xml:space="preserve">Akzeptiert — strukturierter LLM-Output statt selbstgebautem Parser.</w:t>
+      </w:r>
+      <w:r>
+        <w:t xml:space="preserve"> </w:t>
+      </w:r>
+      <w:r>
+        <w:t xml:space="preserve">Für die KI-Match-Analyse schlug die KI vor, die LLM-Antwort nicht als Text zu parsen, sondern über Spring AI direkt in ein typisiertes Java-Objekt zu mappen (</w:t>
+      </w:r>
+      <w:r>
+        <w:rPr>
+          <w:rStyle w:val="VerbatimChar"/>
+        </w:rPr>
+        <w:t xml:space="preserve">ChatClient….entity(MatchAnalysisResult.class)</w:t>
+      </w:r>
+      <w:r>
+        <w:t xml:space="preserve">). Der Vorschlag wurde unverändert übernommen: Er macht den fragilen String-Parser überflüssig und erzwingt die Antwortstruktur (begründet in ADR-10). → Commit</w:t>
+      </w:r>
+      <w:r>
+        <w:t xml:space="preserve"> </w:t>
+      </w:r>
+      <w:r>
+        <w:rPr>
+          <w:rStyle w:val="VerbatimChar"/>
+        </w:rPr>
+        <w:t xml:space="preserve">e02ee0b</w:t>
+      </w:r>
+      <w:r>
+        <w:t xml:space="preserve"> </w:t>
+      </w:r>
+      <w:r>
+        <w:t xml:space="preserve">(</w:t>
+      </w:r>
+      <w:r>
+        <w:rPr>
+          <w:rStyle w:val="VerbatimChar"/>
+        </w:rPr>
+        <w:t xml:space="preserve">OpenAiLlmAdapter.java</w:t>
+      </w:r>
+      <w:r>
+        <w:t xml:space="preserve">).</w:t>
+      </w:r>
+    </w:p>
+    <w:p>
+      <w:pPr>
+        <w:pStyle w:val="Compact"/>
+        <w:numPr>
+          <w:ilvl w:val="0"/>
+          <w:numId w:val="1014"/>
+        </w:numPr>
+      </w:pPr>
+      <w:r>
+        <w:rPr>
+          <w:b/>
+          <w:bCs/>
+        </w:rPr>
+        <w:t xml:space="preserve">Korrigiert — NullPointer in der Statistik.</w:t>
+      </w:r>
+      <w:r>
+        <w:t xml:space="preserve"> </w:t>
+      </w:r>
+      <w:r>
+        <w:t xml:space="preserve">Der generierte</w:t>
+      </w:r>
+      <w:r>
+        <w:t xml:space="preserve"> </w:t>
+      </w:r>
+      <w:r>
+        <w:rPr>
+          <w:rStyle w:val="VerbatimChar"/>
+        </w:rPr>
+        <w:t xml:space="preserve">MatchStatisticsService</w:t>
+      </w:r>
+      <w:r>
+        <w:t xml:space="preserve"> </w:t>
+      </w:r>
+      <w:r>
+        <w:t xml:space="preserve">griff beim Iterieren über alle Punkte auf</w:t>
+      </w:r>
+      <w:r>
+        <w:t xml:space="preserve"> </w:t>
+      </w:r>
+      <w:r>
+        <w:rPr>
+          <w:rStyle w:val="VerbatimChar"/>
+        </w:rPr>
+        <w:t xml:space="preserve">pointType</w:t>
+      </w:r>
+      <w:r>
+        <w:t xml:space="preserve"> </w:t>
+      </w:r>
+      <w:r>
+        <w:t xml:space="preserve">zu. Die später eingeführten „Quick-Points” (schnelle Punkterfassung ohne Attribut, vgl. FA-06) haben aber keinen</w:t>
+      </w:r>
+      <w:r>
+        <w:t xml:space="preserve"> </w:t>
+      </w:r>
+      <w:r>
+        <w:rPr>
+          <w:rStyle w:val="VerbatimChar"/>
+        </w:rPr>
+        <w:t xml:space="preserve">pointType</w:t>
+      </w:r>
+      <w:r>
+        <w:t xml:space="preserve"> </w:t>
+      </w:r>
+      <w:r>
+        <w:t xml:space="preserve">→ NullPointerException. Korrektur: Guard-Klausel (solche Punkte zählen nur zum Stand und überspringen die Attribution) plus Regressionstest. → Commit</w:t>
+      </w:r>
+      <w:r>
+        <w:t xml:space="preserve"> </w:t>
+      </w:r>
+      <w:r>
+        <w:rPr>
+          <w:rStyle w:val="VerbatimChar"/>
+        </w:rPr>
+        <w:t xml:space="preserve">9e35106</w:t>
+      </w:r>
+      <w:r>
+        <w:t xml:space="preserve"> </w:t>
+      </w:r>
+      <w:r>
+        <w:t xml:space="preserve">(+6 Zeilen Service, +17 Zeilen Test).</w:t>
+      </w:r>
+    </w:p>
+    <w:bookmarkEnd w:id="102"/>
+    <w:bookmarkStart w:id="103" w:name="X228c99141e3591c9d8a0034df91e972dbbedc13"/>
+    <w:p>
+      <w:pPr>
+        <w:pStyle w:val="Heading3"/>
+      </w:pPr>
+      <w:r>
+        <w:t xml:space="preserve">14.8 Geeignete und kritische Projekte für den KI-Einsatz</w:t>
+      </w:r>
+    </w:p>
+    <w:p>
+      <w:pPr>
+        <w:pStyle w:val="FirstParagraph"/>
+      </w:pPr>
+      <w:r>
+        <w:t xml:space="preserve">KI ist ein mächtiges Werkzeug für Implementierung und Architekturfindung, hat aber klare Grenzen. Besonders wirksam ist sie bei Projekten mit etabliertem,</w:t>
+      </w:r>
+      <w:r>
+        <w:t xml:space="preserve"> </w:t>
+      </w:r>
+      <w:r>
+        <w:t xml:space="preserve">gut dokumentiertem Tech-Stack und klar umrissenen, in kleine Tickets zerlegten Aufgaben. Zurückhaltender wäre ich in zwei Fällen:</w:t>
+      </w:r>
+    </w:p>
+    <w:p>
+      <w:pPr>
+        <w:pStyle w:val="Compact"/>
+        <w:numPr>
+          <w:ilvl w:val="0"/>
+          <w:numId w:val="1015"/>
+        </w:numPr>
+      </w:pPr>
+      <w:r>
+        <w:rPr>
+          <w:b/>
+          <w:bCs/>
+        </w:rPr>
+        <w:t xml:space="preserve">Reguliertes Umfeld.</w:t>
+      </w:r>
+      <w:r>
+        <w:t xml:space="preserve"> </w:t>
+      </w:r>
+      <w:r>
+        <w:t xml:space="preserve">In der höchsten Kritikalitätsstufe („Fehlverhalten gefährdet Menschenleben” — Medizintechnik, Maschinensteuerungen) würde ich KI nur mit sehr strikten Guards und lückenloser menschlicher Verifikation einsetzen.</w:t>
+      </w:r>
+    </w:p>
+    <w:p>
+      <w:pPr>
+        <w:pStyle w:val="Compact"/>
+        <w:numPr>
+          <w:ilvl w:val="0"/>
+          <w:numId w:val="1015"/>
+        </w:numPr>
+      </w:pPr>
+      <w:r>
+        <w:rPr>
+          <w:b/>
+          <w:bCs/>
+        </w:rPr>
+        <w:t xml:space="preserve">Exotischer Tech-Stack oder brandneue Versionen.</w:t>
+      </w:r>
+      <w:r>
+        <w:t xml:space="preserve"> </w:t>
+      </w:r>
+      <w:r>
+        <w:t xml:space="preserve">Direkt nach dem Release von Spring Boot 4 kam die KI mit der neuen Version noch nicht zurecht und wich auf die ältere aus. Erst Wochen später gelang die Migration. Bei wenig verbreiteten Frameworks fehlt der KI schlicht die Datenbasis. Hier ist mehr manuelle Führung nötig.</w:t>
+      </w:r>
+    </w:p>
+    <w:bookmarkEnd w:id="103"/>
+    <w:bookmarkStart w:id="104" w:name="gefahren-und-offene-fragen"/>
+    <w:p>
+      <w:pPr>
+        <w:pStyle w:val="Heading3"/>
+      </w:pPr>
+      <w:r>
+        <w:t xml:space="preserve">14.9 Gefahren und offene Fragen</w:t>
+      </w:r>
+    </w:p>
+    <w:p>
+      <w:pPr>
+        <w:pStyle w:val="Compact"/>
+        <w:numPr>
+          <w:ilvl w:val="0"/>
+          <w:numId w:val="1016"/>
+        </w:numPr>
+      </w:pPr>
+      <w:r>
+        <w:rPr>
+          <w:b/>
+          <w:bCs/>
+        </w:rPr>
+        <w:t xml:space="preserve">Kompetenzaufbau.</w:t>
+      </w:r>
+      <w:r>
+        <w:t xml:space="preserve"> </w:t>
+      </w:r>
+      <w:r>
+        <w:t xml:space="preserve">Unerfahrene Entwickler setzen Tickets mit KI schneller um, aber nicht zwangsläufig besser da sie noch nicht über das Wissen verfügen was gut oder weniger gut ist. Dir Frage für die Zukunft lautet</w:t>
+      </w:r>
+      <w:r>
+        <w:t xml:space="preserve"> </w:t>
+      </w:r>
+      <w:r>
+        <w:t xml:space="preserve">“Wie bilden wir Juniors zu Seniors aus, wenn weniger Code selbst geschrieben wird?”</w:t>
+      </w:r>
+      <w:r>
+        <w:t xml:space="preserve"> </w:t>
+      </w:r>
+      <w:r>
+        <w:t xml:space="preserve">Müssen sie künftig nur noch Code lesen können oder genügt das alleinige Verständnis für einen guten Aufbau, für gute Tickets und Architektur-Trade-offs zu entscheiden?</w:t>
+      </w:r>
+    </w:p>
+    <w:p>
+      <w:pPr>
+        <w:pStyle w:val="Compact"/>
+        <w:numPr>
+          <w:ilvl w:val="0"/>
+          <w:numId w:val="1016"/>
+        </w:numPr>
+      </w:pPr>
+      <w:r>
+        <w:rPr>
+          <w:b/>
+          <w:bCs/>
+        </w:rPr>
+        <w:t xml:space="preserve">Kontrollverlust.</w:t>
+      </w:r>
+      <w:r>
+        <w:t xml:space="preserve"> </w:t>
+      </w:r>
+      <w:r>
+        <w:t xml:space="preserve">Das Gefühl „das ist mein Code” schwindet. Bleibt die KI stecken, wird die manuelle Fehlersuche aufwendiger, weil man sich erst in den generierten Code einarbeiten muss. Evt. kommt hier dann in Zukunft auch KI (anderes LLM) zum Einsatz was das Gefühl dann noch verstärkt.</w:t>
+      </w:r>
+    </w:p>
+    <w:p>
+      <w:pPr>
+        <w:pStyle w:val="Compact"/>
+        <w:numPr>
+          <w:ilvl w:val="0"/>
+          <w:numId w:val="1016"/>
+        </w:numPr>
+      </w:pPr>
+      <w:r>
+        <w:rPr>
+          <w:b/>
+          <w:bCs/>
+        </w:rPr>
+        <w:t xml:space="preserve">Ethik und Regulatorik.</w:t>
+      </w:r>
+      <w:r>
+        <w:t xml:space="preserve"> </w:t>
+      </w:r>
+      <w:r>
+        <w:t xml:space="preserve">Wie weit darf KI in stark regulierten oder sicherheitskritischen Bereichen eingesetzt werden, und wie gehen wir mit den gesellschaftlichen Folgen um (Entscheidungshoheit, Überwachung, wegfallende Tätigkeiten)? Diese Fragen bleiben bewusst über den Projektrahmen hinaus offen.</w:t>
+      </w:r>
+    </w:p>
+    <w:p>
+      <w:pPr>
+        <w:pStyle w:val="Compact"/>
+        <w:numPr>
+          <w:ilvl w:val="0"/>
+          <w:numId w:val="1016"/>
+        </w:numPr>
+      </w:pPr>
+      <w:r>
+        <w:rPr>
+          <w:b/>
+          <w:bCs/>
+        </w:rPr>
+        <w:t xml:space="preserve">Arbeitsplatzverlust, Wertschätzung.</w:t>
+      </w:r>
+      <w:r>
+        <w:t xml:space="preserve"> </w:t>
+      </w:r>
+      <w:r>
+        <w:t xml:space="preserve">Wozu brauche ich noch einen teuren SW-Ingenieur/Architekten. Ich lasse die KI schreiben die ist schneller und billiger. Die Architektur interessiert mich nicht ich will Ergebnisse. Solchen Manager-Gedanken werden wir uns stellen müssen, wie es Berichten aus den Medien bereits zeigen.</w:t>
+      </w:r>
+    </w:p>
+    <w:bookmarkEnd w:id="104"/>
+    <w:bookmarkStart w:id="105" w:name="fazit"/>
+    <w:p>
+      <w:pPr>
+        <w:pStyle w:val="Heading3"/>
+      </w:pPr>
+      <w:r>
+        <w:t xml:space="preserve">14.10 Fazit</w:t>
+      </w:r>
+    </w:p>
+    <w:p>
+      <w:pPr>
+        <w:pStyle w:val="FirstParagraph"/>
+      </w:pPr>
+      <w:r>
+        <w:t xml:space="preserve">KI wird aus der Softwareentwicklung nicht mehr wegzudenken sein und bald so selbstverständlich genutzt werden wie heute die Code-Completion in der IDE.</w:t>
+      </w:r>
+      <w:r>
+        <w:t xml:space="preserve"> </w:t>
+      </w:r>
+      <w:r>
+        <w:t xml:space="preserve">Software-Ingenieure bleiben nötig, aber ihre Arbeit verschiebt sich: weg vom reinen Codieren, hin zu Dokumentation, präziser Ticket-Formulierung und Architekturentscheidungen.</w:t>
+      </w:r>
+      <w:r>
+        <w:t xml:space="preserve"> </w:t>
+      </w:r>
+      <w:r>
+        <w:t xml:space="preserve">Für dieses Projekt hat sich die Kombination aus solider Vorarbeit (SAD,</w:t>
+      </w:r>
+      <w:r>
+        <w:t xml:space="preserve"> </w:t>
+      </w:r>
+      <w:r>
+        <w:rPr>
+          <w:rStyle w:val="VerbatimChar"/>
+        </w:rPr>
+        <w:t xml:space="preserve">CLAUDE.md</w:t>
+      </w:r>
+      <w:r>
+        <w:t xml:space="preserve">), klar delegierbaren Aufgaben und konsequent menschlicher Verifikation der kritischen Teile bewährt.</w:t>
       </w:r>
     </w:p>
     <w:p>
@@ -16005,9 +16922,9 @@
         </w:pict>
       </w:r>
     </w:p>
-    <w:bookmarkEnd w:id="98"/>
-    <w:bookmarkEnd w:id="99"/>
-    <w:bookmarkStart w:id="100" w:name="glossar"/>
+    <w:bookmarkEnd w:id="105"/>
+    <w:bookmarkEnd w:id="106"/>
+    <w:bookmarkStart w:id="107" w:name="glossar"/>
     <w:p>
       <w:pPr>
         <w:pStyle w:val="Heading2"/>
@@ -16531,8 +17448,8 @@
         </w:tc>
       </w:tr>
     </w:tbl>
-    <w:bookmarkEnd w:id="100"/>
-    <w:bookmarkEnd w:id="101"/>
+    <w:bookmarkEnd w:id="107"/>
+    <w:bookmarkEnd w:id="108"/>
     <w:sectPr>
       <w:footnotePr>
         <w:numRestart w:val="eachSect"/>
@@ -16825,6 +17742,91 @@
       <w:start w:val="1"/>
       <w:numFmt w:val="decimal"/>
       <w:lvlText w:val="%9."/>
+      <w:lvlJc w:val="left"/>
+      <w:pPr>
+        <w:ind w:left="6480" w:hanging="360"/>
+      </w:pPr>
+    </w:lvl>
+  </w:abstractNum>
+  <w:abstractNum w:abstractNumId="99731">
+    <w:nsid w:val="00A99731"/>
+    <w:multiLevelType w:val="multilevel"/>
+    <w:lvl w:ilvl="0">
+      <w:start w:val="1"/>
+      <w:numFmt w:val="lowerLetter"/>
+      <w:lvlText w:val="(%1)"/>
+      <w:lvlJc w:val="left"/>
+      <w:pPr>
+        <w:ind w:left="720" w:hanging="360"/>
+      </w:pPr>
+    </w:lvl>
+    <w:lvl w:ilvl="1">
+      <w:start w:val="1"/>
+      <w:numFmt w:val="lowerLetter"/>
+      <w:lvlText w:val="(%2)"/>
+      <w:lvlJc w:val="left"/>
+      <w:pPr>
+        <w:ind w:left="1440" w:hanging="360"/>
+      </w:pPr>
+    </w:lvl>
+    <w:lvl w:ilvl="2">
+      <w:start w:val="1"/>
+      <w:numFmt w:val="lowerLetter"/>
+      <w:lvlText w:val="(%3)"/>
+      <w:lvlJc w:val="left"/>
+      <w:pPr>
+        <w:ind w:left="2160" w:hanging="360"/>
+      </w:pPr>
+    </w:lvl>
+    <w:lvl w:ilvl="3">
+      <w:start w:val="1"/>
+      <w:numFmt w:val="lowerLetter"/>
+      <w:lvlText w:val="(%4)"/>
+      <w:lvlJc w:val="left"/>
+      <w:pPr>
+        <w:ind w:left="2880" w:hanging="360"/>
+      </w:pPr>
+    </w:lvl>
+    <w:lvl w:ilvl="4">
+      <w:start w:val="1"/>
+      <w:numFmt w:val="lowerLetter"/>
+      <w:lvlText w:val="(%5)"/>
+      <w:lvlJc w:val="left"/>
+      <w:pPr>
+        <w:ind w:left="3600" w:hanging="360"/>
+      </w:pPr>
+    </w:lvl>
+    <w:lvl w:ilvl="5">
+      <w:start w:val="1"/>
+      <w:numFmt w:val="lowerLetter"/>
+      <w:lvlText w:val="(%6)"/>
+      <w:lvlJc w:val="left"/>
+      <w:pPr>
+        <w:ind w:left="4320" w:hanging="360"/>
+      </w:pPr>
+    </w:lvl>
+    <w:lvl w:ilvl="6">
+      <w:start w:val="1"/>
+      <w:numFmt w:val="lowerLetter"/>
+      <w:lvlText w:val="(%7)"/>
+      <w:lvlJc w:val="left"/>
+      <w:pPr>
+        <w:ind w:left="5040" w:hanging="360"/>
+      </w:pPr>
+    </w:lvl>
+    <w:lvl w:ilvl="7">
+      <w:start w:val="1"/>
+      <w:numFmt w:val="lowerLetter"/>
+      <w:lvlText w:val="(%8)"/>
+      <w:lvlJc w:val="left"/>
+      <w:pPr>
+        <w:ind w:left="5760" w:hanging="360"/>
+      </w:pPr>
+    </w:lvl>
+    <w:lvl w:ilvl="8">
+      <w:start w:val="1"/>
+      <w:numFmt w:val="lowerLetter"/>
+      <w:lvlText w:val="(%9)"/>
       <w:lvlJc w:val="left"/>
       <w:pPr>
         <w:ind w:left="6480" w:hanging="360"/>
@@ -16940,9 +17942,54 @@
     <w:abstractNumId w:val="991"/>
   </w:num>
   <w:num w:numId="1009">
+    <w:abstractNumId w:val="99731"/>
+    <w:lvlOverride w:ilvl="0">
+      <w:startOverride w:val="1"/>
+    </w:lvlOverride>
+    <w:lvlOverride w:ilvl="1">
+      <w:startOverride w:val="1"/>
+    </w:lvlOverride>
+    <w:lvlOverride w:ilvl="2">
+      <w:startOverride w:val="1"/>
+    </w:lvlOverride>
+    <w:lvlOverride w:ilvl="3">
+      <w:startOverride w:val="1"/>
+    </w:lvlOverride>
+    <w:lvlOverride w:ilvl="4">
+      <w:startOverride w:val="1"/>
+    </w:lvlOverride>
+    <w:lvlOverride w:ilvl="5">
+      <w:startOverride w:val="1"/>
+    </w:lvlOverride>
+    <w:lvlOverride w:ilvl="6">
+      <w:startOverride w:val="1"/>
+    </w:lvlOverride>
+    <w:lvlOverride w:ilvl="7">
+      <w:startOverride w:val="1"/>
+    </w:lvlOverride>
+    <w:lvlOverride w:ilvl="8">
+      <w:startOverride w:val="1"/>
+    </w:lvlOverride>
+  </w:num>
+  <w:num w:numId="1010">
     <w:abstractNumId w:val="991"/>
   </w:num>
-  <w:num w:numId="1010">
+  <w:num w:numId="1011">
+    <w:abstractNumId w:val="991"/>
+  </w:num>
+  <w:num w:numId="1012">
+    <w:abstractNumId w:val="991"/>
+  </w:num>
+  <w:num w:numId="1013">
+    <w:abstractNumId w:val="991"/>
+  </w:num>
+  <w:num w:numId="1014">
+    <w:abstractNumId w:val="991"/>
+  </w:num>
+  <w:num w:numId="1015">
+    <w:abstractNumId w:val="991"/>
+  </w:num>
+  <w:num w:numId="1016">
     <w:abstractNumId w:val="991"/>
   </w:num>
 </w:numbering>

</xml_diff>